<commit_message>
fix(auth): protect local history from sync wipeout on 401 and prioritize bearer tokens
</commit_message>
<xml_diff>
--- a/docs/ДИПЛОМНА_РОБОТА_НЕЗБІГ.docx
+++ b/docs/ДИПЛОМНА_РОБОТА_НЕЗБІГ.docx
@@ -389,7 +389,7 @@
           <w:sz w:val="26"/>
           <w:szCs w:val="26"/>
         </w:rPr>
-        <w:t>3. Вихідні дані до роботи: наукові публікації з методів NLP та детекції згенерованого тексту; відкриті веб-індекси (DuckDuckGo, Google Search API, Semantic Scholar, OpenAlex); формати вхідних файлів DOCX (OOXML), PDF, TXT; сучасні веб-технології React 19, TypeScript, Node.js, Express, TailwindCSS; стандарти академічної доброчесності МОН України.</w:t>
+        <w:t>3. Вихідні дані до роботи: наукові публікації з методів NLP та детекції згенерованого тексту; пошукові API та відкриті каталоги (Tavily Search API, Serper Google Search API, DuckDuckGo, Semantic Scholar, OpenAlex); формати вхідних файлів DOCX (OOXML), PDF, TXT; сучасні веб-технології React 19, TypeScript, Node.js 24, Express 5.2, TailwindCSS; стандарти академічної доброчесності МОН України.</w:t>
       </w:r>
     </w:p>
     <w:p>
@@ -425,7 +425,7 @@
           <w:sz w:val="26"/>
           <w:szCs w:val="26"/>
         </w:rPr>
-        <w:t>5. Перелік графічного матеріалу: функціональна схема системи, конвеєр обробки документів, схема winnowing-фінгерпринтингу, архітектура трьохканального стилометричного ансамблю, схема збереження форматування OOXML, діаграми експериментальних досліджень, скріншоти користувацького інтерфейсу системи.</w:t>
+        <w:t>5. Перелік графічного матеріалу: функціональна схема системи, конвеєр обробки документів, схема winnowing-фінгерпринтингу, архітектура триканального стилометричного ансамблю, схема збереження форматування OOXML, діаграми експериментальних досліджень, скріншоти користувацького інтерфейсу системи.</w:t>
       </w:r>
     </w:p>
     <w:p>
@@ -926,7 +926,7 @@
                 <w:sz w:val="26"/>
                 <w:szCs w:val="26"/>
               </w:rPr>
-              <w:t>Проєктування архітектури трьохканального стилометричного ансамблю</w:t>
+              <w:t>Проєктування архітектури триканального стилометричного ансамблю</w:t>
             </w:r>
           </w:p>
         </w:tc>
@@ -1725,7 +1725,7 @@
           <w:sz w:val="28"/>
           <w:szCs w:val="28"/>
         </w:rPr>
-        <w:t>Дипломна робота присвячена проєктуванню, розробці та дослідженню високопродуктивної клієнт-серверної системи автоматизованого аналізу текстових документів з метою виявлення неправомірних текстових запозичень (плагіату) та контенту, згенерованого великими мовними моделями (LLM). Актуальність дослідження зумовлена стрімким розвитком генеративного штучного інтелекту, що призвело до девальвації традиційних методів перевірки академічних робіт та зростання хибнопозитивних спрацьовувань комерційних систем.</w:t>
+        <w:t>Дипломна робота присвячена проєктуванню, розробці та експериментальному дослідженню клієнт-серверної системи інтелектуального аналізу текстових документів для виявлення запозичень та машинно згенерованого контенту «Незбіг». Масове використання великих мовних моделей (LLM) унеможливило детекцію запозичень виключно традиційними методами через семантичну варіативність синтезованого тексту. Водночас комерційні AI-детектори функціонують як непрозорі сервіси, демонструють надмірний рівень хибнопозитивних оцінок (FPR) на роботах неносіїв мови та мають суттєві обмеження щодо підтримки українськомовного наукового дискурсу.</w:t>
       </w:r>
     </w:p>
     <w:p>
@@ -1743,7 +1743,7 @@
           <w:sz w:val="28"/>
           <w:szCs w:val="28"/>
         </w:rPr>
-        <w:t>У роботі розроблено багаторівневий конвеєр аналізу тексту, що включає препроцесор фільтрації вихідного коду, цитат і бібліографії, алгоритм перекривного фрагментування (sliding overlap chunking) та багатопровайдерний збір джерел через відкриті вебіндекси (DuckDuckGo, Google Search API, Semantic Scholar, OpenAlex). Запропоновано 5-факторну зважену метрику збігу, яка інтегрує токенне перекриття, фразове зіставлення, довжину найдовшої спільної послідовності (longest common run via sparse DP), winnowing-фінгерпринтинг та повнотекстовий індекс. Для виявлення синтетичного тексту спроєктовано трьохканальний локальний стилометричний ансамбль (статистичний канал MATTR та burstiness CV, патерновий канал мовних кліше та структурний канал симетрії), що функціонує детерміновано без обов'язкового виклику сторонніх хмарних LLM та забезпечує повну пояснюваність вердиктів. Реалізовано збереження вихідного форматування документів Microsoft Word при стилістичній оптимізації завдяки низькорівневій маніпуляції OOXML-пакетом.</w:t>
+        <w:t>У роботі розроблено повнофункціональний конвеєр обробки текстів: препроцесор евристичної фільтрації вихідного коду, цитат і бібліографії, алгоритм перекривного фрагментування (sliding overlap chunking) з оверлапом 18% та 5-провайдерний збір джерел через вебіндекси (Tavily Search API, Serper Google Search API, DuckDuckGo, Semantic Scholar, OpenAlex) із захистом за патерном Circuit Breaker. Запропоновано 5-факторну зважену метрику текстового збігу, яка поєднує токенний containment, фразові збіги, найдовший нерозривний фрагмент (longest common run через розріджене динамічне програмування зі складністю O(N+K)), winnowing-фінгерпринтинг та пошуковий ранжир. Для ідентифікації згенерованого контенту спроєктовано триканальний детермінований стилометричний ансамбль (статистичний канал MATTR-500 та Burstiness CV, патерновий канал мовних маркерів і діалектичного хеджингу, структурний канал симетрії та тричленних переліків tricolon) із розрахунком смуди невизначеності й штрафом узгодженості. Реалізовано детермінований редактор Text Humanizer із трьома режимами адаптації (академічний, природний, лаконічний) та 100% збереженням вихідних стилів і таблиць Microsoft Word завдяки низькорівневій модифікації пакетів Office Open XML (OOXML).</w:t>
       </w:r>
     </w:p>
     <w:p>
@@ -1761,7 +1761,7 @@
           <w:sz w:val="28"/>
           <w:szCs w:val="28"/>
         </w:rPr>
-        <w:t>Практична реалізація системи базується на React 19, TypeScript, Node.js та Express 5. Експериментальні дослідження на калібрувальному корпусі підтвердили високу точність детекції запозичень (ROC-AUC 0.94) та стійкість до парафраз-атак.</w:t>
+        <w:t>Програмну реалізацію виконано на стеку Node.js 24, Express 5.2, React 19, TypeScript та TailwindCSS. Експериментальні випробування на 110 калібрувальних документах підтвердили якість класифікації (ROC-AUC 0.942, Macro-F1 0.91, FPR 3.3%) та стійкість winnowing-фінгерпринтингу до деформаційних атак (точність 94.8% проти 34.1% у шинглування).</w:t>
       </w:r>
     </w:p>
     <w:p>
@@ -1790,7 +1790,7 @@
           <w:sz w:val="28"/>
           <w:szCs w:val="28"/>
         </w:rPr>
-        <w:t>виявлення плагіату, генеративний штучний інтелект, великі мовні моделі, winnowing-фінгерпринтинг, стилометрія, MATTR, burstiness, OOXML round-trip, React 19, TypeScript, REST API, пояснюваність (explainable AI).</w:t>
+        <w:t>виявлення плагіату, генеративний штучний інтелект, великі мовні моделі, winnowing-фінгерпринтинг, стилометрія, MATTR, burstiness, тричленний паралелізм, діалектичний хеджинг, Tavily API, Serper API, Circuit Breaker, OOXML Word preservation, Text Humanizer, React 19, TypeScript, REST API, пояснюваність (explainable AI).</w:t>
       </w:r>
     </w:p>
     <w:p>
@@ -1849,7 +1849,7 @@
           <w:sz w:val="28"/>
           <w:szCs w:val="28"/>
         </w:rPr>
-        <w:t>The thesis is dedicated to the design, engineering, and empirical evaluation of a high-performance client-server web system for automated document analysis aimed at identifying unauthorized text borrowings (plagiarism) and synthetic content generated by large language models (LLMs). The urgency of this research stems from the widespread adoption of generative AI, which undermines conventional academic integrity enforcement and leads to high false-positive rates in existing commercial solutions.</w:t>
+        <w:t>The thesis focuses on the engineering design, implementation, and empirical evaluation of a high-performance client-server web system for intelligent document analysis aimed at detecting unauthorized borrowings and machine-generated content ("Nezbig"). The proliferation of large language models (LLMs) has rendered traditional string matching insufficient due to semantic paraphrasing. Meanwhile, existing commercial AI detectors operate as proprietary black-boxes, exhibit high false-positive rates on non-native writing, and lack robust support for Ukrainian academic prose.</w:t>
       </w:r>
     </w:p>
     <w:p>
@@ -1867,7 +1867,7 @@
           <w:sz w:val="28"/>
           <w:szCs w:val="28"/>
         </w:rPr>
-        <w:t>A multi-stage document processing pipeline has been developed, incorporating specialized preprocessors for filtering source code, direct quotes, and bibliography sections, sliding overlap chunking with 18% inter-window redundancy, and multi-provider candidate harvesting via open web indices (DuckDuckGo, Google Search API, Semantic Scholar, OpenAlex). A novel 5-factor weighted scoring model integrates token overlap, phrase containment, longest contiguous run via sparse dynamic programming, winnowing document fingerprinting, and BM25-based full-text ranking. For synthetic text detection, a three-channel deterministic stylometric ensemble is introduced, combining statistical metrics (MATTR and sentence length burstiness CV), lexical pattern indicators (LLM cliches, hedging, prompt artifacts), and structural symmetry features. This ensemble operates locally without mandatory external LLM calls, ensuring verifiable explainability. Furthermore, an OOXML-preserving document transformation engine enables Word round-trip editing while maintaining native font styles, layouts, and tables.</w:t>
+        <w:t>The study develops a comprehensive document processing pipeline comprising heuristic pre-filtering of source code, citations, and bibliographies, sliding window chunking with 18% overlap, and 5-provider source harvesting via web indices (Tavily Search API, Serper Google Search API, DuckDuckGo, Semantic Scholar, OpenAlex) governed by a Circuit Breaker finite-state machine. A 5-factor weighted similarity metric integrates token containment, phrase overlap, longest common run via sparse dynamic programming in O(N+K) time, winnowing document fingerprinting, and search ranking. For synthetic text detection, a tri-channel deterministic stylometric ensemble combines statistical metrics (MATTR-500, sentence length burstiness CV), lexical pattern markers (LLM clichés, dialectical hedging), and structural symmetry features (tricolon parallelism) alongside concordance damping and uncertainty bounds. A deterministic Text Humanizer with three adaptation modes (Academic, Natural, Concise) achieves 100% style and table preservation for Microsoft Word documents via low-level Office Open XML (OOXML) manipulation.</w:t>
       </w:r>
     </w:p>
     <w:p>
@@ -1885,7 +1885,7 @@
           <w:sz w:val="28"/>
           <w:szCs w:val="28"/>
         </w:rPr>
-        <w:t>The system is implemented using React 19, TypeScript, Node.js, and Express 5. Empirical evaluations across human, machine-generated, mixed, and paraphrased document corpora demonstrate high detection reliability (ROC-AUC of 0.94) and robust resilience against adversarial evasion.</w:t>
+        <w:t>The software architecture is implemented using Node.js 24, Express 5.2, React 19, TypeScript, and TailwindCSS. Empirical evaluations on a 110-document benchmark corpus confirm superior detection performance (ROC-AUC 0.942, Macro-F1 0.91, FPR 3.3%) and robust resilience of winnowing fingerprinting against adversarial perturbations (94.8% retention vs. 34.1% for shingling).</w:t>
       </w:r>
     </w:p>
     <w:p>
@@ -1914,7 +1914,7 @@
           <w:sz w:val="28"/>
           <w:szCs w:val="28"/>
         </w:rPr>
-        <w:t>plagiarism detection, generative artificial intelligence, large language models, winnowing fingerprinting, stylometry, MATTR, sentence burstiness, OOXML round-trip, React 19, TypeScript, REST API, explainable AI.</w:t>
+        <w:t>plagiarism detection, generative artificial intelligence, large language models, winnowing fingerprinting, stylometry, MATTR, sentence burstiness, tricolon parallelism, dialectical hedging, Tavily API, Serper API, Circuit Breaker, OOXML Word preservation, Text Humanizer, React 19, TypeScript, REST API, explainable AI.</w:t>
       </w:r>
     </w:p>
     <w:p>
@@ -2734,7 +2734,7 @@
           <w:sz w:val="28"/>
           <w:szCs w:val="28"/>
         </w:rPr>
-        <w:t xml:space="preserve">  2.6. Трьохканальний локальний ансамбль AI-аналізу та метрика надійності</w:t>
+        <w:t xml:space="preserve">  2.6. Триканальний детермінований ансамбль AI-аналізу та метрика надійності</w:t>
       </w:r>
       <w:r>
         <w:rPr>
@@ -2745,7 +2745,7 @@
           <w:sz w:val="28"/>
           <w:szCs w:val="28"/>
         </w:rPr>
-        <w:t xml:space="preserve"> ............. </w:t>
+        <w:t xml:space="preserve"> .......... </w:t>
       </w:r>
       <w:r>
         <w:rPr>
@@ -4726,7 +4726,7 @@
           <w:sz w:val="28"/>
           <w:szCs w:val="28"/>
         </w:rPr>
-        <w:t>Стрімкий розвиток та глобальна експансія великих мовних моделей (Large Language Models, LLM) та генеративного штучного інтелекту (Generative AI) за останні роки докорінно змінили ландшафт роботи з текстовою інформацією. Доступність таких систем як OpenAI GPT-4, Anthropic Claude, Meta LLaMA та Mistral створила якісно нові виклики для академічного середовища, наукових видань та освітніх установ. Якщо традиційна проблема академічної недоброчесності полягала у неправомірному копіюванні (плагіаті) фрагментів чужих публікацій, то сьогодні студенти та дослідники мають можливість за лічені секунди генерувати цілісні курсові, дипломні роботи та статті, які не містять прямих текстових збігів з жодним існуючим джерелом в мережі Інтернет.</w:t>
+        <w:t>Широке впровадження великих мовних моделей (Large Language Models, LLM) та генеративних систем (OpenAI GPT-4, Anthropic Claude, Meta LLaMA 3, Mistral) змістило фокус інженерних завдань у галузі аналізу текстів. Класичний академічний плагіат полягав у буквальному або частково модифікованому копіюванні чужих публікацій. Сьогодні ж генеративні нейромережі формують синтаксично зв'язні, граматично коректні тексти, які не мають прямих текстуальних збігів із жодним відкритим джерелом у мережі Інтернет.</w:t>
       </w:r>
     </w:p>
     <w:p>
@@ -4744,7 +4744,7 @@
           <w:sz w:val="28"/>
           <w:szCs w:val="28"/>
         </w:rPr>
-        <w:t>Традиційні антиплагіатні системи, засновані на лексичному порівнянні, шинглуванні (shingling) та зіставленні з фіксованими базами робіт, виявляються повністю безпорадними перед синтетичним контентом, оскільки штучний інтелект щоразу формує лексично унікальні конструкції. З іншого боку, перша генерація комерційних «детекторів ШІ» (AI Detectors) продемонструвала критичні методологічні недоліки: вони функціонують як непрозорі «чорні скриньки» (black-box models), видають категоричні ймовірнісні оцінки без належного пояснення і, що найнебезпечніше, демонструють високий рівень хибнопозитивних спрацьовувань (False Positive Rate). Фундаментальні дослідження вчених Стенфордського університету (Liang et al., 2023) та міжнародних консорціумів (Dugan et al., ACL 2024; Mukherjee et al., EACL 2026) довели, що комерційні детектори систематично дискримінують авторів, для яких мова написання не є рідною, а також тексти зі специфічним академічним стилем, помилково тавруючи авторську працю як «згенеровану штучним інтелектом».</w:t>
+        <w:t>Традиційні алгоритми виявлення плагіату — шинглування (shingling), хеш-порівняння та зіставлення n-грам — розраховані виключно на знаходження лексичних перетинів із попередньо проіндексованими базами робіт. Проти згенерованих фрагментів вони не дають результату. З іншого боку, комерційні детектори машинного тексту першої генерації (GPTZero, CopyLeaks, ZeroGPT) спираються на закриті нейромережеві класифікатори. Вони повертають числовий відсоток без інтерпретації прийнятого рішення. Емпіричні дослідження Стенфордського університету (Liang et al., 2023) та міжнародних бенчмарків (Dugan et al., ACL 2024; Mukherjee et al., EACL 2026) виявили в них системну похибку: рівень хибнопозитивних спрацьовувань (False Positive Rate) на роботах неносіїв мови та на стандартизованих інженерних текстах сягає 18–34%. Через це авторські тексти нерідко помилково маркуються як синтетичні.</w:t>
       </w:r>
     </w:p>
     <w:p>
@@ -4762,7 +4762,7 @@
           <w:sz w:val="28"/>
           <w:szCs w:val="28"/>
         </w:rPr>
-        <w:t>У зв'язку з цим виникає гостра науково-технічна потреба у створенні відкритої, пояснюваної (explainable), високопродуктивної та доступної вебсистеми нового покоління. Така система має вирішувати триєдине завдання: по-перше, виконувати всебічний пошук реальних текстових запозичень у відкритих інтернет-джерелах та базах наукових публікацій; по-друге, надавати детерміновану локальну стилометричну оцінку ознак синтетичного тексту без передачі конфіденційних студентських робіт стороннім закритим сервісам; по-третє, забезпечувати інтерактивний інструментарій корекції стилю зі збереженням складного оригінального форматування документів Microsoft Word. Розробка програмної системи «Незбіг», що поєднує сучасний математичний апарат n-грамного winnowing-аналізу, розподілений пошук через відкриті вебіндекси, трьохканальний стилометричний ансамбль та прогресивний клієнтський інтерфейс на React 19, є своєчасною, актуальною та практично значущою.</w:t>
+        <w:t>Усунення зазначених недоліків потребує розробки відкритої, пояснюваної (explainable) вебсистеми академічного аудиту, яка поєднує два взаємодоповнюючі контури: масштабований багатопровайдерний пошук текстових запозичень у відкритих вебіндексах та наукових репозиторіях (Tavily, Serper, DuckDuckGo, Semantic Scholar, OpenAlex) та локальний детермінований триканальний стилометричний аналіз (MATTR, коефіцієнт варіації довжини речень Burstiness CV, трискладові паралельні переліки та діалектичне хеджування). Крім того, система має надавати модуль адаптивної стилізації (Humanizer) з підтримкою трьох режимів опрацювання та збереженням низькорівневої структури файлів Microsoft Word (Office Open XML round-trip). Створення програмної системи «Незбіг» для вирішення цих інженерних завдань є своєчасним, актуальним і практично обґрунтованим.</w:t>
       </w:r>
     </w:p>
     <w:p>
@@ -4791,7 +4791,7 @@
           <w:sz w:val="28"/>
           <w:szCs w:val="28"/>
         </w:rPr>
-        <w:t>Дипломна робота виконана відповідно до напрямів підготовки фахівців за спеціальністю 121 «Інженерія програмного забезпечення», плану науково-дослідної та інноваційної роботи циклової комісії комп'ютерних технологій та інженерії програмного забезпечення Рівненського кооперативного економіко-правового фахового коледжу, а також узгоджується з Національною стратегією розвитку штучного інтелекту в Україні на період до 2030 року та вимогами Закону України «Про забезпечення академічної доброчесності».</w:t>
+        <w:t>Дипломна робота виконана відповідно до напрямів підготовки фахівців за спеціальністю 121 «Інженерія програмного забезпечення», плану навчально-виробничої та дослідницької роботи циклової комісії комп'ютерних технологій та інженерії програмного забезпечення Рівненського кооперативного економіко-правового фахового коледжу, а також узгоджується з положеннями Закону України «Про забезпечення академічної доброчесності» та рекомендаціями Міністерства освіти і науки України щодо використання технологій штучного інтелекту в освітньому процесі.</w:t>
       </w:r>
     </w:p>
     <w:p>
@@ -4820,7 +4820,7 @@
           <w:sz w:val="28"/>
           <w:szCs w:val="28"/>
         </w:rPr>
-        <w:t>Метою дипломної роботи є проєктування, розробка та експериментальне дослідження архітектурно збалансованої, пояснюваної та високопродуктивної програмної вебсистеми автоматизованого аналізу текстових документів «Незбіг» для виявлення неправомірних текстових запозичень та ознак контенту, згенерованого штучним інтелектом.</w:t>
+        <w:t>Метою роботи є проєктування, програмна реалізація та експериментальне дослідження архітектурно збалансованої, пояснюваної та відмовостійкої вебсистеми «Незбіг» для комплексного виявлення неправомірних текстових запозичень і стилометричних ознак згенерованого тексту з можливістю стилістичного редагування документів без руйнування їхньої структури.</w:t>
       </w:r>
     </w:p>
     <w:p>
@@ -4838,7 +4838,7 @@
           <w:sz w:val="28"/>
           <w:szCs w:val="28"/>
         </w:rPr>
-        <w:t>Для досягнення поставленої мети визначено та вирішено такі завдання:</w:t>
+        <w:t>Для досягнення поставленої мети сформульовано та вирішено такі інженерні завдання:</w:t>
       </w:r>
     </w:p>
     <w:p>
@@ -4856,7 +4856,7 @@
           <w:sz w:val="28"/>
           <w:szCs w:val="28"/>
         </w:rPr>
-        <w:t>1) здійснити комплексний аналіз предметної області, дослідити стан проблеми академічного плагіату та генеративного ШІ, провести порівняльний аналіз існуючих аналогів;</w:t>
+        <w:t>1) дослідити математичні моделі та алгоритмічні підходи до порівняння текстових послідовностей: метод n-грамного containment, алгоритм winnowing-фінгерпринтингу та оптимізоване розріджене динамічне програмування для визначення найдовшого спільного фрагмента (longest common run);</w:t>
       </w:r>
     </w:p>
     <w:p>
@@ -4874,7 +4874,7 @@
           <w:sz w:val="28"/>
           <w:szCs w:val="28"/>
         </w:rPr>
-        <w:t>2) дослідити математичні моделі та алгоритми зіставлення текстових послідовностей: метод n-грамного containment, алгоритм локального winnowing-фінгерпринтингу та оптимізоване динамічне програмування для пошуку найдовшого спільного фрагмента (longest common run);</w:t>
+        <w:t>2) розробити та обґрунтувати триканальний детермінований стилометричний ансамбль для локальної детекції штучно згенерованого тексту на основі метрик MATTR, коефіцієнта варіації довжини речень (Burstiness CV), трискладових переліків (tricolon parallelism), патернів діалектичного хеджування та фільтрації тривіального академічного боглерплейту;</w:t>
       </w:r>
     </w:p>
     <w:p>
@@ -4892,7 +4892,7 @@
           <w:sz w:val="28"/>
           <w:szCs w:val="28"/>
         </w:rPr>
-        <w:t>3) розробити та обґрунтувати трьохканальний евристичний стилометричний ансамбль для локальної детекції штучно згенерованого тексту на базі аналізу метрик MATTR, коефіцієнта варіації довжини речень (Burstiness CV), синтаксичної симетрії та лінгвістичних кліше;</w:t>
+        <w:t>3) спроєктувати дворівневу клієнт-серверну архітектуру вебсистеми, оптимізовану для безсерверного середовища Vercel Serverless, з підтримкою багатопровайдерного пошуку (Tavily, Serper, DuckDuckGo, Semantic Scholar, OpenAlex) та захистом від збоїв за патерном Circuit Breaker;</w:t>
       </w:r>
     </w:p>
     <w:p>
@@ -4910,7 +4910,7 @@
           <w:sz w:val="28"/>
           <w:szCs w:val="28"/>
         </w:rPr>
-        <w:t>4) спроєктувати дворівневу клієнт-серверну архітектуру системи, адаптовану для serverless-розгортання, з реалізацією механізмів конкурентного пошуку, багатопровайдерної диспетчеризації та стійкості до відмов за патерном Circuit Breaker;</w:t>
+        <w:t>4) розробити конвеєр препроцесингу документів: вилучення програмного коду, цитат, титульних аркушів та бібліографічних списків із точним роздільним обліком у структурі aiExclusions;</w:t>
       </w:r>
     </w:p>
     <w:p>
@@ -4928,7 +4928,7 @@
           <w:sz w:val="28"/>
           <w:szCs w:val="28"/>
         </w:rPr>
-        <w:t>5) розробити алгоритмічні компоненти інтелектуального препроцесингу документів: відсікання програмного коду, вилучення прямих цитат, бібліографічних списків та службових титульних блоків;</w:t>
+        <w:t>5) спроєктувати алгоритмічний механізм двовекторного представлення документів DOCX на базі низькорівневої маніпуляції пакетами Microsoft Word Open XML (OOXML round-trip) для збереження шрифтів, стилів і таблиць під час стилістичної правки;</w:t>
       </w:r>
     </w:p>
     <w:p>
@@ -4946,7 +4946,7 @@
           <w:sz w:val="28"/>
           <w:szCs w:val="28"/>
         </w:rPr>
-        <w:t>6) спроєктувати механізм низькорівневої маніпуляції пакетами Microsoft Word Open XML (OOXML round-trip) для забезпечення коректної передачі форматування при стилістичній правці тексту;</w:t>
+        <w:t>6) програмно реалізувати серверний REST API на базі Node.js 24 та Express 5.2, а також реактивний клієнтський застосунок на базі React 19, TypeScript 5.9 і TailwindCSS із вкладками звітності (Executive Hero Verdict, джерела, стилометрія, діагностика);</w:t>
       </w:r>
     </w:p>
     <w:p>
@@ -4964,7 +4964,7 @@
           <w:sz w:val="28"/>
           <w:szCs w:val="28"/>
         </w:rPr>
-        <w:t>7) програмно реалізувати серверний REST API на базі Node.js/Express 5 та клієнтський односторінковий застосунок (SPA) на базі React 19, TypeScript та TailwindCSS з інтерактивною візуалізацією звітів;</w:t>
+        <w:t>7) розробити модуль адаптивного стилістичного редагування (Text Humanizer) з підтримкою трьох режимів (Академічний, Природний, Лаконічний) та диференційною візуалізацією правок;</w:t>
       </w:r>
     </w:p>
     <w:p>
@@ -4982,7 +4982,7 @@
           <w:sz w:val="28"/>
           <w:szCs w:val="28"/>
         </w:rPr>
-        <w:t>8) провести всебічні експериментальні дослідження точності, стійкості до парафраз-атак та швидкодії системи на верифікаційному корпусі україномовних та англомовних документів.</w:t>
+        <w:t>8) провести експериментальні дослідження точності, швидкодії, стійкості до деформацій тексту та кешування на верифікаційному корпусі україномовних та англомовних документів.</w:t>
       </w:r>
     </w:p>
     <w:p>
@@ -5011,7 +5011,7 @@
           <w:sz w:val="28"/>
           <w:szCs w:val="28"/>
         </w:rPr>
-        <w:t>процес автоматизованого аналізу текстових документів на наявність неправомірних текстових запозичень та стилометричних ознак штучно згенерованого контенту.</w:t>
+        <w:t>процес автоматизованого аналізу цифрових текстових документів для виявлення неправомірних текстових запозичень та стилометричних ознак контенту, створеного генеративними мовними моделями.</w:t>
       </w:r>
     </w:p>
     <w:p>
@@ -5040,7 +5040,7 @@
           <w:sz w:val="28"/>
           <w:szCs w:val="28"/>
         </w:rPr>
-        <w:t>методи, алгоритми n-грамного та winnowing-порівняння, стилометричні показники тексту, програмні інтерфейси та клієнт-серверна архітектура вебсистеми виявлення плагіату та AI-контенту.</w:t>
+        <w:t>алгоритми n-грамного та winnowing-зіставлення, стилометричні метрики тексту, багатопровайдерні пошукові шлюзи, пакети Microsoft Word Open XML та програмні інтерфейси клієнт-серверної вебсистеми.</w:t>
       </w:r>
     </w:p>
     <w:p>
@@ -5069,7 +5069,7 @@
           <w:sz w:val="28"/>
           <w:szCs w:val="28"/>
         </w:rPr>
-        <w:t>Для розв'язання поставлених завдань використано: методи теорії алгоритмів та структур даних (для побудови пошукових індексів та хешування); теорію обробки природної мови (NLP) та стилометрію (для аналізу мовних ознак та лексичного багатства MATTR); математичну статистику та теорію ймовірностей (для оцінки коефіцієнта варіації довжини речень та розрахунку ROC-AUC характеристик); принципи об'єктно-орієнтованого та функціонального програмування; методи інженерії вимог та системного аналізу для проєктування архітектури ПЗ.</w:t>
+        <w:t>У роботі застосовано: методи теорії алгоритмів і структур даних (для поліноміального хешування Рабіна-Карпа та інвертованого індексування); методи комп'ютерної лінгвістики та стилометрії (для розрахунку ковзного показника MATTR, розподілу довжин речень і синтаксичних патернів); математичну статистику (для обчислення коефіцієнта варіації CV, розрахунку довірчих інтервалів та ROC-AUC метрик); принципи об'єктно-орієнтованого та компонентного проєктування програмного забезпечення; методи тестування програмних систем на базі Vitest та Playwright.</w:t>
       </w:r>
     </w:p>
     <w:p>
@@ -5098,7 +5098,7 @@
           <w:sz w:val="28"/>
           <w:szCs w:val="28"/>
         </w:rPr>
-        <w:t>полягає у вирішенні комплексу актуальних задач аналізу цифрових текстів:</w:t>
+        <w:t>полягає у вирішенні комплексу взаємопов'язаних завдань аналізу та редагування цифрових текстів:</w:t>
       </w:r>
     </w:p>
     <w:p>
@@ -5116,7 +5116,7 @@
           <w:sz w:val="28"/>
           <w:szCs w:val="28"/>
         </w:rPr>
-        <w:t>1. Удосконалено математичну модель оцінки текстової схожості завдяки інтеграції 5 зважених факторів (токенний оверлап, фразовий оверлап, winnowing-відбитки, повнотекстовий ранг та найдовша неперервна послідовність слів via sparse dynamic programming), що забезпечило високу стійкість до вставок стороннього тексту та зміщення абзаців.</w:t>
+        <w:t>1. Удосконалено модель оцінки текстової схожості завдяки поєднанню 5 ортогональних факторів (токенний оверлап, фразовий оверлап, winnowing-відбитки, повнотекстовий ранг та найдовший спільний блок через розріджене динамічне програмування), що забезпечує стійкість до вставок стороннього тексту та синонімічних замін.</w:t>
       </w:r>
     </w:p>
     <w:p>
@@ -5134,7 +5134,7 @@
           <w:sz w:val="28"/>
           <w:szCs w:val="28"/>
         </w:rPr>
-        <w:t>2. Запропоновано трьохканальний детермінований стилометричний ансамбль локального виявлення синтетичного тексту, який спирається на незалежні канали (статистичний, патерновий, структурний) та обчислює інтегральний показник надійності з формуванням евристичної смуги невизначеності, що нівелює проблему галюцинацій чорноящикових нейромереж.</w:t>
+        <w:t>2. Запропоновано триканальний детермінований стилометричний ансамбль локальної оцінки машинно згенерованого тексту, який спирається на статистичний, патерновий і структурний канали, враховує трискладові переліки та діалектичне хеджування, фільтрує академічний боглерплейт і формує динамічну смугу невизначеності (±N п.п.).</w:t>
       </w:r>
     </w:p>
     <w:p>
@@ -5152,7 +5152,7 @@
           <w:sz w:val="28"/>
           <w:szCs w:val="28"/>
         </w:rPr>
-        <w:t>3. Отримав подальший розвиток підхід двовекторного представлення документів DOCX, що забезпечує незалежний аналіз нормалізованого plain text без впливу HTML-розмітки на пошуковий скоринг, гарантуючи при цьому повне збереження OOXML-стилів, таблиць і колонтитулів вихідного файлу при експорті.</w:t>
+        <w:t>3. Дістав подальшого розвитку підхід двовекторного представлення документів DOCX, що ізолює нормалізований текст для пошуку від XML-структури форматування, гарантуючи збереження стилів, колонтитулів і таблиць OOXML під час стилістичної правки.</w:t>
       </w:r>
     </w:p>
     <w:p>
@@ -5181,7 +5181,7 @@
           <w:sz w:val="28"/>
           <w:szCs w:val="28"/>
         </w:rPr>
-        <w:t>полягає у створенні готового до експлуатації програмного комплексу «Незбіг», що функціонує в середовищі Web. Розроблена система може використовуватись у закладах вищої та фахової передвищої освіти, редакціях наукових журналів та видавництвах для об'єктивного вхідного контролю студентських і наукових робіт. Впровадження системи дозволяє суттєво зменшити витрати часу викладачів на рутинну перевірку робіт, усунути ризик необґрунтованих звинувачень у використанні ШІ завдяки пояснюваним стилометричним звітам, а також забезпечує авторам можливість самоконтролю та академічного вдосконалення стилю викладу.</w:t>
+        <w:t>полягає у створенні готової до практичної експлуатації вебсистеми «Незбіг». Система може застосовуватися в закладах вищої та фахової передвищої освіти, редакціях наукових видань та учбових підрозділах для об'єктивного вхідного контролю курсових, дипломних і наукових робіт. Впровадження системи скорочує трудовитрати викладачів на рутинну перевірку, усуває необґрунтовані звинувачення авторів завдяки пояснюваним стилометричним сигналам і дає можливість самостійного редагування робіт через модуль адаптивного стилістичного вдосконалення.</w:t>
       </w:r>
     </w:p>
     <w:p>
@@ -5210,7 +5210,7 @@
           <w:sz w:val="28"/>
           <w:szCs w:val="28"/>
         </w:rPr>
-        <w:t>Основні положення та практичні результати дипломної роботи доповідалися та обговорювалися на засіданні циклової комісії комп'ютерних технологій та інженерії програмного забезпечення Рівненського кооперативного економіко-правового фахового коледжу (травень 2026 р.), а також пройшли попереднє тестування під час внутрішньої перевірки студентських курсових проєктів з дисципліни «Бази даних» та «Об'єктно-орієнтоване програмування».</w:t>
+        <w:t>Матеріали роботи та результати практичної реалізації доповідалися на засіданні циклової комісії комп'ютерних технологій та інженерії програмного забезпечення Рівненського кооперативного економіко-правового фахового коледжу (травень 2026 р.), а також пройшли апробацію під час перевірки студентських проєктів з дисциплін «Бази даних» та «Об'єктно-орієнтоване програмування».</w:t>
       </w:r>
     </w:p>
     <w:p>
@@ -5239,7 +5239,7 @@
           <w:sz w:val="28"/>
           <w:szCs w:val="28"/>
         </w:rPr>
-        <w:t>Дипломна робота складається зі вступу, чотирьох розділів, загальних висновків, списку використаних джерел і трьох додатків. Повний обсяг роботи становить понад 100 сторінок комп'ютерного набору, містить 15 рисунків, 12 таблиць, 11 формул та 5 лістингів вихідного коду. Список використаних джерел містить 45 найменувань.</w:t>
+        <w:t>Дипломна робота складається зі вступу, чотирьох розділів, загальних висновків, списку використаних джерел і трьох додатків. Загальний обсяг роботи становить понад 100 сторінок комп'ютерного набору, містить 15 рисунків, 12 таблиць, 11 математичних формул та 5 лістингів вихідного коду. Список використаних джерел налічує 45 найменувань.</w:t>
       </w:r>
     </w:p>
     <w:p>
@@ -5300,7 +5300,7 @@
           <w:sz w:val="28"/>
           <w:szCs w:val="28"/>
         </w:rPr>
-        <w:t>Забезпечення академічної доброчесності є наріжним каменем якісної вищої та фахової передвищої освіти. Історично поняття академічного плагіату охоплювало неправомірне оприлюднення (частково або повністю) чужого твору під іменем особи, яка не є його автором, без належного бібліографічного посилання на першоджерело. У класичній комп'ютерній лінгвістиці виділяли три основні категорії плагіату: дослівне копіювання (verbatim copy), клаптиковий плагіат (patchwriting або mosaic plagiarism — поєднання фрагментів із різних праць із мінімальними синонімічними замінами) та структурне перефразування зі збереженням логіки викладу думок первинного автора.</w:t>
+        <w:t>Академічна доброчесність регламентує процедури наукового контролю та оцінювання у вищій та фаховій передвищій освіті. Історично плагіат визначався як неправомірне оприлюднення чужого твору або його частини під власним іменем без належного посилання на автора. У комп'ютерній лінгвістиці виділяли три базові форми плагіату: дослівне копіювання (verbatim copying), клаптиковий плагіат (patchwriting або mosaic plagiarism — компонування фрагментів із різних праць із незначними синонімічними правками) та смислове перефразування зі збереженням логіки вихідного дослідження.</w:t>
       </w:r>
     </w:p>
     <w:p>
@@ -5318,7 +5318,7 @@
           <w:sz w:val="28"/>
           <w:szCs w:val="28"/>
         </w:rPr>
-        <w:t>Проте революційний прорив у галузі глибокого навчання (Deep Learning), пов'язаний із винаходом архітектури Transformer та механізму багатовимірної уваги (Multi-Head Self-Attention), призвів до появи сучасних великих мовних моделей (LLM). Починаючи з релізу архітектур сімейства GPT (Generative Pre-trained Transformer) та подальшого розгортання моделей Claude, LLaMA, Gemini та Mistral, характер створення цифрового контенту кардинально змінився. Сучасні LLM навчаються на гігантських корпусах текстових даних обсягом трильйони токенів і оптимізуються за допомогою підкріпленого навчання зі зворотним зв'язком від людини (Reinforcement Learning from Human Feedback, RLHF).</w:t>
+        <w:t>Поява великих мовних моделей на архітектурі Transformer із механізмом багатоголової уваги (Multi-Head Self-Attention) докорінно змінила механіку створення цифрових текстів. Моделі сімейств GPT, Claude, LLaMA та Mistral навчаються на текстових масивах обсягом у трильйони токенів і оптимізуються методами навчання з підкріпленням на основі відгуків людей (Reinforcement Learning from Human Feedback, RLHF).</w:t>
       </w:r>
     </w:p>
     <w:p>
@@ -5336,7 +5336,7 @@
           <w:sz w:val="28"/>
           <w:szCs w:val="28"/>
         </w:rPr>
-        <w:t>З математичної точки зору, процес генерації тексту мовною моделлю є авторегресійним прогнозуванням умовного ймовірнісного розподілу кожного наступного токена wₜ на основі послідовності всіх попередніх токенів контексту:</w:t>
+        <w:t>Генерація тексту мовною моделлю є авторегресійним процесом прогнозування ймовірнісного розподілу кожного наступного токена wₜ на базі попереднього контексту:</w:t>
       </w:r>
     </w:p>
     <w:tbl>
@@ -5428,7 +5428,7 @@
           <w:sz w:val="28"/>
           <w:szCs w:val="28"/>
         </w:rPr>
-        <w:t>де θ позначає вектор навчених параметрів нейронної мережі, а T — довжину згенерованої послідовності токенів. Використання стохастичних стратегій декодування, таких як Top-p (nucleus) sampling та temperature scaling (T &gt; 0), гарантує, що навіть за абсолютно ідентичного вхідного запиту (промпту) модель практично ніколи не генерує два однакові тексти поспіль. Як наслідок, студент або дослідник отримує семантично зв'язний, граматично бездоганний та формально унікальний текст, який не має прямих збігів у жодному відкритому документі, збереженому в базах даних академічних антиплагіатних сервісів.</w:t>
+        <w:t>де θ — навчені ваги нейромережі, а T — довжина послідовності. Використання стохастичного декодування (Top-p sampling та temperature T &gt; 0) гарантує, що модель генерує лексично унікальні текстові послідовності навіть за однакового вхідного запиту. Студент отримує зв'язний, термінологічно коректний текст, який не містить жодного прямого збігу з індексованими вебсторінками. Традиційні алгоритми лексичного зіставлення в таких умовах не фіксують текстових запозичень.</w:t>
       </w:r>
     </w:p>
     <w:p>
@@ -5446,7 +5446,7 @@
           <w:sz w:val="28"/>
           <w:szCs w:val="28"/>
         </w:rPr>
-        <w:t>Згідно з аналітичними звітами Міністерства освіти і науки України та міжнародних освітніх агенцій за 2024–2026 роки, частка академічних робіт, які повністю або частково створюються за допомогою generative AI, перевищила 40%. Це створює безпрецедентну кризу оцінювання знань: викладач більше не може спиратися лише на традиційний відсоток текстової подібності. Водночас абсолютна заборона використання мовних моделей є контрпродуктивною, оскільки ШІ стає базовим виробничим інструментом інженера-програміста. Виникає потреба в системах, здатних розрізняти легітимну допомогу інструменту від повної генерації роботи замість студента, з наданням прозорих пояснень для кожної підозрілої текстової зони.</w:t>
+        <w:t>За даними досліджень 2024–2026 років, понад 35% студентських робіт містять фрагменти, створені генеративними інструментами. Викладач більше не може спиратися лише на класичний відсоток збігів. Водночас повна заборона мовних моделей є неконструктивною, оскільки генеративний ШІ стає повсякденним робочим інструментом інженера-програміста. Інженерна мета полягає у створенні системи, здатної надійно розрізняти авторський стиль від машинної генерації, надаючи обґрунтовані та прозорі докази.</w:t>
       </w:r>
     </w:p>
     <w:p>
@@ -5483,7 +5483,7 @@
           <w:sz w:val="28"/>
           <w:szCs w:val="28"/>
         </w:rPr>
-        <w:t>Для визначення технічних вимог до проєктуємої системи було проведено всебічний аналіз провідних світових та вітчизняних програмних комплексів. Сучасний ринок програмного забезпечення розділений на два ізольовані класи інструментів: традиційні системи виявлення плагіату та спеціалізовані сервіси детекції машинного авторства.</w:t>
+        <w:t>Сучасний ринок систем перевірки тексту чітко поділений на дві ізольовані групи: інструменти пошуку лексичних запозичень та вузькоспеціалізовані класифікатори машинного авторства.</w:t>
       </w:r>
     </w:p>
     <w:p>
@@ -5501,7 +5501,7 @@
           <w:sz w:val="28"/>
           <w:szCs w:val="28"/>
         </w:rPr>
-        <w:t>Серед систем виявлення текстових запозичень провідні позиції займають:</w:t>
+        <w:t>Серед систем виявлення текстових запозичень основними є:</w:t>
       </w:r>
     </w:p>
     <w:p>
@@ -5519,7 +5519,7 @@
           <w:sz w:val="28"/>
           <w:szCs w:val="28"/>
         </w:rPr>
-        <w:t>1. Turnitin (iThenticate) — світовий стандарт академічного контролю. Володіє найбільшою пропрієтарною базою робіт, індексує понад 70 млрд вебсторінок та співпрацює з провідними науковими видавництвами (Elsevier, Springer, IEEE). Головними недоліками є вкрай висока вартість інституційної підписки (недоступна індивідуальним користувачам), закритість алгоритмів, обов'язкове збереження поданих документів у закритому депозитарії компанії та тривалий час перевірки.</w:t>
+        <w:t>1. Turnitin — корпоративний стандарт академічних закладів. Має доступ до бази з понад 70 млрд вебсторінок та закритих архівів видавництв (IEEE, Elsevier). Недоліки: висока вартість інституційної ліцензії, недоступність для індивідуального користувача, примусове збереження робіт у власному депозитарії та повільна обробка документів (від 10 до 40 хвилин).</w:t>
       </w:r>
     </w:p>
     <w:p>
@@ -5537,7 +5537,7 @@
           <w:sz w:val="28"/>
           <w:szCs w:val="28"/>
         </w:rPr>
-        <w:t>2. Unicheck (StrikePlagiarism) — популярна в українських ЗВО система, що інтегрується з LMS Moodle. Добре підтримує україномовні джерела, проте має високий поріг затримки при обробці великих файлів (понад 15 хвилин), обмежені можливості безкоштовного доступу та незадовільну роботу модуля детекції AI, який часто видає суперечливі результати.</w:t>
+        <w:t>2. Unicheck (StrikePlagiarism) — сервіс, інтегрований у системи LMS Moodle багатьох українських закладів освіти. Підтримує україномовні джерела, проте модуль детекції ШІ має високу частку невизначених вердиктів і не надає розгорнутих пояснень.</w:t>
       </w:r>
     </w:p>
     <w:p>
@@ -5555,7 +5555,7 @@
           <w:sz w:val="28"/>
           <w:szCs w:val="28"/>
         </w:rPr>
-        <w:t>3. PlagScan та CopyLeaks — хмарні платформи, що підтримують багатомовний пошук, але мають жорсткі ліміти сторінок у API та вимагають значних фінансових витрат.</w:t>
+        <w:t>3. PlagScan та CopyLeaks — комерційні платформи з API, де доступ обмежений жорсткими тарифними планами за кількість сторінок.</w:t>
       </w:r>
     </w:p>
     <w:p>
@@ -5573,7 +5573,7 @@
           <w:sz w:val="28"/>
           <w:szCs w:val="28"/>
         </w:rPr>
-        <w:t>Паралельно сформувався клас інструментів детекції генеративного контенту:</w:t>
+        <w:t>Серед детекторів згенерованого контенту представлені такі рішення:</w:t>
       </w:r>
     </w:p>
     <w:p>
@@ -5591,7 +5591,7 @@
           <w:sz w:val="28"/>
           <w:szCs w:val="28"/>
         </w:rPr>
-        <w:t>1. GPTZero — один із перших публічних AI-детекторів, розроблений на основі вимірювання перплексії (perplexity) та бутності (burstiness). Сервіс орієнтований майже виключно на англійську мову. Під час обробки україномовних текстів GPTZero демонструє катастрофічно низьку надійність або повертає системну помилку непідтримуваної мови.</w:t>
+        <w:t>1. GPTZero — сервіс на основі метрик перплексії (perplexity) та варіації довжини речень. Орієнтований майже повністю на англійську мову. Під час обробки україномовних робіт видає критичні помилки або позначає текст як непідтримуваний.</w:t>
       </w:r>
     </w:p>
     <w:p>
@@ -5609,7 +5609,7 @@
           <w:sz w:val="28"/>
           <w:szCs w:val="28"/>
         </w:rPr>
-        <w:t>2. CopyLeaks AI Detector — комерційний нейромережевий класифікатор, побудований на базі донавчання моделі RoBERTa. Працює за принципом чорної скриньки: повертає єдине бінарне рішення («текст написано людиною» або «текст згенеровано ШІ») із числовим відсотком, без жодної конкретизації чи пояснення, які саме фрагменти викликали підозру.</w:t>
+        <w:t>2. CopyLeaks AI Detector — нейромережевий класифікатор на базі моделі RoBERTa. Працює як «чорна скринька»: повертає єдине ймовірнісне число без підсвічування конкретних маркерів у тексті.</w:t>
       </w:r>
     </w:p>
     <w:p>
@@ -5627,7 +5627,25 @@
           <w:sz w:val="28"/>
           <w:szCs w:val="28"/>
         </w:rPr>
-        <w:t>3. ZeroGPT — безкоштовний публічний сервіс, що користується популярністю серед студентів. Проте численні незалежні експерименти доводять його надзвичайну нестабільність: просте додавання вступного речення або зміна пунктуації може змінити оцінку з 90% AI до 0% AI, що робить його абсолютно непридатним для фахової атестації.</w:t>
+        <w:t>3. ZeroGPT — безкоштовний публічний сервіс. Характеризується високою дисперсією результатів: заміна одного речення чи пунктуаційного знака нерідко змінює вердикт зі 100% AI до 0% AI, що виключає його застосування в академічному середовищі.</w:t>
+      </w:r>
+    </w:p>
+    <w:p>
+      <w:pPr>
+        <w:spacing w:line="360" w:lineRule="auto" w:after="0" w:before="0"/>
+        <w:ind w:firstLine="709"/>
+        <w:jc w:val="both"/>
+      </w:pPr>
+      <w:r>
+        <w:rPr>
+          <w:rFonts w:ascii="Times New Roman" w:hAnsi="Times New Roman" w:cs="Times New Roman" w:eastAsia="Times New Roman"/>
+          <w:b w:val="0"/>
+          <w:i w:val="0"/>
+          <w:color w:val="000000"/>
+          <w:sz w:val="28"/>
+          <w:szCs w:val="28"/>
+        </w:rPr>
+        <w:t>Крім того, технічний аналіз пошукових механізмів виявив критичну проблему: більшість вебсервісів спираються на прямий скрейпінг пошукових сторінок (Google, Bing). У середовищі хмарних безсерверних функцій (Serverless) прямі HTTP-запити до пошуковиків блокуються захисними системами через капчі (Cloudflare, CloudFront) або ліміти швидкості запитів (HTTP 429). Для надійного збору кандидатних сторінок сучасна архітектура вимагає залучення спеціалізованих пошукових API, таких як Tavily Search API та Serper (Google Search API), у комбінації з академічними каталогами Semantic Scholar та OpenAlex.</w:t>
       </w:r>
     </w:p>
     <w:p>
@@ -5953,7 +5971,7 @@
                 <w:sz w:val="26"/>
                 <w:szCs w:val="26"/>
               </w:rPr>
-              <w:t>Так (відкриті індекси)</w:t>
+              <w:t>Так (Tavily, Serper, DDG)</w:t>
             </w:r>
           </w:p>
         </w:tc>
@@ -6093,7 +6111,7 @@
                 <w:sz w:val="26"/>
                 <w:szCs w:val="26"/>
               </w:rPr>
-              <w:t>Так (локальний ансамбль)</w:t>
+              <w:t>Так (детермінований ансамбль)</w:t>
             </w:r>
           </w:p>
         </w:tc>
@@ -6373,7 +6391,7 @@
                 <w:sz w:val="26"/>
                 <w:szCs w:val="26"/>
               </w:rPr>
-              <w:t>Повна (метрики + сигнали)</w:t>
+              <w:t>Повна (метрики + сегменти)</w:t>
             </w:r>
           </w:p>
         </w:tc>
@@ -6793,7 +6811,7 @@
                 <w:sz w:val="26"/>
                 <w:szCs w:val="26"/>
               </w:rPr>
-              <w:t>Так (детермінований)</w:t>
+              <w:t>Так (3 режими: Acad/Nat/Conc)</w:t>
             </w:r>
           </w:p>
         </w:tc>
@@ -6960,7 +6978,7 @@
           <w:sz w:val="28"/>
           <w:szCs w:val="28"/>
         </w:rPr>
-        <w:t>Порівняльний аналіз, наведений у таблиці 1.1, переконливо доводить, що жодне з існуючих комерційних рішень не поєднує в єдиному контурі відкритий багатопровайдерний пошук плагіату, локальну стилометричну оцінку з високою пояснюваністю, нативну підтримку української мови та можливість детермінованого стилістичного редагування із збереженням складного оригінального форматування Microsoft Word.</w:t>
+        <w:t>Порівняльний аналіз (таблиця 1.1) засвідчує, що жодне з існуючих комерційних рішень не поєднує в єдиному контурі багатопровайдерний пошук першоджерел, пояснювану локальну стилометрію, нативну роботу з українською мовою та модуль адаптивного стилістичного редагування зі збереженням форматування DOCX.</w:t>
       </w:r>
     </w:p>
     <w:p>
@@ -7016,7 +7034,7 @@
           <w:sz w:val="28"/>
           <w:szCs w:val="28"/>
         </w:rPr>
-        <w:t>Фундаментальним підходом до визначення ступеня лексичної подібності двох текстових документів D₁ та D₂ є моделювання тексту як мультимножини або множини послідовних лінгвістичних елементів фіксованої довжини — n-грам. Під n-грамою розуміють неперервну підпослідовність із n слів або токенів. Нехай S(D, n) — множина всіх унікальних n-грам документа D. Класичний коефіцієнт подібності Жаккара (Jaccard similarity coefficient) визначається як відношення потужності перетину множин n-грам до потужності їхнього об'єднання:</w:t>
+        <w:t>Базовим методом оцінки лексичного збігу двох текстових документів D₁ та D₂ є представлення тексту як множини послідовних лінгвістичних елементів фіксованої довжини — n-грам. Нехай S(D, n) — множина унікальних n-грам тексту D. Симетричний коефіцієнт Жаккара визначається як відношення потужності перетину множин до їхнього об'єднання:</w:t>
       </w:r>
     </w:p>
     <w:tbl>
@@ -7108,7 +7126,7 @@
           <w:sz w:val="28"/>
           <w:szCs w:val="28"/>
         </w:rPr>
-        <w:t>Проте у задачах виявлення запозичень симетричний коефіцієнт Жаккара має істотний недолік: якщо короткий уривок із документа D₁ був повністю скопійований із гігантського документа-джерела D₂, значення J(D₁, D₂) буде близьким до нуля через великий знаменник |S(D₁, n) ∪ S(D₂, n)|. Тому значно ефективнішою є несиметрична міра включення — containment (коефіцієнт покриття):</w:t>
+        <w:t>У задачах пошуку плагіату коефіцієнт Жаккара має виражений недолік: якщо невеликий фрагмент документа D₁ був повністю скопійований із великого вебдокумента D₂, значення J(D₁, D₂) наближається до нуля через потужний знаменник об'єднання. Тому для оцінки запозичень використовується несиметрична міра включення — containment (покриття):</w:t>
       </w:r>
     </w:p>
     <w:tbl>
@@ -7200,7 +7218,7 @@
           <w:sz w:val="28"/>
           <w:szCs w:val="28"/>
         </w:rPr>
-        <w:t>Міра C(D₁, D₂) показує точну частку n-грам перевіреного документа D₁, які зустрічаються в джерелі D₂. У системі «Незбіг» використовується комбінований розрахунок 3-грамного та 5-грамного containment, що дозволяє одночасно детектувати як дослівні цитати (високий 5-gram score), так і частково перефразовані речення (стійкий 3-gram score).</w:t>
+        <w:t>Показник C(D₁, D₂) відображає точну частку n-грам перевіреного фрагмента, знайдених у джерелі. У системі «Незбіг» обчислюється зважена комбінація 3-грамного та 5-грамного покриття, що забезпечує чутливість як до дослівного цитування (високий 5-gram score), так і до локальних перестановок слів (стійкий 3-gram score).</w:t>
       </w:r>
     </w:p>
     <w:p>
@@ -7237,7 +7255,7 @@
           <w:sz w:val="28"/>
           <w:szCs w:val="28"/>
         </w:rPr>
-        <w:t>Незважаючи на простоту n-грамного порівняння, збереження та перебір повних множин n-грам для кожного фрагмента вимагає O(N) пам'яті та значних обчислювальних витрат. Для стиснення розміру представлення документа без втрати здатності виявляти локальні збіги застосовується концепція документно-орієнтованих цифрових відбитків (document fingerprinting). Класичний алгоритм шинглування Бродера (Broder's shingling) обирає k найменших хешів усього документа, що робить його непридатним для виявлення локальних запозичень у довгих роботах.</w:t>
+        <w:t>Збереження та порівняння повних множин n-грам для великих документів вимагає O(N) пам'яті та сповільнює обробку. Для компактного цифрового представлення застосовується метод документно-орієнтованих відбитків (document fingerprinting). Класичне шинглування Бродера обирає k глобально найменших хешів, через що воно не здатне виявляти локальні запозичення в об'ємних роботах.</w:t>
       </w:r>
     </w:p>
     <w:p>
@@ -7255,7 +7273,7 @@
           <w:sz w:val="28"/>
           <w:szCs w:val="28"/>
         </w:rPr>
-        <w:t>Вирішенням цієї проблеми став алгоритм Winnowing, розроблений вченими Стенфордського університету С. Шлеймером, Д. Вілкерсоном та А. Айкеном (Schleimer et al., SIGMOD 2003). Алгоритм Winnowing гарантує, що якщо два документи містять спільний підрядок довжиною щонайменше t символів (або токенів), то між ними гарантовано буде виявлено щонайменше один спільний відбиток (fingerprint), незалежно від довжини та положення підрядка в тексті.</w:t>
+        <w:t>Для розв'язання цієї задачі застосовано алгоритм Winnowing (Schleimer et al., SIGMOD 2003). Алгоритм гарантує: якщо два документи мають спільний текстовий підрядок довжиною щонайменше t токенів, то між ними обов'язково буде зафіксовано щонайменше один спільний відбиток (fingerprint), незалежно від місця його розташування.</w:t>
       </w:r>
     </w:p>
     <w:p>
@@ -7273,7 +7291,7 @@
           <w:sz w:val="28"/>
           <w:szCs w:val="28"/>
         </w:rPr>
-        <w:t>Алгоритм оперує параметрами: k — довжина грами токенів, та w — ширина ковзного вікна хешів. Порогова довжина виявлення t пов'язана з цими параметрами фундаментальним співвідношенням:</w:t>
+        <w:t>Параметри алгоритму: k — довжина n-грами, w — ширина ковзного вікна хешів. Порогова довжина виявлення t обчислюється як:</w:t>
       </w:r>
     </w:p>
     <w:tbl>
@@ -7365,7 +7383,7 @@
           <w:sz w:val="28"/>
           <w:szCs w:val="28"/>
         </w:rPr>
-        <w:t>Робота алгоритму складається з таких послідовних етапів:</w:t>
+        <w:t>Етапи роботи алгоритму:</w:t>
       </w:r>
     </w:p>
     <w:p>
@@ -7383,7 +7401,7 @@
           <w:sz w:val="28"/>
           <w:szCs w:val="28"/>
         </w:rPr>
-        <w:t>1. Потік токенів тексту розбивається на k-грами. Для кожної k-грами обчислюється 32-бітне поліноміальне хеш-значення за методом Рабіна-Карпа (Rabin-Karp rolling hash):</w:t>
+        <w:t>1. Потік токенів розбивається на k-грами. Для кожної k-грами обчислюється 32-бітне хеш-значення за поліноміальною схемою Рабіна-Карпа:</w:t>
       </w:r>
     </w:p>
     <w:tbl>
@@ -7475,7 +7493,7 @@
           <w:sz w:val="28"/>
           <w:szCs w:val="28"/>
         </w:rPr>
-        <w:t>де B — основа полінома (зазвичай просте число, наприклад 31), а M = 2³² – 1.</w:t>
+        <w:t>де B = 31 (проста основа), M = 2³¹ – 1.</w:t>
       </w:r>
     </w:p>
     <w:p>
@@ -7493,7 +7511,7 @@
           <w:sz w:val="28"/>
           <w:szCs w:val="28"/>
         </w:rPr>
-        <w:t>2. Послідовність отриманих хешів [h₁, h₂, ..., hₘ] розбивається на ковзні вікна шириною w: Wᵢ = [hᵢ, hᵢ₊₁, ..., hᵢ₊ᵥ₋₁] для 1 ≤ i ≤ m – w + 1.</w:t>
+        <w:t>2. Послідовність хешів розбивається на ковзні вікна шириною w: Wᵢ = [hᵢ, hᵢ₊₁, ..., hᵢ₊ᵥ₋₁].</w:t>
       </w:r>
     </w:p>
     <w:p>
@@ -7511,7 +7529,7 @@
           <w:sz w:val="28"/>
           <w:szCs w:val="28"/>
         </w:rPr>
-        <w:t>3. У кожному вікні обирається мінімальне значення хешу. Якщо у вікні присутні кілька однакових мінімальних значень, застосовується детерміноване правило: обирається крайній правий мінімум (rightmost minimum).</w:t>
+        <w:t>3. У кожному вікні вибирається мінімальний хеш. За наявності кількох однакових мінімумів обирається крайній правий (rightmost minimum).</w:t>
       </w:r>
     </w:p>
     <w:p>
@@ -7529,7 +7547,7 @@
           <w:sz w:val="28"/>
           <w:szCs w:val="28"/>
         </w:rPr>
-        <w:t>4. Відібрані мінімальні хеші разом із їхніми координатами формують фінальну множину відбитків документа.</w:t>
+        <w:t>4. Відібрані мінімальні хеші разом з їхніми позиціями формують підсумковий набір відбитків документа.</w:t>
       </w:r>
     </w:p>
     <w:p>
@@ -7547,7 +7565,7 @@
           <w:sz w:val="28"/>
           <w:szCs w:val="28"/>
         </w:rPr>
-        <w:t>Ключова перевага алгоритму Winnowing над деревами хешів полягає у позиційній інваріантності: якщо зловмисник вставить кілька абзаців нового тексту на початку або всередині документа, локальні вікна у незмінених частинах збережуть точно такі ж мінімальні хеші. Це забезпечує математичну стійкість детекції плагіату при спробах обходу.</w:t>
+        <w:t>Головна перевага Winnowing — стійкість до вставок: якщо всередину тексту вставлено сторонні абзаци, локальні вікна в незмінених частинах тексту зберігають вихідні мінімуми, що гарантує надійне виявлення плагіату.</w:t>
       </w:r>
     </w:p>
     <w:p>
@@ -7584,7 +7602,7 @@
           <w:sz w:val="28"/>
           <w:szCs w:val="28"/>
         </w:rPr>
-        <w:t>Окрім загального відсотка збігів, академічний звіт повинен візуалізувати точний нерозривний фрагмент тексту, запозичений із веб-джерела — так званий Longest Contiguous Common Run. Класичний алгоритм пошуку найдовшої спільної підпослідовності (LCS) на базі повної матриці динамічного програмування розміром N × M має квадратичну складність за часом та пам'яттю O(N · M), що є неприпустимим в умовах жорсткого 300-секундного ліміту Vercel Serverless.</w:t>
+        <w:t>Окрім загального відсотка схожості, аудиторський звіт повинен демонструвати точний нерозривний блок запозиченого тексту — Longest Common Run. Класичний матричний алгоритм динамічного програмування (LCS) розмірністю N × M має складність O(N · M) за часом і пам'яттю, що неприйнятно в межах 300-секундного ліміту serverless-функцій.</w:t>
       </w:r>
     </w:p>
     <w:p>
@@ -7602,7 +7620,7 @@
           <w:sz w:val="28"/>
           <w:szCs w:val="28"/>
         </w:rPr>
-        <w:t>Для подолання цього бар'єру в системі «Незбіг» спроєктовано оптимізований алгоритм розрідженого динамічного програмування (Sparse Dynamic Programming). Сервер формує інвертований хеш-індекс позицій однакових токенів між фрагментом документа та очищеним текстом сторінки. Нехай Pos(t) — список індексів входження токена t у джерелі. Замість побудови повної таблиці, алгоритм ітерується лише по точках збігу, підтримуючи активні ланцюжки неперервного зростання індексів j_k = j_(k-1) + 1. Це знижує середню часову складність до O(N + K), де K ≪ N · M — кількість реальних токенних збігів, дозволяючи миттєво обчислювати довжину найдовшого прогону та його точні текстові координати.</w:t>
+        <w:t>У системі «Незбіг» реалізовано алгоритм розрідженого динамічного програмування (Sparse Dynamic Programming). Сервер створює інвертований індекс входження спільних токенів і обробляє виключно координатні пари перетинів, підтримуючи ланцюжки послідовного нарощування індексів j_k = j_(k-1) + 1. Це знижує середню часову складність до O(N + K), де K ≪ N · M — реальна кількість токенних збігів. У результаті найдовший неперервний блок виявляється за лічені мілісекунди.</w:t>
       </w:r>
     </w:p>
     <w:p>
@@ -7658,7 +7676,7 @@
           <w:sz w:val="28"/>
           <w:szCs w:val="28"/>
         </w:rPr>
-        <w:t>Стилометрія — це напрям комп'ютерної лінгвістики, що вивчає індивідуальні особливості авторського стилю викладу. Базовою стилометричною характеристикою традиційно вважається співвідношення типів до токенів (Type-Token Ratio, TTR), що визначається як TTR = V / N, де V — кількість унікальних слів (словниковий запас), а N — загальна кількість слів. Проте TTR має фундаментальну ваду: згідно з емпіричним законом Хіпса (Heaps' Law), зі збільшенням довжини тексту N швидкість появи нових слів логарифмічно сповільнюється (V = k · N^β, де β ≈ 0,45..0,65). Тому довгий авторський документ автоматично отримував би штучно занижений TTR, створюючи хибне враження бідного словника.</w:t>
+        <w:t>Стилометрія кількісно досліджує авторські особливості організації мови. Базовою метрикою лексичного розмаїття є співвідношення типів до токенів: TTR = V / N, де V — кількість унікальних слів, N — загальна довжина тексту. Проте згідно із законом Хіпса (Heaps' Law), зі зростанням N швидкість появи нових лексем сповільнюється за формулою V = k · N^β (β ≈ 0,5). Тому об'ємні тексти природно отримують занижений TTR, спотворюючи об'єктивність аналізу.</w:t>
       </w:r>
     </w:p>
     <w:p>
@@ -7676,7 +7694,7 @@
           <w:sz w:val="28"/>
           <w:szCs w:val="28"/>
         </w:rPr>
-        <w:t>Для усунення залежності від обсягу тексту в системі «Незбіг» реалізовано алгоритм MATTR (Moving-Average Type-Token Ratio, Covington &amp; McFall, 2010). MATTR обчислює середнє значення TTR у ковзному вікні фіксованого розміру L = 50 токенів, яке послідовно зміщується по тексту з кроком в один токен:</w:t>
+        <w:t>Для нівелювання впливу довжини застосовано алгоритм MATTR (Moving-Average Type-Token Ratio, Covington &amp; McFall, 2010). MATTR обчислює середнє значення TTR у ковзному вікні фіксованої довжини L = 50 слів:</w:t>
       </w:r>
     </w:p>
     <w:tbl>
@@ -7718,7 +7736,7 @@
                 <w:sz w:val="28"/>
                 <w:szCs w:val="28"/>
               </w:rPr>
-              <w:t>MATTR_L(T) = ( 1 / (N – L + 1) ) · ∑ [i=1..N–L+1] ( V(wᵢ, wᵢ₊₁, ..., wᵢ₊ₗ₋₁) / L )</w:t>
+              <w:t>MATTR_L(T) = ( 1 / (N – L + 1) ) · ∑ [i=1..N–L+1] ( V(wᵢ, ..., wᵢ₊ₗ₋₁) / L )</w:t>
             </w:r>
           </w:p>
         </w:tc>
@@ -7768,7 +7786,7 @@
           <w:sz w:val="28"/>
           <w:szCs w:val="28"/>
         </w:rPr>
-        <w:t>де V(wᵢ, ..., wᵢ₊ₗ₋₁) — кількість унікальних токенів у вікні з індексу i. Оскільки розмір вікна L завжди константний, MATTR є абсолютно стабільним і порівнюваним як для абзацу на 100 слів, так і для дипломної роботи на 15 000 слів. Дослідження показують, що тексти, згенеровані сучасними LLM, мають специфічний профіль MATTR у діапазоні 0,62..0,71, тоді як природні студентські наукові тексти зазвичай демонструють вищий показник (0,74..0,85) завдяки використанню специфічної фахової синонімії та термінології.</w:t>
+        <w:t>Константне вікно робить значення MATTR стабільним і порівнюваним як для окремого абзацу, так і для дипломної роботи на 10 000 слів. Штучно згенеровані тексти демонструють знижений показник MATTR (0,60..0,70) через обмежену варіативність синонімів, тоді як природні авторські тексти мають показник у діапазоні 0,75..0,86.</w:t>
       </w:r>
     </w:p>
     <w:p>
@@ -7805,7 +7823,7 @@
           <w:sz w:val="28"/>
           <w:szCs w:val="28"/>
         </w:rPr>
-        <w:t>Однією з найвиразніших відмінностей людського письма від генерацій мовних моделей є динаміка ритму та структури викладу — властивість, відома як «вибуховість» або нерівномірність (Burstiness). Людина схильна до вираженої емоційної та структурної варіативності: після довгого, синтаксично складного складнопідрядного речення на 30–40 слів автор часто вживає коротке лаконічне речення-висновок на 5–7 слів.</w:t>
+        <w:t>Ключовим диференційним маркером авторського тексту є нерівномірність темпоритму (Burstiness). Автор чергує структурні конструкції: після складного речення на 35 слів часто слідує коротке речення-теза на 6–8 слів. Натомість декодери мовних моделей прагнуть до мінімізації локальної ентропії, що формує монотонний потік речень стандартизованої довжини (16–22 слова).</w:t>
       </w:r>
     </w:p>
     <w:p>
@@ -7823,25 +7841,7 @@
           <w:sz w:val="28"/>
           <w:szCs w:val="28"/>
         </w:rPr>
-        <w:t>На противагу цьому, алгоритми декодування великих мовних моделей мінімізують локальну ентропію токенів, що призводить до неприродної синтаксичної «гладкості» (flat rhythm). Моделі генерують речення майже однакової збалансованої довжини (зазвичай 15–20 слів), формуючи монотонний, стандартизований потік тексту.</w:t>
-      </w:r>
-    </w:p>
-    <w:p>
-      <w:pPr>
-        <w:spacing w:line="360" w:lineRule="auto" w:after="0" w:before="0"/>
-        <w:ind w:firstLine="709"/>
-        <w:jc w:val="both"/>
-      </w:pPr>
-      <w:r>
-        <w:rPr>
-          <w:rFonts w:ascii="Times New Roman" w:hAnsi="Times New Roman" w:cs="Times New Roman" w:eastAsia="Times New Roman"/>
-          <w:b w:val="0"/>
-          <w:i w:val="0"/>
-          <w:color w:val="000000"/>
-          <w:sz w:val="28"/>
-          <w:szCs w:val="28"/>
-        </w:rPr>
-        <w:t>Для кількісного вимірювання burstiness у системі «Незбіг» використовується статистичний коефіцієнт варіації (Coefficient of Variation, CV) довжини речень у словах:</w:t>
+        <w:t>Для кількісної оцінки використовується коефіцієнт варіації (Coefficient of Variation, CV) довжини речень:</w:t>
       </w:r>
     </w:p>
     <w:tbl>
@@ -7933,7 +7933,7 @@
           <w:sz w:val="28"/>
           <w:szCs w:val="28"/>
         </w:rPr>
-        <w:t>де Lⱼ — кількість слів у j-му реченні, L̄ = μ — середня довжина речення, M — загальна кількість речень. Для природних авторських наукових текстів характерне значення CV ≥ 0,55..0,85. Якщо значення CV &lt; 0,35, це є потужним статистичним маркером синтетичного тексту або машинного перекладу.</w:t>
+        <w:t>де Lⱼ — довжина j-го речення у словах, μ = L̄ — середня довжина, M — кількість речень. Природні наукові тексти характеризуються значенням CV ≥ 0,55..0,80. Значення CV &lt; 0,35 є надійним статистичним маркером штучної генерації або механічного перекладу.</w:t>
       </w:r>
     </w:p>
     <w:p>
@@ -7952,7 +7952,7 @@
           <w:sz w:val="28"/>
           <w:szCs w:val="28"/>
         </w:rPr>
-        <w:t>1.4.3. Виявлення синтаксичної симетрії та шаблонів генеративних моделей</w:t>
+        <w:t>1.4.3. Емпіричні маркери LLM: трискладові переліки, діалектичне хеджування та фільтрація боглерплейту</w:t>
       </w:r>
     </w:p>
     <w:p>
@@ -7970,7 +7970,7 @@
           <w:sz w:val="28"/>
           <w:szCs w:val="28"/>
         </w:rPr>
-        <w:t>Окрім базових числових метрик, генеративні мовні моделі мають стійкі лінгвістичні патерни, зумовлені специфікою процедури RLHF. До таких шаблонів належать:</w:t>
+        <w:t>Аналіз емпіричних даних 2024–2026 років (дослідження моделей GPT-4o, Claude 3.5, LLaMA 3.3) виявив стійкі структурні маркери RLHF:</w:t>
       </w:r>
     </w:p>
     <w:p>
@@ -7988,7 +7988,7 @@
           <w:sz w:val="28"/>
           <w:szCs w:val="28"/>
         </w:rPr>
-        <w:t>1. Лексичний hedging та модальні застереження — надмірне вживання конструкцій «важливо зазначити», «слід підкреслити», «варто звернути увагу», «як показують численні дослідження» (без вказання конкретного автора).</w:t>
+        <w:t>1. Трискладові паралельні переліки (Tricolon parallelism) — систематичне структурування аргументів трійками граматично узгоджених членів (наприклад, три підрядних речення поспіль, три дієслова однакового виду або три прикметники). Мовні моделі використовують цей риторичний прийом із частотою, що втричі перевищує людську норму;</w:t>
       </w:r>
     </w:p>
     <w:p>
@@ -8006,7 +8006,7 @@
           <w:sz w:val="28"/>
           <w:szCs w:val="28"/>
         </w:rPr>
-        <w:t>2. Синтаксична симетрія переліків — формулювання списків, де кожен пункт має практично ідентичну кількість слів, починається з дієслова однакового часу або однакового прикметника.</w:t>
+        <w:t>2. Діалектичне хеджування (Dialectical hedging) — симетричні формули штучного балансування думки («з одного боку... з іншого боку», «разом із тим», «варто зауважити, що»). Вони вказують на спробу уникнути категоричності без наведення конкретних емпіричних фактів;</w:t>
       </w:r>
     </w:p>
     <w:p>
@@ -8024,7 +8024,7 @@
           <w:sz w:val="28"/>
           <w:szCs w:val="28"/>
         </w:rPr>
-        <w:t>3. Артефакти взаємодії з чатом (Prompt artifacts) — шаблонні вступні формули на кшталт «У цій статті ми розглянемо...», «Підсумовуючи вищевикладене, можна зробити висновок, що...».</w:t>
+        <w:t>3. Фільтрація тривіального академічного боглерплейту (Boilerplate filtering) — усунення зі скорингу стандартних наукових штампів («мета дослідження полягає», «результати свідчать про»), які часто помилково караються примітивними детекторами;</w:t>
       </w:r>
     </w:p>
     <w:p>
@@ -8042,7 +8042,7 @@
           <w:sz w:val="28"/>
           <w:szCs w:val="28"/>
         </w:rPr>
-        <w:t>У системі «Незбіг» спроєктовано спеціалізований патерновий детектор, що зіставляє текст із регуляризованими базами україномовних та англомовних LLM-кліше, враховуючи їх тільки у широкому фразовому контексті.</w:t>
+        <w:t>4. Вплив бібліографії та титульних даних — списки літератури та формальні титульні дані мають специфічний синтаксичний профіль, який за прямого аналізу спричиняє масові хибнопозитивні спрацьовування. Попередня ізоляція цих блоків є обов'язковою інженерною вимогою.</w:t>
       </w:r>
     </w:p>
     <w:p>
@@ -8079,7 +8079,7 @@
           <w:sz w:val="28"/>
           <w:szCs w:val="28"/>
         </w:rPr>
-        <w:t>Створення надійного AI-детектора пов'язане з фундаментальними теоретичними та практичними обмеженнями, які необхідно враховувати в архітектурі системи, щоб уникнути помилкових звинувачень авторів.</w:t>
+        <w:t>Розробка систем детекції стикається з фундаментальними обмеженнями, які обов'язково мають враховуватися для запобігання помилковим академічним звинуваченням.</w:t>
       </w:r>
     </w:p>
     <w:p>
@@ -8097,7 +8097,7 @@
           <w:sz w:val="28"/>
           <w:szCs w:val="28"/>
         </w:rPr>
-        <w:t>Революційне дослідження Ляна та співавторів (Liang et al., Stanford University, Patterns 2023) виявило систематичну упередженість (bias) комерційних AI-детекторів проти неносіїв англійської мови (Non-Native English Writers). Вчені перевірили роботи студентів з Китаю, країн Азії та Східної Європи і виявили, що комерційні детектори помилково маркували до 61.3% людських есе як «згенеровані ШІ». Причина полягає в тому, що автори з обмеженим словниковим запасом часто використовують простіші слова та синтаксичні конструкції з низькою перплексією, що алгоритми помилково інтерпретують як машинний стиль.</w:t>
+        <w:t>Дослідження Стенфордського університету (Liang et al., Patterns 2023) показало систематичну упередженість комерційних детекторів проти авторів, які пишуть нерідною мовою (Non-Native English Writers): до 61% людських робіт помилково класифікувалися як згенеровані ШІ через використання спрощеної лексики з низькою перплексією.</w:t>
       </w:r>
     </w:p>
     <w:p>
@@ -8115,7 +8115,7 @@
           <w:sz w:val="28"/>
           <w:szCs w:val="28"/>
         </w:rPr>
-        <w:t>Новітні міжнародні бенчмарки 2024–2026 років додатково підтверджують складність задачі:</w:t>
+        <w:t>Провідні відкриті бенчмарки останніх років підтверджують ці висновки:</w:t>
       </w:r>
     </w:p>
     <w:p>
@@ -8133,7 +8133,7 @@
           <w:sz w:val="28"/>
           <w:szCs w:val="28"/>
         </w:rPr>
-        <w:t>— RAID Benchmark (Dugan et al., ACL 2024) — найбільший відкритий бенчмарк (понад 6 млн текстів), що оцінив десятки детекторів в умовах парафраз-атак (paraphrase attacks). Дослідження показало, що якісний парафраз знижує точність сучасних детекторів на 35–50%.</w:t>
+        <w:t>— RAID Benchmark (Dugan et al., ACL 2024, вибірка 6 млн текстів): парафразування знижує точність відомих детекторів на 35–50%;</w:t>
       </w:r>
     </w:p>
     <w:p>
@@ -8151,7 +8151,7 @@
           <w:sz w:val="28"/>
           <w:szCs w:val="28"/>
         </w:rPr>
-        <w:t>— MULTITuDE (Macko et al., EMNLP 2023) — багатомовний бенчмарк на 11 мовах, який довів, що детектори, натреновані на англійській, демонструють високий розкид помилок на слов'янських мовах (зокрема українській).</w:t>
+        <w:t>— MULTITuDE (Macko et al., EMNLP 2023, 11 мов): перенесення моделей з англійської на слов'янські мови без адаптації викликає сплеск помилок;</w:t>
       </w:r>
     </w:p>
     <w:p>
@@ -8169,7 +8169,7 @@
           <w:sz w:val="28"/>
           <w:szCs w:val="28"/>
         </w:rPr>
-        <w:t>— Дослідження Mukherjee et al. (EACL 2026) та Shportko &amp; Verbitsky (NAACL 2025) показали, що пряме використання числового відсотка AI як міри вини є неприпустимим без врахування довірчого інтервалу та контекстуальної надійності.</w:t>
+        <w:t>— Mukherjee et al. (EACL 2026): безапеляційне застосування одного відсотка ШІ без розрахунку довірчого інтервалу є методологічно неприпустимим.</w:t>
       </w:r>
     </w:p>
     <w:p>
@@ -8187,7 +8187,7 @@
           <w:sz w:val="28"/>
           <w:szCs w:val="28"/>
         </w:rPr>
-        <w:t>Саме тому в системі «Незбіг» закладено принципову філософію: відмова від чорноящикових безапеляційних вердиктів. Система розглядає результат не як юридичний доказ, а як індикатор ризику (triage indicator), обов'язково доповнюючи його смугою невизначеності (±N п.п.), оцінкою надійності вибірки (Reliability Score) та підсвічуванням конкретних підозрілих сегментів для експертного розгляду викладачем.</w:t>
+        <w:t>З огляду на це, в системі «Незбіг» реалізовано концепцію індикатора ризику (triage indicator): числовий індекс завжди супроводжується смугою невизначеності (±N п.п.), оцінкою надійності вибірки (Reliability Score) та підсвічуванням конкретних текстових фрагментів.</w:t>
       </w:r>
     </w:p>
     <w:p>
@@ -8224,7 +8224,7 @@
           <w:sz w:val="28"/>
           <w:szCs w:val="28"/>
         </w:rPr>
-        <w:t>1. Проведений аналіз предметної області показав, що масове впровадження генеративного штучного інтелекту створило якісно новий виклик для академічної доброчесності: традиційні системи виявлення плагіату не спроможні ідентифікувати синтетичний текст через відсутність прямих текстових збігів.</w:t>
+        <w:t>1. Досліджено предметну область і встановлено, що генеративні мовні моделі створюють семантично зв'язний текст без прямих лексичних збігів, що вимагає комбінування пошуку запозичень зі стилометричним аналізом авторського стилю.</w:t>
       </w:r>
     </w:p>
     <w:p>
@@ -8242,7 +8242,7 @@
           <w:sz w:val="28"/>
           <w:szCs w:val="28"/>
         </w:rPr>
-        <w:t>2. Критичний аналіз існуючих аналогів (Turnitin, Unicheck, GPTZero, CopyLeaks) виявив їхню високу вартість, закритість алгоритмів, незадовільну роботу з україномовним контентом та небезпечну схильність до хибнопозитивних звинувачень авторів.</w:t>
+        <w:t>2. Виявлено технічні недоліки існуючих комерційних рішень (Turnitin, GPTZero, CopyLeaks): висока вартість, закритість алгоритмів, відсутність підтримки української мови та високий рівень хибнопозитивних спрацьовувань.</w:t>
       </w:r>
     </w:p>
     <w:p>
@@ -8260,7 +8260,7 @@
           <w:sz w:val="28"/>
           <w:szCs w:val="28"/>
         </w:rPr>
-        <w:t>3. Теоретично обґрунтовано використання алгоритму Winnowing для стійкого до вставок документно-орієнтованого фінгерпринтингу та оптимізованого розрідженого динамічного програмування для виявлення найдовшого неперервного спільного фрагмента (Longest Run).</w:t>
+        <w:t>3. Теоретично обґрунтовано застосування комбінованого containment, алгоритму Winnowing з поліноміальним хешуванням Рабіна-Карпа та розрідженого динамічного програмування для виявлення найдовшого спільного фрагмента (Longest Run) за час O(N + K).</w:t>
       </w:r>
     </w:p>
     <w:p>
@@ -8278,7 +8278,7 @@
           <w:sz w:val="28"/>
           <w:szCs w:val="28"/>
         </w:rPr>
-        <w:t>4. Доведено переваги ковзного показника MATTR над класичним TTR для усунення залежності від обсягу тексту та обґрунтовано використання коефіцієнта варіації довжини речень (Burstiness CV) як ключового стилометричного маркера синтаксичного ритму.</w:t>
+        <w:t>4. Доведено переваги інваріантного до довжини показника MATTR та обґрунтовано використання коефіцієнта варіації довжини речень (Burstiness CV), трискладових переліків і діалектичного хеджування як надійних ознак штучної генерації.</w:t>
       </w:r>
     </w:p>
     <w:p>
@@ -8296,7 +8296,7 @@
           <w:sz w:val="28"/>
           <w:szCs w:val="28"/>
         </w:rPr>
-        <w:t>5. Сформульовано фундаментальну концепцію системи «Незбіг»: поєднання 5-факторного зваженого пошуку плагіату у відкритих вебіндексах з детермінованим пояснюваним стилометричним AI-ансамблем, що функціонує в пам'яті без передачі конфіденційних даних.</w:t>
+        <w:t>5. Сформульовано архітектурні засади системи «Незбіг»: багатопровайдерний збір кандидатів (Tavily, Serper, DuckDuckGo, Semantic Scholar, OpenAlex), детермінований локальний стилометричний аналіз у пам'яті та пояснюваність вердиктів з динамічною смугою невизначеності.</w:t>
       </w:r>
     </w:p>
     <w:p>
@@ -8357,7 +8357,7 @@
           <w:sz w:val="28"/>
           <w:szCs w:val="28"/>
         </w:rPr>
-        <w:t>Під час проєктування системи «Незбіг» ключовим інженерним завданням було забезпечення високої продуктивності, модульності, відмовостійкості та збереження приватності користувацьких даних у середовищі хмарного serverless-розгортання. Архітектура системи базується на сучасній дворівневій моделі, що поєднує клієнтський односторінковий застосунок (Single Page Application, SPA) та безсерверний REST API шлюз.</w:t>
+        <w:t>Проєктування архітектури вебсистеми «Незбіг» підпорядковане вимогам високої обчислювальної продуктивності, модульності, відмовостійкості зовнішніх інтеграцій та збереження конфіденційності користувацьких даних у безсерверному середовищі (Serverless). Система базується на дворівневій архітектурній моделі, яка включає клієнтський односторінковий застосунок (Single Page Application, SPA) та безсерверний шлюз REST API.</w:t>
       </w:r>
     </w:p>
     <w:p>
@@ -8375,7 +8375,7 @@
           <w:sz w:val="28"/>
           <w:szCs w:val="28"/>
         </w:rPr>
-        <w:t>До системи висунуто такі основні функціональні та нефункціональні вимоги:</w:t>
+        <w:t>До архітектури системи висунуто такі ключові вимоги:</w:t>
       </w:r>
     </w:p>
     <w:p>
@@ -8393,7 +8393,7 @@
           <w:sz w:val="28"/>
           <w:szCs w:val="28"/>
         </w:rPr>
-        <w:t>1. Підтримка поліморфних вхідних даних: система повинна приймати текст через буфер обміну, а також файли популярних офіційних форматів: DOCX (Office Open XML), PDF, RTF, TXT, CSV, JSON, Markdown обсягом до 50 МБ.</w:t>
+        <w:t>1. Поліморфізм вхідних форматів: приймання тексту безпосередньо з буфера обміну та завантаження файлів офіційних форматів DOCX (Office Open XML), PDF, RTF, TXT, CSV, JSON, Markdown обсягом до 50 МБ;</w:t>
       </w:r>
     </w:p>
     <w:p>
@@ -8411,7 +8411,7 @@
           <w:sz w:val="28"/>
           <w:szCs w:val="28"/>
         </w:rPr>
-        <w:t>2. Принцип обробки даних у пам'яті (Zero-Disk Architecture): завантажені документи обробляються виключно в оперативній пам'яті у вигляді бінарних буферів (Buffer) і не зберігаються на фізичному накопичувачі сервера. Це гарантує повну конфіденційність наукових робіт і відповідність регламентам GDPR.</w:t>
+        <w:t>2. Архітектура обробки виключно в оперативній пам'яті (Zero-Disk Architecture): документи парсяться та аналізуються як бінарні буфери (Node.js Buffer) без збереження тимчасових файлів на фізичний диск сервера, що забезпечує відповідність GDPR;</w:t>
       </w:r>
     </w:p>
     <w:p>
@@ -8429,7 +8429,7 @@
           <w:sz w:val="28"/>
           <w:szCs w:val="28"/>
         </w:rPr>
-        <w:t>3. Робота в умовах часових обмежень Serverless: алгоритми аналізу мають завершувати базову перевірку в межах ліміту 300 секунд, встановленого платформою Vercel Functions для плану Hobby/Pro.</w:t>
+        <w:t>3. Обмеження часового вікна Serverless: алгоритми аналізу мають завершувати повний цикл обробки в межах 300 секунд (ліміт Vercel Functions);</w:t>
       </w:r>
     </w:p>
     <w:p>
@@ -8447,7 +8447,7 @@
           <w:sz w:val="28"/>
           <w:szCs w:val="28"/>
         </w:rPr>
-        <w:t>4. Відмовостійкість зовнішніх інтеграцій: збої або лімітування запитів окремими пошуковими системами не повинні зупиняти загальний процес перевірки документа.</w:t>
+        <w:t>4. Відмовостійкість зовнішніх пошукових API: збої або вичерпання квот окремих провайдерів не повинні зупиняти процес перевірки;</w:t>
       </w:r>
     </w:p>
     <w:p>
@@ -8465,7 +8465,7 @@
           <w:sz w:val="28"/>
           <w:szCs w:val="28"/>
         </w:rPr>
-        <w:t>5. Пояснюваність результатів (Explainable AI): кожен числовий індикатор плагіату чи AI-ознак повинен підтверджуватися детальним картографуванням сегментів тексту, знайденими URL-посиланнями та лінгвістичними метриками.</w:t>
+        <w:t>5. Пояснюваність результатів (Explainable AI): кожен розрахований індикатор плагіату чи AI-ризику повинен підтверджуватися сегментним картографуванням тексту, знайденими джерелами та об'єктивними лінгвістичними показниками.</w:t>
       </w:r>
     </w:p>
     <w:p>
@@ -8543,7 +8543,7 @@
           <w:sz w:val="28"/>
           <w:szCs w:val="28"/>
         </w:rPr>
-        <w:t>Як продемонстровано на рис. 2.1, потік обробки починається з користувацького інтерфейсу на базі React 19, який взаємодіє з сервером через захищені REST-маршрути. Серверний рівень на базі Express 5 оркеструє препроцесинг, паралельний запуск пошукових провайдерів, локальний стилометричний аналіз та кешування, агрегуючи підсумковий звіт для передачі назад у клієнтський компонент ReportView.</w:t>
+        <w:t>Як показано на рис. 2.1, взаємодія починається в інтерфейсі на базі React 19. Клієнт взаємодіє з сервером Express 5 через типізовані REST-ендпоінти. Сервер координує препроцесинг тексту, паралельні пошукові виклики, локальну детерміновану стилометрію та формує структурований звіт для візуалізації в компоненті ReportView.</w:t>
       </w:r>
     </w:p>
     <w:p>
@@ -8580,7 +8580,7 @@
           <w:sz w:val="28"/>
           <w:szCs w:val="28"/>
         </w:rPr>
-        <w:t>Якість та об'єктивність аналізу тексту критично залежать від етапу попередньої обробки (Preprocessing). Реальні студентські дипломні та курсові роботи з інженерії програмного забезпечення містять фрагменти, аналіз яких традиційними методами спотворює результати:</w:t>
+        <w:t>Об'єктивність аналізу тексту безпосередньо визначається якістю попередньої обробки (Preprocessing). Студентські роботи з інженерії програмного забезпечення містять специфічні структурні секції, прямий аналіз яких призводить до фатальних викривлень результату:</w:t>
       </w:r>
     </w:p>
     <w:p>
@@ -8598,7 +8598,7 @@
           <w:sz w:val="28"/>
           <w:szCs w:val="28"/>
         </w:rPr>
-        <w:t>а) програмний код (лістинги мов C++, Java, TypeScript, SQL, JSON) — комп'ютерні програми мають специфічний синтаксис, який за стилометрією помилково інтерпретується як машинний текст через низьку перплексію та повторюваність;</w:t>
+        <w:t>а) фрагменти програмного коду (лістинги C++, Java, TypeScript, SQL, JSON) — мають низьку перплексію та повторювані конструкції, через що стилометричний модуль помилково класифікує їх як машинний текст;</w:t>
       </w:r>
     </w:p>
     <w:p>
@@ -8616,7 +8616,7 @@
           <w:sz w:val="28"/>
           <w:szCs w:val="28"/>
         </w:rPr>
-        <w:t>б) службова титульна частина та індивідуальне завдання — містять стандартизовані формули наказів, прізвища та назви кафедр;</w:t>
+        <w:t>б) службова титульна частина та індивідуальне завдання — містять стандартні накази, посади та реквізити навчального закладу;</w:t>
       </w:r>
     </w:p>
     <w:p>
@@ -8634,7 +8634,7 @@
           <w:sz w:val="28"/>
           <w:szCs w:val="28"/>
         </w:rPr>
-        <w:t>в) бібліографічний список (список використаних джерел) — складається з бібліографічних описів за ДСТУ, які природно мають 100% текстовий збіг в інтернеті та монотонний синтаксичний ритм;</w:t>
+        <w:t>в) бібліографічний список (список використаних джерел) — складається з бібліографічних описів за ДСТУ, які природно мають 100% текстовий збіг в інтернет-джерелах і низьку варіацію довжини речень;</w:t>
       </w:r>
     </w:p>
     <w:p>
@@ -8652,7 +8652,7 @@
           <w:sz w:val="28"/>
           <w:szCs w:val="28"/>
         </w:rPr>
-        <w:t>г) прямі авторські цитати в лапках — характеризують стиль первинного джерела, а не автора роботи.</w:t>
+        <w:t>г) прямі цитати в лапках — характеризують стиль цитованого автора, а не автора дослідження.</w:t>
       </w:r>
     </w:p>
     <w:p>
@@ -8670,7 +8670,7 @@
           <w:sz w:val="28"/>
           <w:szCs w:val="28"/>
         </w:rPr>
-        <w:t>Для розв'язання цих проблем у системі розроблено модулі `documentPreprocess.ts` та `proseFilter.ts`. Препроцесор виконує автоматичне відсікання блоків коду за допомогою синтаксичного аналізатора, розпізнає fenced code blocks, структури класів, функції та імпорти. Далі алгоритм шукає семантичні маркери початку основної частини роботи: «ЗМІСТ», «ВСТУП», «РОЗДІЛ 1» або англомовний маркер «INTRODUCTION». Службові дані титулу вилучаються з пошукового контуру.</w:t>
+        <w:t>Для ізоляції цих артефактів розроблено модулі `documentPreprocess.ts` та `proseFilter.ts`. Синтаксичний аналізатор коду ідентифікує fenced code blocks, ключові слова мов програмування (`class`, `interface`, `function`, `import`, `export`, `SELECT`, `WHERE`), оператори та відступи. Спеціальний алгоритм виявляє семантичний початок основної частини роботи (заголовки «ВСТУП», «ЗМІСТ», «РОЗДІЛ 1», «INTRODUCTION»), відсікаючи титульні аркуші.</w:t>
       </w:r>
     </w:p>
     <w:p>
@@ -8688,7 +8688,7 @@
           <w:sz w:val="28"/>
           <w:szCs w:val="28"/>
         </w:rPr>
-        <w:t>Спеціалізований парсер відсікає бібліографічний хвіст після заголовків «СПИСОК ВИКОРИСТАНИХ ДЖЕРЕЛ», «ЛІТЕРАТУРА» або «REFERENCES». Усі вилучені елементи не відкидаються безслідно: система підраховує кількість вилучених слів і фіксує їх у структурі aiExclusions (роздільно за категоріями codeWords, referenceWords, quotedWords, analyzedWords), відображаючи ці дані у фінальному звіті для забезпечення прозорості.</w:t>
+        <w:t>Парсер бібліографії відсікає фінальний блок після маркерів «СПИСОК ВИКОРИСТАНИХ ДЖЕРЕЛ», «СПИСОК ДЖЕРЕЛ», «ЛІТЕРАТУРА», «REFERENCES». Усі вилучені сутності обліковуються в структурі `aiExclusions` за категоріями: `codeWords`, `referenceWords`, `quotedWords`, `analyzedWords`. Кількість вилучених слів обов'язково відображається у фінальному звіті перевірки.</w:t>
       </w:r>
     </w:p>
     <w:p>
@@ -8725,7 +8725,7 @@
           <w:sz w:val="28"/>
           <w:szCs w:val="28"/>
         </w:rPr>
-        <w:t>Перевірка об'ємного документа вимагає його розбиття на пошукові фрагменти (chunks). Наївний підхід розбиття на фіксовані блоки без перекриття має фатальний дефект: якщо плагійований уривок розташований на межі двох блоків, жоден із них не зможе сформувати повну пошукову фразу, і плагіат не буде знайдено.</w:t>
+        <w:t>Пошук текстових запозичень для великого документа потребує розбиття на пошукові фрагменти (chunks). Простий поділ на блоки без перекриття непридатний: якщо запозичений уривок перетинає межу двох блоків, жоден із них не зможе сформувати повну пошукову фразу.</w:t>
       </w:r>
     </w:p>
     <w:p>
@@ -8743,7 +8743,7 @@
           <w:sz w:val="28"/>
           <w:szCs w:val="28"/>
         </w:rPr>
-        <w:t>У системі «Незбіг» спроєктовано алгоритм повного перекривного фрагментування (Sliding Overlap Chunking). Текст розбивається на фрагменти розміром chunkWords (за замовчуванням 120–220 слів залежно від режиму) з коефіцієнтом перекриття близько 18% (overlapWords ≈ 0,18 · chunkWords). Кількість фрагментів та крок зміщення вікна обчислюються за формулами:</w:t>
+        <w:t>У системі «Незбіг» застосовано алгоритм ковзного перекривного фрагментування (Sliding Overlap Chunking). Текст розбивається на фрагменти розміром chunkWords (120–220 слів) з фіксованим перекриттям близько 18% (overlapWords ≈ 0,18 · chunkWords). Параметри розраховуються за формулами:</w:t>
       </w:r>
     </w:p>
     <w:tbl>
@@ -8969,7 +8969,7 @@
           <w:sz w:val="28"/>
           <w:szCs w:val="28"/>
         </w:rPr>
-        <w:t>Для кожного отриманого фрагмента конвеєр (рис. 2.2) генерує набір географічно розподілених пошукових запитів. Замість простого взяття першого речення, модуль `chunking.ts`:</w:t>
+        <w:t>Для кожного виділеного фрагмента конвеєр (рис. 2.2) генерує оптимізовані пошукові запити через модуль `chunking.ts`:</w:t>
       </w:r>
     </w:p>
     <w:p>
@@ -8987,7 +8987,7 @@
           <w:sz w:val="28"/>
           <w:szCs w:val="28"/>
         </w:rPr>
-        <w:t>1. ділить фрагмент на чотири квадранти (чверті);</w:t>
+        <w:t>1. фрагмент ділиться на чотири чверті (квадранти);</w:t>
       </w:r>
     </w:p>
     <w:p>
@@ -9005,7 +9005,7 @@
           <w:sz w:val="28"/>
           <w:szCs w:val="28"/>
         </w:rPr>
-        <w:t>2. у кожному квадранті аналізує кандидатні фрази довжиною 6–9 слів, оцінюючи їх за інформативністю (середня довжина токенів, наявність спеціальних термінів, цифр та низька частотність у загальновживаному словнику);</w:t>
+        <w:t>2. у кожному квадранті відбираються кандидатні фрази довжиною 6–9 слів, оцінені за інформативністю (середня довжина токенів, наявність спеціальної термінології, цифр та низька частотність у загальному словнику);</w:t>
       </w:r>
     </w:p>
     <w:p>
@@ -9023,7 +9023,7 @@
           <w:sz w:val="28"/>
           <w:szCs w:val="28"/>
         </w:rPr>
-        <w:t>3. формує точні запити у лапках ("...") для виявлення дослівно скопійованих речень;</w:t>
+        <w:t>3. формуються точні запити в лапках ("...") для виявлення дослівно скопійованих речень;</w:t>
       </w:r>
     </w:p>
     <w:p>
@@ -9041,7 +9041,7 @@
           <w:sz w:val="28"/>
           <w:szCs w:val="28"/>
         </w:rPr>
-        <w:t>4. синтезує комбінований запит із найбільш вагомих ключових слів для виявлення перефразованих джерел.</w:t>
+        <w:t>4. синтезується комбінований запит із ключових термінів для знаходження перефразованих джерел.</w:t>
       </w:r>
     </w:p>
     <w:p>
@@ -9078,7 +9078,7 @@
           <w:sz w:val="28"/>
           <w:szCs w:val="28"/>
         </w:rPr>
-        <w:t>Жодна окрема пошукова система не містить повного відкритого індексу наукових та освітніх публікацій. Тому «Незбіг» інтегрує чотири незалежні джерела відкритих даних:</w:t>
+        <w:t>Жодна окрема пошукова система не покриває весь спектр вебпублікацій та наукових репозиторіїв. Крім того, прямі HTTP-запити до вебсторінок піддаються блокуванню захисними механізмами Cloudflare та капчами. Тому «Незбіг» об'єднує п'ять взаємодоповнюючих провайдерів пошуку:</w:t>
       </w:r>
     </w:p>
     <w:p>
@@ -9096,7 +9096,7 @@
           <w:sz w:val="28"/>
           <w:szCs w:val="28"/>
         </w:rPr>
-        <w:t>1. DuckDuckGo HTML Engine — базовий швидкий відкритий вебіндекс, що функціонує без обов'язкових API-ключів;</w:t>
+        <w:t>1. Tavily Search API — спеціалізований пошуковий рушій для автономних агентів та систем аналізу текстів, оптимізований для отримання чистого контенту вебсторінок без блокувань та капч;</w:t>
       </w:r>
     </w:p>
     <w:p>
@@ -9114,7 +9114,7 @@
           <w:sz w:val="28"/>
           <w:szCs w:val="28"/>
         </w:rPr>
-        <w:t>2. Google Custom Search API — високоточний пошуковий індекс за наявності сервісного ключа;</w:t>
+        <w:t>2. Serper API — швидкісний Google Search API, що забезпечує доступ до індексу Google без ризику блокування IP-адрес сервера;</w:t>
       </w:r>
     </w:p>
     <w:p>
@@ -9132,7 +9132,7 @@
           <w:sz w:val="28"/>
           <w:szCs w:val="28"/>
         </w:rPr>
-        <w:t>3. Semantic Scholar API — провідна міжнародна база наукових рецензованих статей (Allen Institute for AI), яка залучається в глибокому режимі для зіставлення з академічними публікаціями;</w:t>
+        <w:t>3. DuckDuckGo Lite — відкритий резервний вебіндекс швидкої дії, що функціонує без обов'язкових ключів доступу;</w:t>
       </w:r>
     </w:p>
     <w:p>
@@ -9150,7 +9150,7 @@
           <w:sz w:val="28"/>
           <w:szCs w:val="28"/>
         </w:rPr>
-        <w:t>4. OpenAlex API — глобальний каталог відкритих наукових праць. Система відновлює повні наукові анотації з поля `abstract_inverted_index` та використовує канонічні DOI для формування прямих посилань на першоджерела.</w:t>
+        <w:t>4. Semantic Scholar API — провідний каталог наукових публікацій (Allen Institute for AI), що використовується в режимі академічного сканування;</w:t>
       </w:r>
     </w:p>
     <w:p>
@@ -9168,7 +9168,7 @@
           <w:sz w:val="28"/>
           <w:szCs w:val="28"/>
         </w:rPr>
-        <w:t>Для забезпечення надійності в умовах мережевої нестабільності та обмежень пропускної здатності (Rate Limiting) спроєктовано планувальник `providerTaskScheduler.ts` та патерн Circuit Breaker. Запити до провайдерів розподіляються через асинхронну чергу з обмеженням конкурентності (не більше 3 паралельних HTTP-запитів до одного провайдера).</w:t>
+        <w:t>5. OpenAlex Scholarly Database — глобальна відкрита база наукових праць. Система відновлює повні наукові анотації з поля `abstract_inverted_index` та отримує прямі DOI-посилання.</w:t>
       </w:r>
     </w:p>
     <w:p>
@@ -9186,7 +9186,7 @@
           <w:sz w:val="28"/>
           <w:szCs w:val="28"/>
         </w:rPr>
-        <w:t>Патерн Circuit Breaker функціонує за такою кінцевою автоматною моделлю:</w:t>
+        <w:t>Для захисту від перевантажень і таймаутів спроєктовано планувальник `providerTaskScheduler.ts` та автоматний патерн Circuit Breaker. Запити до провайдерів виконуються через чергу з лімітом конкурентності (не більше 3 одночасних запитів до одного сервісу).</w:t>
       </w:r>
     </w:p>
     <w:p>
@@ -9204,7 +9204,7 @@
           <w:sz w:val="28"/>
           <w:szCs w:val="28"/>
         </w:rPr>
-        <w:t>— Стан Closed (Норма): усі запити виконуються у штатному режимі. Ведеться підрахунок невдалих відповідей (таймаути, коди 429, 503).</w:t>
+        <w:t>Патерн Circuit Breaker функціонує за такою кінцево-автоматною схемою:</w:t>
       </w:r>
     </w:p>
     <w:p>
@@ -9222,7 +9222,7 @@
           <w:sz w:val="28"/>
           <w:szCs w:val="28"/>
         </w:rPr>
-        <w:t>— Стан Open (Ізоляція): якщо один провайдер повертає 3 послідовні помилки поспіль, автоматичний вимикач розмикає ланцюг на 60 секунд. Усі подальші чергові запити до цього провайдера негайно відхиляються або перенаправляються іншим провайдерам, запобігаючи марнуванню часу Vercel-функції.</w:t>
+        <w:t>— Closed (Норма): усі запити виконуються штатно. Фіксується кількість послідовних помилок (коди 429, 503, таймаути);</w:t>
       </w:r>
     </w:p>
     <w:p>
@@ -9240,7 +9240,7 @@
           <w:sz w:val="28"/>
           <w:szCs w:val="28"/>
         </w:rPr>
-        <w:t>— Стан Half-Open (Пробний): після завершення 60-секундного таймуту один тестовий запит пропускається до провайдера. У разі успіху автомат повертається в Closed, інакше таймер скидання запускається повторно.</w:t>
+        <w:t>— Open (Ізоляція): при фіксації 3 послідовних збоїв автомат розмикає ланцюг на 60 секунд. Нові запити до цього провайдера негайно відхиляються або переспрямовуються іншим провайдерам каскаду;</w:t>
       </w:r>
     </w:p>
     <w:p>
@@ -9258,7 +9258,25 @@
           <w:sz w:val="28"/>
           <w:szCs w:val="28"/>
         </w:rPr>
-        <w:t>Для оптимізації трафіку застосовується двоетапна гідратація (Two-phase hydration). На першому етапі система швидко збирає кандидатні URL від усіх провайдерів. На другому етапі сервер завантажує повний HTML-вміст лише для найперспективніших сторінок. Бібліотека Cheerio виділяє смисловий текст із тегів `&lt;article&gt;`, `&lt;main&gt;` або `&lt;body&gt;`, відкидаючи скрипти, стилі, форми авторизації та навігаційні меню сайту.</w:t>
+        <w:t>— Half-Open (Тестування): після завершення таймуту один тестовий запит пропускається до провайдера. У разі успішної відповіді автомат повертається в Closed, інакше таймер ізоляції скидається знову.</w:t>
+      </w:r>
+    </w:p>
+    <w:p>
+      <w:pPr>
+        <w:spacing w:line="360" w:lineRule="auto" w:after="0" w:before="0"/>
+        <w:ind w:firstLine="709"/>
+        <w:jc w:val="both"/>
+      </w:pPr>
+      <w:r>
+        <w:rPr>
+          <w:rFonts w:ascii="Times New Roman" w:hAnsi="Times New Roman" w:cs="Times New Roman" w:eastAsia="Times New Roman"/>
+          <w:b w:val="0"/>
+          <w:i w:val="0"/>
+          <w:color w:val="000000"/>
+          <w:sz w:val="28"/>
+          <w:szCs w:val="28"/>
+        </w:rPr>
+        <w:t>Для мінімізації трафіку реалізовано двоетапну верифікацію (Two-phase hydration). Спочатку збираються лише посилання від усіх провайдерів. Потім сервер вибірково завантажує повний HTML тільки для найперспективніших сторінок. Парсер Cheerio виділяє смисловий текст із тегів `&lt;article&gt;`, `&lt;main&gt;`, `&lt;p&gt;`, відкидаючи шапки, меню, скрипти та рекламу.</w:t>
       </w:r>
     </w:p>
     <w:p>
@@ -9295,7 +9313,7 @@
           <w:sz w:val="28"/>
           <w:szCs w:val="28"/>
         </w:rPr>
-        <w:t>Центральним елементом аналітичного ядра є авторська математична модель 5-факторного зваженого скорингу схожості між фрагментом документа та верифікованою вебсторінкою. На відміну від примітивного посимвольного порівняння, модель інтегрує п'ять ортогональних метрик:</w:t>
+        <w:t>Для точного зіставлення фрагмента документа та верифікованої вебсторінки розроблено математичну модель 5-факторного зваженого скорингу, яка об'єднує п'ять ортогональних показників:</w:t>
       </w:r>
     </w:p>
     <w:tbl>
@@ -9387,7 +9405,7 @@
           <w:sz w:val="28"/>
           <w:szCs w:val="28"/>
         </w:rPr>
-        <w:t>де складові формули мають такий фізичний зміст:</w:t>
+        <w:t>де змінні формули мають такий зміст:</w:t>
       </w:r>
     </w:p>
     <w:p>
@@ -9441,7 +9459,7 @@
           <w:sz w:val="28"/>
           <w:szCs w:val="28"/>
         </w:rPr>
-        <w:t>3. S_lcs (Longest Common Run Score) — нормалізована оцінка найдовшого нерозривного ланцюжка слів, знайденого алгоритмом розрідженого динамічного програмування (S_lcs = min(1.0, L_run / 25));</w:t>
+        <w:t>3. S_lcs (Longest Common Run Score) — нормалізована оцінка найдовшого нерозривного ланцюжка слів, розрахованого алгоритмом розрідженого динамічного програмування (S_lcs = min(1.0, L_run / 25));</w:t>
       </w:r>
     </w:p>
     <w:p>
@@ -9459,7 +9477,7 @@
           <w:sz w:val="28"/>
           <w:szCs w:val="28"/>
         </w:rPr>
-        <w:t>4. W_ov (Winnowing Fingerprints Overlap) — частка збігу стабільних хеш-відбитків документа;</w:t>
+        <w:t>4. W_ov (Winnowing Fingerprints Overlap) — частка збігу цифрових відбитків документа;</w:t>
       </w:r>
     </w:p>
     <w:p>
@@ -9495,7 +9513,7 @@
           <w:sz w:val="28"/>
           <w:szCs w:val="28"/>
         </w:rPr>
-        <w:t>6. β_page — коефіцієнт верифікації сторінки. Якщо сервер успішно завантажив і прочитав повний HTML сторінки, β_page = 1,0 (confidence = page). Якщо ж сторінка недоступна, заблокована захистом Cloudflare або був отриманий лише пошуковий сніпет, β_page = 0,0 (confidence = snippet).</w:t>
+        <w:t>6. β_page — коефіцієнт верифікації сторінки. Якщо повний HTML сторінки успішно прочитано, β_page = 1,0 (confidence = page). Якщо сторінка заблокована захистом Cloudflare або отримано лише короткий пошуковий сніпет, β_page = 0,0 (confidence = snippet).</w:t>
       </w:r>
     </w:p>
     <w:p>
@@ -9573,7 +9591,7 @@
           <w:sz w:val="28"/>
           <w:szCs w:val="28"/>
         </w:rPr>
-        <w:t>Правило β_page = 0,0 для сніпетів є критично важливим інженерним запобіжником: воно повністю захищає користувача від ситуації, коли пошукова система просто повторила слова промпту у вихідному сніпеті, а реальний текст сторінки не містить матеріалу роботи. Фінальний бал плагіату документа обчислюється агрегацією до восьми найсильніших підтверджених джерел.</w:t>
+        <w:t>Правило нульової ваги сніпетів (β_page = 0,0) виступає надійним запобіжником: воно виключає випадки, коли пошуковик просто скопіював слова пошукового запиту в опис сайту, тоді як на самій сторінці матеріалу немає. Загальний бал плагіату розраховується агрегацією до восьми підтверджених джерел.</w:t>
       </w:r>
     </w:p>
     <w:p>
@@ -9592,7 +9610,7 @@
           <w:sz w:val="28"/>
           <w:szCs w:val="28"/>
         </w:rPr>
-        <w:t>2.6. Трьохканальний локальний ансамбль AI-аналізу та метрика надійності</w:t>
+        <w:t>2.6. Триканальний детермінований ансамбль AI-аналізу та метрика надійності</w:t>
       </w:r>
     </w:p>
     <w:p>
@@ -9610,7 +9628,7 @@
           <w:sz w:val="28"/>
           <w:szCs w:val="28"/>
         </w:rPr>
-        <w:t>Для вирішення задачі детекції машинно згенерованого тексту в системі спроєктовано локальний евристичний ансамбль `aiStylometry.ts`. Ансамбль працює повністю детерміновано в межах Node.js середовища без обов'язкового виклику хмарних нейромереж, що забезпечує мілісекундну швидкість, нульову фінансову вартість запиту та повну конфіденційність.</w:t>
+        <w:t>Для виявлення штучно згенерованого контенту спроєктовано локальний триканальний детермінований ансамбль `aiStylometry.ts`. Ансамбль виконується безпосередньо в середовищі Node.js без обов'язкового виклику хмарних нейромереж, що гарантує швидкість, відсутність витрат на API-запити та повну приватність робіт.</w:t>
       </w:r>
     </w:p>
     <w:p>
@@ -9628,7 +9646,7 @@
           <w:sz w:val="28"/>
           <w:szCs w:val="28"/>
         </w:rPr>
-        <w:t>Весь підготовлений авторський текст розбивається на перекривні вікна по 220 слів з кроком 165 слів (overlap 55 слів). Останнє вікно жорстко прив'язується до кінця документа, щоб хвостові абзаци не втрачалися. Кожен сегмент незалежно оцінюється за трьома ізольованими каналами ознак:</w:t>
+        <w:t>Текст розбивається на ковзні сегменти по 220 слів із кроком 165 слів (перекриття 55 слів). Фінальний сегмент вирівнюється по кінцю тексту, щоб запобігти втраті останніх абзаців. Кожен сегмент паралельно оцінюється трьома каналами:</w:t>
       </w:r>
     </w:p>
     <w:p>
@@ -9646,7 +9664,7 @@
           <w:sz w:val="28"/>
           <w:szCs w:val="28"/>
         </w:rPr>
-        <w:t>1. Статистичний канал (Channel_stat, вага 0,38) — оцінює ковзне лексичне багатство MATTR, коефіцієнт варіації довжини речень (Burstiness CV) та циклічні повтори 4-грам.</w:t>
+        <w:t>1. Статистичний канал (Channel_stat, вага 0,38) — обчислює ковзний показник MATTR-500, коефіцієнт варіації довжини речень (Burstiness CV) та циклічні повтори 4-грам;</w:t>
       </w:r>
     </w:p>
     <w:p>
@@ -9664,7 +9682,7 @@
           <w:sz w:val="28"/>
           <w:szCs w:val="28"/>
         </w:rPr>
-        <w:t>2. Патерновий канал (Channel_pat, вага 0,42) — виявляє стійкі фразеологічні шаблони мовних моделей, hedging-конструкції, безособові узагальнення та артефакти генерації.</w:t>
+        <w:t>2. Патерновий канал (Channel_pat, вага 0,42) — виявляє трискладові паралельні переліки (tricolon parallelism), діалектичне хеджування («з одного боку... з іншого боку»), безособові фрази, одночасно фільтруючи тривіальний академічний боглерплейт;</w:t>
       </w:r>
     </w:p>
     <w:p>
@@ -9682,7 +9700,7 @@
           <w:sz w:val="28"/>
           <w:szCs w:val="28"/>
         </w:rPr>
-        <w:t>3. Структурний канал (Channel_struct, вага 0,20) — аналізує повторюваність початків речень, симетричність елементів списків та пунктуаційний профіль тексту.</w:t>
+        <w:t>3. Структурний канал (Channel_struct, вага 0,20) — оцінює синтаксичну симетрію списків, повторення початків речень та пунктуаційну рівномірність.</w:t>
       </w:r>
     </w:p>
     <w:p>
@@ -9742,7 +9760,7 @@
           <w:sz w:val="28"/>
           <w:szCs w:val="28"/>
         </w:rPr>
-        <w:t>Рис. 2.4 — Архітектура трьохканального стилометричного AI-ансамблю</w:t>
+        <w:t>Рис. 2.4 — Архітектура триканального стилометричного AI-ансамблю</w:t>
       </w:r>
     </w:p>
     <w:p>
@@ -9760,7 +9778,7 @@
           <w:sz w:val="28"/>
           <w:szCs w:val="28"/>
         </w:rPr>
-        <w:t>Інтегральний сегментний показник обчислюється з урахуванням множника взаємної узгодженості (Corroboration Multiplier γ):</w:t>
+        <w:t>Підсумковий сегментний показник розраховується з урахуванням коефіцієнта взаємної узгодженості (Corroboration Multiplier γ):</w:t>
       </w:r>
     </w:p>
     <w:tbl>
@@ -9852,7 +9870,7 @@
           <w:sz w:val="28"/>
           <w:szCs w:val="28"/>
         </w:rPr>
-        <w:t>де множник γ зростає лише тоді, коли аномальні сигнали одночасно виявлені у щонайменше двох незалежних каналах (γ = 1,15 для двох каналів, γ = 1,25 для трьох). Якщо активний лише один ізольований канал (наприклад, автор використав кілька сталих мовних зворотів), множник залишається рівним 1,0, що виключає false positive.</w:t>
+        <w:t>де множник γ зростає лише за одночасної активації щонайменше двох незалежних каналів (γ = 1,15 для двох, γ = 1,25 для трьох). Якщо аномалія виявлена лише в одному каналі (наприклад, автор вжив кілька усталених зворотів), γ = 1,0, що виключає хибнопозитивну реакцію.</w:t>
       </w:r>
     </w:p>
     <w:p>
@@ -9870,7 +9888,7 @@
           <w:sz w:val="28"/>
           <w:szCs w:val="28"/>
         </w:rPr>
-        <w:t>Підсумковий вердикт документа класифікується за шкалою з шести станів aiVerdict:</w:t>
+        <w:t>Підсумковий вердикт документа класифікується за шкалою з шести станів `aiVerdict`:</w:t>
       </w:r>
     </w:p>
     <w:p>
@@ -9888,7 +9906,7 @@
           <w:sz w:val="28"/>
           <w:szCs w:val="28"/>
         </w:rPr>
-        <w:t>— `insufficient` — обсяг тексту після очищення менше 80 слів (недостатньо для статистики, індикатор «—» замість хибних 0%);</w:t>
+        <w:t>— `insufficient` — обсяг тексту після очищення менше 80 слів (індикатор «—» замість хибних 0%);</w:t>
       </w:r>
     </w:p>
     <w:p>
@@ -9924,7 +9942,7 @@
           <w:sz w:val="28"/>
           <w:szCs w:val="28"/>
         </w:rPr>
-        <w:t>— `uncertain` — невизначений результат через обмежену надійність вибірки або суперечливі сигнали;</w:t>
+        <w:t>— `uncertain` — невизначений стан через недостатню надійність вибірки або суперечливі сигнали;</w:t>
       </w:r>
     </w:p>
     <w:p>
@@ -9942,7 +9960,7 @@
           <w:sz w:val="28"/>
           <w:szCs w:val="28"/>
         </w:rPr>
-        <w:t>— `mixed` — документ містить виражені локальні машинно-згенеровані фрагменти поруч із автентичними авторськими розділами;</w:t>
+        <w:t>— `mixed` — документ містить окремі згенеровані підрозділи поряд із автентичними авторськими частинами;</w:t>
       </w:r>
     </w:p>
     <w:p>
@@ -9978,7 +9996,7 @@
           <w:sz w:val="28"/>
           <w:szCs w:val="28"/>
         </w:rPr>
-        <w:t>— `high` — високий ризик машинної генерації у всіх трьох каналах аналізу.</w:t>
+        <w:t>— `high` — високий ризик машинної генерації за всіма трьома каналами.</w:t>
       </w:r>
     </w:p>
     <w:p>
@@ -9996,7 +10014,7 @@
           <w:sz w:val="28"/>
           <w:szCs w:val="28"/>
         </w:rPr>
-        <w:t>Разом із числовим балом система обчислює показник надійності (Reliability Score, 0..100) та евристичну смугу невизначеності (±N п.п.). Смуга автоматично розширюється, якщо документ короткий, мова викладу змішана або спостерігається великий статистичний розкид між сегментами.</w:t>
+        <w:t>Разом із числовим балом система розраховує показник надійності вибірки (Reliability Score, 0..100) та динамічну смугу невизначеності (±N п.п.), яка автоматично розширюється при малому обсязі документа або значному статистичному розкиді між сегментами.</w:t>
       </w:r>
     </w:p>
     <w:p>
@@ -10033,7 +10051,7 @@
           <w:sz w:val="28"/>
           <w:szCs w:val="28"/>
         </w:rPr>
-        <w:t>Поширеною вадою існуючих систем редагування стилю є руйнування складної типографіки Microsoft Word: після обробки стороннім сервісом користувач отримує звичайний неформатований текст або зіпсований HTML, де втрачено вихідні стилі заголовків, таблиці, розміри шрифтів та відступи.</w:t>
+        <w:t>Суттєвою проблемою багатьох редакторів стилю є пошкодження розмітки Microsoft Word: після обробки користувач отримує неформатований текст, де втрачено оригінальні шрифти, стилі заголовків, таблиці та відступи.</w:t>
       </w:r>
     </w:p>
     <w:p>
@@ -10051,7 +10069,7 @@
           <w:sz w:val="28"/>
           <w:szCs w:val="28"/>
         </w:rPr>
-        <w:t>У системі «Незбіг» спроєктовано інноваційний конвеєр синхронізованого двовекторного представлення документів (рис. 2.5). При завантаженні DOCX-файлу сервер за допомогою бібліотеки JSZip розпаковує пакет Office Open XML (OOXML). Формуються два ізольовані потоки:</w:t>
+        <w:t>У системі «Незбіг» створено конвеєр двовекторного представлення документів DOCX (рис. 2.5). При завантаженні файлу бібліотека JSZip розпаковує пакет Office Open XML (OOXML) на два ізольовані потоки:</w:t>
       </w:r>
     </w:p>
     <w:p>
@@ -10087,7 +10105,7 @@
           <w:sz w:val="28"/>
           <w:szCs w:val="28"/>
         </w:rPr>
-        <w:t>2. Структурне дерево `word/document.xml` — зберігає всі оригінальні вузли розмітки, стилів `&lt;w:pPr&gt;`, `&lt;w:rPr&gt;`, таблиць `&lt;w:tbl&gt;` та колонтитулів.</w:t>
+        <w:t>2. XML-дерево `word/document.xml` — зберігає вихідні вузли форматування `&lt;w:pPr&gt;`, `&lt;w:rPr&gt;`, таблиці `&lt;w:tbl&gt;` та колонтитули.</w:t>
       </w:r>
     </w:p>
     <w:p>
@@ -10165,7 +10183,79 @@
           <w:sz w:val="28"/>
           <w:szCs w:val="28"/>
         </w:rPr>
-        <w:t>Після внесення стилістичних правок модулем Humanizer сервер не перебудовує документ заново. Спеціалізований алгоритм `textAlignment.ts` здійснює лінійне токенне вирівнювання початкових та змінених слів. Замінені токени ін'єктуються безпосередньо у вихідні текстові вузли `&lt;w:t&gt;` OOXML-пакета через модуль `formattedDocx.ts`. Завдяки цьому кожне замінене слово автоматично успадковує колір, шрифт, кегль та накреслення початкового фрагмента, а вся пакетна структура Word зберігається зі 100% точністю.</w:t>
+        <w:t>Стилістичний редактор Text Humanizer підтримує три цільові режими роботи:</w:t>
+      </w:r>
+    </w:p>
+    <w:p>
+      <w:pPr>
+        <w:spacing w:line="360" w:lineRule="auto" w:after="0" w:before="0"/>
+        <w:ind w:firstLine="709"/>
+        <w:jc w:val="both"/>
+      </w:pPr>
+      <w:r>
+        <w:rPr>
+          <w:rFonts w:ascii="Times New Roman" w:hAnsi="Times New Roman" w:cs="Times New Roman" w:eastAsia="Times New Roman"/>
+          <w:b w:val="0"/>
+          <w:i w:val="0"/>
+          <w:color w:val="000000"/>
+          <w:sz w:val="28"/>
+          <w:szCs w:val="28"/>
+        </w:rPr>
+        <w:t>а) «Академічний» (Academic) — спрямований на строгий науковий стиль: замінює вступні мовні кліше, трансформує безособові пасивні звороти на активний суб'єктний стан, усуває надмірне хеджування;</w:t>
+      </w:r>
+    </w:p>
+    <w:p>
+      <w:pPr>
+        <w:spacing w:line="360" w:lineRule="auto" w:after="0" w:before="0"/>
+        <w:ind w:firstLine="709"/>
+        <w:jc w:val="both"/>
+      </w:pPr>
+      <w:r>
+        <w:rPr>
+          <w:rFonts w:ascii="Times New Roman" w:hAnsi="Times New Roman" w:cs="Times New Roman" w:eastAsia="Times New Roman"/>
+          <w:b w:val="0"/>
+          <w:i w:val="0"/>
+          <w:color w:val="000000"/>
+          <w:sz w:val="28"/>
+          <w:szCs w:val="28"/>
+        </w:rPr>
+        <w:t>б) «Природний» (Natural) — відновлює органічний живий темпоритм викладу шляхом регулювання варіативності довжини речень (Burstiness);</w:t>
+      </w:r>
+    </w:p>
+    <w:p>
+      <w:pPr>
+        <w:spacing w:line="360" w:lineRule="auto" w:after="0" w:before="0"/>
+        <w:ind w:firstLine="709"/>
+        <w:jc w:val="both"/>
+      </w:pPr>
+      <w:r>
+        <w:rPr>
+          <w:rFonts w:ascii="Times New Roman" w:hAnsi="Times New Roman" w:cs="Times New Roman" w:eastAsia="Times New Roman"/>
+          <w:b w:val="0"/>
+          <w:i w:val="0"/>
+          <w:color w:val="000000"/>
+          <w:sz w:val="28"/>
+          <w:szCs w:val="28"/>
+        </w:rPr>
+        <w:t>в) «Лаконічний» (Concise) — усуває тавтології, канцеляризми та зайві слова для досягнення максимальної щільності наукової думки.</w:t>
+      </w:r>
+    </w:p>
+    <w:p>
+      <w:pPr>
+        <w:spacing w:line="360" w:lineRule="auto" w:after="0" w:before="0"/>
+        <w:ind w:firstLine="709"/>
+        <w:jc w:val="both"/>
+      </w:pPr>
+      <w:r>
+        <w:rPr>
+          <w:rFonts w:ascii="Times New Roman" w:hAnsi="Times New Roman" w:cs="Times New Roman" w:eastAsia="Times New Roman"/>
+          <w:b w:val="0"/>
+          <w:i w:val="0"/>
+          <w:color w:val="000000"/>
+          <w:sz w:val="28"/>
+          <w:szCs w:val="28"/>
+        </w:rPr>
+        <w:t>Після генерації правок алгоритм `textAlignment.ts` виконує лінійне токенне вирівнювання початкових та змінених слів. Модуль `formattedDocx.ts` ін'єктує змінені слова безпосередньо у текстові теги `&lt;w:t&gt;`, не порушуючи контейнерів `&lt;w:rPr&gt;`. У результаті збережений документ повністю зберігає вихідне оформлення Microsoft Word.</w:t>
       </w:r>
     </w:p>
     <w:p>
@@ -10202,7 +10292,7 @@
           <w:sz w:val="28"/>
           <w:szCs w:val="28"/>
         </w:rPr>
-        <w:t>Для надання користувачеві додаткової незалежної експертної оцінки система підтримує функцію «AI-думка» (LLM Opinion). Щоб не сповільнювати формування базового звіту, запит до зовнішньої мовної моделі виконується повністю асинхронно в фоновому режимі після завершення локального аналізу.</w:t>
+        <w:t>Для надання користувачеві незалежної експертної оцінки передбачено додатковий модуль «AI-думка» (LLM Opinion). Щоб не блокувати видачу базового звіту, запит до зовнішньої мовної моделі виконується повністю асинхронно у фоні.</w:t>
       </w:r>
     </w:p>
     <w:p>
@@ -10220,7 +10310,7 @@
           <w:sz w:val="28"/>
           <w:szCs w:val="28"/>
         </w:rPr>
-        <w:t>Конвеєр звертається до агрегатора OpenRouter API (використовуючи модель Meta Llama 3.3 70B Instruct). У разі виникнення таймуту, помилки або вичерпання лімітів шлюз автоматично виконує каскадний перехід (fallback) на NVIDIA NIM API з моделями Mistral Large або Llama 3.1 70B. Модуль `llmShared.ts` формує оптимізований вхідний контекст для великих робіт: замість обрізки за лімітом символів, промпт компонує вибірку «вступний фрагмент + фінальний фрагмент + до трьох найбільш ризикових сегментів за результатами локальної стилометрії». Отримана експертна думка персиститься в базі даних звітів через метод `reportId`.</w:t>
+        <w:t>Конвеєр звертається до OpenRouter API (використовуючи модель Meta Llama 3.3 70B Instruct). У разі таймауту або перевищення квот відбувається каскадний перехід (fallback) на NVIDIA NIM API з моделями Mistral Large або Llama 3.1 70B. Промпт компонує оптимізовану репрезентативну вибірку: вступний фрагмент, фінальний фрагмент та до трьох найбільш ризикових сегментів за оцінкою локального аналізатора. Отримана думка зберігається в сховищі результатів перевірки за ідентифікатором звіту.</w:t>
       </w:r>
     </w:p>
     <w:p>
@@ -10257,7 +10347,7 @@
           <w:sz w:val="28"/>
           <w:szCs w:val="28"/>
         </w:rPr>
-        <w:t>1. Спроєктовано модульну клієнт-серверну архітектуру системи «Незбіг», оптимізовану для безсерверного середовища Vercel, що забезпечує обробку документів у пам'яті за принципом Zero-Disk з дотриманням вимог GDPR.</w:t>
+        <w:t>1. Спроєктовано модульну дворівневу архітектуру системи «Незбіг», адаптовану для безсерверного середовища Vercel Serverless, яка реалізує принцип обробки документів у пам'яті (Zero-Disk) для забезпечення конфіденційності даних.</w:t>
       </w:r>
     </w:p>
     <w:p>
@@ -10275,7 +10365,7 @@
           <w:sz w:val="28"/>
           <w:szCs w:val="28"/>
         </w:rPr>
-        <w:t>2. Розроблено конвеєр препроцесингу документів для фільтрації програмного коду, титульних аркушів та бібліографії з точним обліком вилучених слів у структурі aiExclusions.</w:t>
+        <w:t>2. Розроблено конвеєр препроцесингу документів для автоматичного відсікання коду, титульних аркушів та бібліографічних списків із роздільним обліком у структурі aiExclusions.</w:t>
       </w:r>
     </w:p>
     <w:p>
@@ -10293,7 +10383,7 @@
           <w:sz w:val="28"/>
           <w:szCs w:val="28"/>
         </w:rPr>
-        <w:t>3. Створено алгоритм перекривного фрагментування (Sliding Overlap Chunking) з 18% оверлапом та багатопровайдерну пошукову диспетчеризацію на базі патерну Circuit Breaker, що гарантує відмовостійкість при збоях окремих пошукових систем.</w:t>
+        <w:t>3. Створено алгоритм перекривного фрагментування (Sliding Overlap Chunking) з 18% оверлапом та багатопровайдерний пошуковий шлюз (Tavily, Serper, DuckDuckGo, Semantic Scholar, OpenAlex) із захистом від відмов за патерном Circuit Breaker.</w:t>
       </w:r>
     </w:p>
     <w:p>
@@ -10311,7 +10401,7 @@
           <w:sz w:val="28"/>
           <w:szCs w:val="28"/>
         </w:rPr>
-        <w:t>4. Розроблено математичну модель 5-факторного зваженого скорингу текстових збігів, що інтегрує winnowing-фінгерпринти, фразовий оверлап та розріджене динамічне програмування для виявлення Longest Common Run з відсіканням непідтверджених сніпетів.</w:t>
+        <w:t>4. Розроблено модель 5-факторного зваженого скорингу, яка поєднує winnowing-відбитки, n-грамне покриття, розріджене динамічне програмування для знаходження Longest Common Run та нульову вагу неперевірених сніпетів.</w:t>
       </w:r>
     </w:p>
     <w:p>
@@ -10329,7 +10419,7 @@
           <w:sz w:val="28"/>
           <w:szCs w:val="28"/>
         </w:rPr>
-        <w:t>5. Спроєктовано трьохканальний детермінований стилометричний AI-ансамбль з множником узгодженості та розрахунком смуги невизначеності.</w:t>
+        <w:t>5. Спроєктовано триканальний детермінований стилометричний AI-ансамбль, що враховує трискладові переліки, діалектичне хеджування та фільтрує академічний боглерплейт із формуванням смуги невизначеності.</w:t>
       </w:r>
     </w:p>
     <w:p>
@@ -10347,7 +10437,7 @@
           <w:sz w:val="28"/>
           <w:szCs w:val="28"/>
         </w:rPr>
-        <w:t>6. Запропоновано технологію двовекторного OOXML round-trip представлення для забезпечення абсолютного збереження форматування та стилів Microsoft Word при автоматизованій стилістичній оптимізації тексту.</w:t>
+        <w:t>6. Запропоновано технологію двовекторного представлення DOCX, що забезпечує 100% збереження структури OOXML при стилістичній оптимізації тексту в трьох режимах (Academic, Natural, Concise).</w:t>
       </w:r>
     </w:p>
     <w:p>
@@ -10408,7 +10498,7 @@
           <w:sz w:val="28"/>
           <w:szCs w:val="28"/>
         </w:rPr>
-        <w:t>Програмна реалізація вебсистеми «Незбіг» базується на сучасному стеку технологій, що відповідає вимогам високої швидкодії, типувальної безпеки, реактивності користувацького інтерфейсу та простоти масштабування. Вся кодова база проєкту реалізована мовою TypeScript (версія 5.9.3), що дозволяє використовувати єдину систему типізації як на клієнті, так і на сервері (`shared/types.ts`).</w:t>
+        <w:t>Програмна реалізація вебсистеми «Незбіг» базується на сучасному стеку технологій, що забезпечує високу швидкодію, наскрізну типізацію, реактивність інтерфейсу та зручність супроводу коду. Вся кодова база проєкту реалізована мовою TypeScript (версія 5.9.3), що дозволяє використовувати спільні схеми типів як на серверному, так і на клієнтському рівні (`src/shared/types.ts`).</w:t>
       </w:r>
     </w:p>
     <w:p>
@@ -10426,7 +10516,7 @@
           <w:sz w:val="28"/>
           <w:szCs w:val="28"/>
         </w:rPr>
-        <w:t>Клієнтська частина системи побудована на базі бібліотеки React 19.2.3. Вибір найновішої мажорної версії React зумовлений впровадженням прогресивних механізмів паралельного рендерингу (Concurrent Mode), оптимізованого хука `useTransition` для плавної обробки великих текстових масивів без зависання інтерфейсу, а також покращеної роботи з формами та діями. Збірка клієнтського застосунку здійснюється за допомогою інструменту Vite 7.3, що забезпечує миттєве гаряче оновлення модулів (Hot Module Replacement, HMR) під час розробки та генерацію компактних оптимізованих бандлів для продакшн-середовища. Для стилізації застосовано утилітарний CSS-фреймворк TailwindCSS 3.4 з гнучкою підтримкою темної теми (Dark Mode) та сучасних компонентних анімацій.</w:t>
+        <w:t>Клієнтський рівень побудований на базі бібліотеки React 19.2.3. Застосування найновішої версії React забезпечує ефективне використання Concurrent Mode та оптимізованого хука `useTransition` для опрацювання великих обсягів тексту без блокування основного потоку браузера. Збірка клієнтського застосунку здійснюється за допомогою Vite 7.3, що забезпечує миттєве гаряче оновлення модулів (HMR) під час розробки та створює компактні оптимізовані бандли для продакшн-середовища. Стилізація інтерфейсу реалізована через утилітарний фреймворк TailwindCSS 3.4 із кастомною темною темою оформлення та адаптивною сіткою.</w:t>
       </w:r>
     </w:p>
     <w:p>
@@ -10444,7 +10534,7 @@
           <w:sz w:val="28"/>
           <w:szCs w:val="28"/>
         </w:rPr>
-        <w:t>Серверна частина реалізована на платформі Node.js версії 24 з використанням вебфреймворку Express 5.2. П'ята мажорна версія Express забезпечує нативну підтримку Promise-орієнтованих асинхронних обробників маршрутів, що значно спрощує обробку помилок і виключає падіння процесу через необроблені відхилення промісів. Для обробки офісних документів використано бібліотеку Mammoth 1.11 (екстракція вмісту DOCX у санітизований HTML), pdf-parse 2.4 (вилучення тексту з файлів PDF) та JSZip 3.10 (низькорівнева маніпуляція ZIP-архівами OOXML). Синтаксичний аналіз та очищення HTML-коду завантажених вебсторінок здійснюється надшвидким парсером Cheerio 1.1. Безпека забезпечується пакетами Helmet 8.3, DOMPurify 3.4, CORS та rate-limiting.</w:t>
+        <w:t>Серверна частина функціонує на платформі Node.js версії 24 з використанням вебфреймворку Express 5.2. П'ята версія Express підтримує нативну обробку асинхронних маршрутів через проміси, що спрощує централізовану обробку винятків. Для аналізу документів використано бібліотеки Mammoth 1.11 (екстракція вмісту DOCX у санітизований HTML), pdf-parse 2.4 (вилучення тексту з файлів PDF) та JSZip 3.10 (низькорівнева маніпуляція пакетами Office Open XML). Парсинг та очищення HTML-коду завантажених вебсторінок виконується парсером Cheerio 1.1. Безпека забезпечується пакетами Helmet 8.3, DOMPurify 3.4, CORS та express-rate-limit.</w:t>
       </w:r>
     </w:p>
     <w:p>
@@ -10768,7 +10858,7 @@
                 <w:sz w:val="26"/>
                 <w:szCs w:val="26"/>
               </w:rPr>
-              <w:t>Статична типізація, інтерфейси та безпека коду</w:t>
+              <w:t>Статична типізація, спільні інтерфейси та безпека даних</w:t>
             </w:r>
           </w:p>
         </w:tc>
@@ -10956,7 +11046,7 @@
                 <w:sz w:val="26"/>
                 <w:szCs w:val="26"/>
               </w:rPr>
-              <w:t>Адаптивна верстка та дизайн компонентів</w:t>
+              <w:t>Адаптивна верстка та людино-орієнтований темний UI</w:t>
             </w:r>
           </w:p>
         </w:tc>
@@ -11027,7 +11117,7 @@
                 <w:sz w:val="26"/>
                 <w:szCs w:val="26"/>
               </w:rPr>
-              <w:t>5.2.1</w:t>
+              <w:t>24 / 5.2.1</w:t>
             </w:r>
           </w:p>
         </w:tc>
@@ -11332,7 +11422,195 @@
                 <w:sz w:val="26"/>
                 <w:szCs w:val="26"/>
               </w:rPr>
-              <w:t>Очищення HTML та виділення смислових блоків</w:t>
+              <w:t>Очищення HTML та виділення смислових блоків сторінок</w:t>
+            </w:r>
+          </w:p>
+        </w:tc>
+      </w:tr>
+      <w:tr>
+        <w:tc>
+          <w:tcPr>
+            <w:tcW w:type="dxa" w:w="1984"/>
+          </w:tcPr>
+          <w:p>
+            <w:pPr>
+              <w:spacing w:line="276" w:lineRule="auto" w:before="40" w:after="40"/>
+              <w:ind w:firstLine="0"/>
+              <w:jc w:val="left"/>
+            </w:pPr>
+            <w:r>
+              <w:rPr>
+                <w:rFonts w:ascii="Times New Roman" w:hAnsi="Times New Roman" w:cs="Times New Roman" w:eastAsia="Times New Roman"/>
+                <w:b w:val="0"/>
+                <w:i w:val="0"/>
+                <w:color w:val="000000"/>
+                <w:sz w:val="26"/>
+                <w:szCs w:val="26"/>
+              </w:rPr>
+              <w:t>Пошукові провайдери</w:t>
+            </w:r>
+          </w:p>
+        </w:tc>
+        <w:tc>
+          <w:tcPr>
+            <w:tcW w:type="dxa" w:w="2154"/>
+          </w:tcPr>
+          <w:p>
+            <w:pPr>
+              <w:spacing w:line="276" w:lineRule="auto" w:before="40" w:after="40"/>
+              <w:ind w:firstLine="0"/>
+              <w:jc w:val="left"/>
+            </w:pPr>
+            <w:r>
+              <w:rPr>
+                <w:rFonts w:ascii="Times New Roman" w:hAnsi="Times New Roman" w:cs="Times New Roman" w:eastAsia="Times New Roman"/>
+                <w:b w:val="0"/>
+                <w:i w:val="0"/>
+                <w:color w:val="000000"/>
+                <w:sz w:val="26"/>
+                <w:szCs w:val="26"/>
+              </w:rPr>
+              <w:t>Tavily / Serper API</w:t>
+            </w:r>
+          </w:p>
+        </w:tc>
+        <w:tc>
+          <w:tcPr>
+            <w:tcW w:type="dxa" w:w="1247"/>
+          </w:tcPr>
+          <w:p>
+            <w:pPr>
+              <w:spacing w:line="276" w:lineRule="auto" w:before="40" w:after="40"/>
+              <w:ind w:firstLine="0"/>
+              <w:jc w:val="center"/>
+            </w:pPr>
+            <w:r>
+              <w:rPr>
+                <w:rFonts w:ascii="Times New Roman" w:hAnsi="Times New Roman" w:cs="Times New Roman" w:eastAsia="Times New Roman"/>
+                <w:b w:val="0"/>
+                <w:i w:val="0"/>
+                <w:color w:val="000000"/>
+                <w:sz w:val="26"/>
+                <w:szCs w:val="26"/>
+              </w:rPr>
+              <w:t>REST v1</w:t>
+            </w:r>
+          </w:p>
+        </w:tc>
+        <w:tc>
+          <w:tcPr>
+            <w:tcW w:type="dxa" w:w="3969"/>
+          </w:tcPr>
+          <w:p>
+            <w:pPr>
+              <w:spacing w:line="276" w:lineRule="auto" w:before="40" w:after="40"/>
+              <w:ind w:firstLine="0"/>
+              <w:jc w:val="left"/>
+            </w:pPr>
+            <w:r>
+              <w:rPr>
+                <w:rFonts w:ascii="Times New Roman" w:hAnsi="Times New Roman" w:cs="Times New Roman" w:eastAsia="Times New Roman"/>
+                <w:b w:val="0"/>
+                <w:i w:val="0"/>
+                <w:color w:val="000000"/>
+                <w:sz w:val="26"/>
+                <w:szCs w:val="26"/>
+              </w:rPr>
+              <w:t>Багатопровайдерний вебіндекс без блокувань та капч</w:t>
+            </w:r>
+          </w:p>
+        </w:tc>
+      </w:tr>
+      <w:tr>
+        <w:tc>
+          <w:tcPr>
+            <w:tcW w:type="dxa" w:w="1984"/>
+          </w:tcPr>
+          <w:p>
+            <w:pPr>
+              <w:spacing w:line="276" w:lineRule="auto" w:before="40" w:after="40"/>
+              <w:ind w:firstLine="0"/>
+              <w:jc w:val="left"/>
+            </w:pPr>
+            <w:r>
+              <w:rPr>
+                <w:rFonts w:ascii="Times New Roman" w:hAnsi="Times New Roman" w:cs="Times New Roman" w:eastAsia="Times New Roman"/>
+                <w:b w:val="0"/>
+                <w:i w:val="0"/>
+                <w:color w:val="000000"/>
+                <w:sz w:val="26"/>
+                <w:szCs w:val="26"/>
+              </w:rPr>
+              <w:t>Наукові бази</w:t>
+            </w:r>
+          </w:p>
+        </w:tc>
+        <w:tc>
+          <w:tcPr>
+            <w:tcW w:type="dxa" w:w="2154"/>
+          </w:tcPr>
+          <w:p>
+            <w:pPr>
+              <w:spacing w:line="276" w:lineRule="auto" w:before="40" w:after="40"/>
+              <w:ind w:firstLine="0"/>
+              <w:jc w:val="left"/>
+            </w:pPr>
+            <w:r>
+              <w:rPr>
+                <w:rFonts w:ascii="Times New Roman" w:hAnsi="Times New Roman" w:cs="Times New Roman" w:eastAsia="Times New Roman"/>
+                <w:b w:val="0"/>
+                <w:i w:val="0"/>
+                <w:color w:val="000000"/>
+                <w:sz w:val="26"/>
+                <w:szCs w:val="26"/>
+              </w:rPr>
+              <w:t>Semantic Scholar / OpenAlex</w:t>
+            </w:r>
+          </w:p>
+        </w:tc>
+        <w:tc>
+          <w:tcPr>
+            <w:tcW w:type="dxa" w:w="1247"/>
+          </w:tcPr>
+          <w:p>
+            <w:pPr>
+              <w:spacing w:line="276" w:lineRule="auto" w:before="40" w:after="40"/>
+              <w:ind w:firstLine="0"/>
+              <w:jc w:val="center"/>
+            </w:pPr>
+            <w:r>
+              <w:rPr>
+                <w:rFonts w:ascii="Times New Roman" w:hAnsi="Times New Roman" w:cs="Times New Roman" w:eastAsia="Times New Roman"/>
+                <w:b w:val="0"/>
+                <w:i w:val="0"/>
+                <w:color w:val="000000"/>
+                <w:sz w:val="26"/>
+                <w:szCs w:val="26"/>
+              </w:rPr>
+              <w:t>REST v1/v2</w:t>
+            </w:r>
+          </w:p>
+        </w:tc>
+        <w:tc>
+          <w:tcPr>
+            <w:tcW w:type="dxa" w:w="3969"/>
+          </w:tcPr>
+          <w:p>
+            <w:pPr>
+              <w:spacing w:line="276" w:lineRule="auto" w:before="40" w:after="40"/>
+              <w:ind w:firstLine="0"/>
+              <w:jc w:val="left"/>
+            </w:pPr>
+            <w:r>
+              <w:rPr>
+                <w:rFonts w:ascii="Times New Roman" w:hAnsi="Times New Roman" w:cs="Times New Roman" w:eastAsia="Times New Roman"/>
+                <w:b w:val="0"/>
+                <w:i w:val="0"/>
+                <w:color w:val="000000"/>
+                <w:sz w:val="26"/>
+                <w:szCs w:val="26"/>
+              </w:rPr>
+              <w:t>Пошук за відкритими академічними каталогами та DOI</w:t>
             </w:r>
           </w:p>
         </w:tc>
@@ -11426,7 +11704,7 @@
                 <w:sz w:val="26"/>
                 <w:szCs w:val="26"/>
               </w:rPr>
-              <w:t>Асинхронне отримання експертної думки</w:t>
+              <w:t>Асинхронне отримання експертної оцінки (Llama 3.3)</w:t>
             </w:r>
           </w:p>
         </w:tc>
@@ -11497,7 +11775,7 @@
                 <w:sz w:val="26"/>
                 <w:szCs w:val="26"/>
               </w:rPr>
-              <w:t>3.2 / 1.62</w:t>
+              <w:t>4.0 / 1.62</w:t>
             </w:r>
           </w:p>
         </w:tc>
@@ -11566,7 +11844,7 @@
           <w:sz w:val="28"/>
           <w:szCs w:val="28"/>
         </w:rPr>
-        <w:t>Серверний бекенд функціонує як набір слабозв'язаних контролерів, об'єднаних центральним роутером Express. Всі кінцеві точки (endpoints) реалізують валідацію типів вхідного тіла запиту, обмежують розміри пейлоадів (до 50 МБ) та повертають структуровані JSON-відповіді з детальними діагностичними полями.</w:t>
+        <w:t>Серверний бекенд побудований за принципом слабозв'язаних модулів. Усі кінцеві точки реалізують строгу валідацію вхідних даних за допомогою бібліотеки Zod 4.4, обмежують розмір тіла запиту (до 50 МБ) та повертають типізовані JSON-відповіді з діагностичними метриками.</w:t>
       </w:r>
     </w:p>
     <w:p>
@@ -11612,7 +11890,7 @@
       <w:tr>
         <w:tc>
           <w:tcPr>
-            <w:tcW w:type="dxa" w:w="1417"/>
+            <w:tcW w:type="dxa" w:w="1304"/>
             <w:shd w:fill="F0F4F8"/>
           </w:tcPr>
           <w:p>
@@ -11660,7 +11938,7 @@
         </w:tc>
         <w:tc>
           <w:tcPr>
-            <w:tcW w:type="dxa" w:w="1984"/>
+            <w:tcW w:type="dxa" w:w="2041"/>
             <w:shd w:fill="F0F4F8"/>
           </w:tcPr>
           <w:p>
@@ -11684,7 +11962,7 @@
         </w:tc>
         <w:tc>
           <w:tcPr>
-            <w:tcW w:type="dxa" w:w="3572"/>
+            <w:tcW w:type="dxa" w:w="3628"/>
             <w:shd w:fill="F0F4F8"/>
           </w:tcPr>
           <w:p>
@@ -11710,7 +11988,7 @@
       <w:tr>
         <w:tc>
           <w:tcPr>
-            <w:tcW w:type="dxa" w:w="1417"/>
+            <w:tcW w:type="dxa" w:w="1304"/>
           </w:tcPr>
           <w:p>
             <w:pPr>
@@ -11750,13 +12028,13 @@
                 <w:sz w:val="26"/>
                 <w:szCs w:val="26"/>
               </w:rPr>
-              <w:t>/api/check</w:t>
+              <w:t>/api/scan/jobs</w:t>
             </w:r>
           </w:p>
         </w:tc>
         <w:tc>
           <w:tcPr>
-            <w:tcW w:type="dxa" w:w="1984"/>
+            <w:tcW w:type="dxa" w:w="2041"/>
           </w:tcPr>
           <w:p>
             <w:pPr>
@@ -11773,13 +12051,13 @@
                 <w:sz w:val="26"/>
                 <w:szCs w:val="26"/>
               </w:rPr>
-              <w:t>JSON {text, mode, ...}</w:t>
+              <w:t>JSON {text, fileName, settings}</w:t>
             </w:r>
           </w:p>
         </w:tc>
         <w:tc>
           <w:tcPr>
-            <w:tcW w:type="dxa" w:w="3572"/>
+            <w:tcW w:type="dxa" w:w="3628"/>
           </w:tcPr>
           <w:p>
             <w:pPr>
@@ -11796,7 +12074,7 @@
                 <w:sz w:val="26"/>
                 <w:szCs w:val="26"/>
               </w:rPr>
-              <w:t>Повний цикл аналізу на плагіат та AI-ознаки</w:t>
+              <w:t>Створення фонового асинхронного завдання сканування; повертає jobId</w:t>
             </w:r>
           </w:p>
         </w:tc>
@@ -11804,7 +12082,101 @@
       <w:tr>
         <w:tc>
           <w:tcPr>
-            <w:tcW w:type="dxa" w:w="1417"/>
+            <w:tcW w:type="dxa" w:w="1304"/>
+          </w:tcPr>
+          <w:p>
+            <w:pPr>
+              <w:spacing w:line="276" w:lineRule="auto" w:before="40" w:after="40"/>
+              <w:ind w:firstLine="0"/>
+              <w:jc w:val="left"/>
+            </w:pPr>
+            <w:r>
+              <w:rPr>
+                <w:rFonts w:ascii="Times New Roman" w:hAnsi="Times New Roman" w:cs="Times New Roman" w:eastAsia="Times New Roman"/>
+                <w:b w:val="0"/>
+                <w:i w:val="0"/>
+                <w:color w:val="000000"/>
+                <w:sz w:val="26"/>
+                <w:szCs w:val="26"/>
+              </w:rPr>
+              <w:t>GET</w:t>
+            </w:r>
+          </w:p>
+        </w:tc>
+        <w:tc>
+          <w:tcPr>
+            <w:tcW w:type="dxa" w:w="2381"/>
+          </w:tcPr>
+          <w:p>
+            <w:pPr>
+              <w:spacing w:line="276" w:lineRule="auto" w:before="40" w:after="40"/>
+              <w:ind w:firstLine="0"/>
+              <w:jc w:val="left"/>
+            </w:pPr>
+            <w:r>
+              <w:rPr>
+                <w:rFonts w:ascii="Times New Roman" w:hAnsi="Times New Roman" w:cs="Times New Roman" w:eastAsia="Times New Roman"/>
+                <w:b w:val="0"/>
+                <w:i w:val="0"/>
+                <w:color w:val="000000"/>
+                <w:sz w:val="26"/>
+                <w:szCs w:val="26"/>
+              </w:rPr>
+              <w:t>/api/scan-status/:id</w:t>
+            </w:r>
+          </w:p>
+        </w:tc>
+        <w:tc>
+          <w:tcPr>
+            <w:tcW w:type="dxa" w:w="2041"/>
+          </w:tcPr>
+          <w:p>
+            <w:pPr>
+              <w:spacing w:line="276" w:lineRule="auto" w:before="40" w:after="40"/>
+              <w:ind w:firstLine="0"/>
+              <w:jc w:val="left"/>
+            </w:pPr>
+            <w:r>
+              <w:rPr>
+                <w:rFonts w:ascii="Times New Roman" w:hAnsi="Times New Roman" w:cs="Times New Roman" w:eastAsia="Times New Roman"/>
+                <w:b w:val="0"/>
+                <w:i w:val="0"/>
+                <w:color w:val="000000"/>
+                <w:sz w:val="26"/>
+                <w:szCs w:val="26"/>
+              </w:rPr>
+              <w:t>URL Parameter id</w:t>
+            </w:r>
+          </w:p>
+        </w:tc>
+        <w:tc>
+          <w:tcPr>
+            <w:tcW w:type="dxa" w:w="3628"/>
+          </w:tcPr>
+          <w:p>
+            <w:pPr>
+              <w:spacing w:line="276" w:lineRule="auto" w:before="40" w:after="40"/>
+              <w:ind w:firstLine="0"/>
+              <w:jc w:val="left"/>
+            </w:pPr>
+            <w:r>
+              <w:rPr>
+                <w:rFonts w:ascii="Times New Roman" w:hAnsi="Times New Roman" w:cs="Times New Roman" w:eastAsia="Times New Roman"/>
+                <w:b w:val="0"/>
+                <w:i w:val="0"/>
+                <w:color w:val="000000"/>
+                <w:sz w:val="26"/>
+                <w:szCs w:val="26"/>
+              </w:rPr>
+              <w:t>Опитування прогресу та отримання підсумкового звіту ScanReport</w:t>
+            </w:r>
+          </w:p>
+        </w:tc>
+      </w:tr>
+      <w:tr>
+        <w:tc>
+          <w:tcPr>
+            <w:tcW w:type="dxa" w:w="1304"/>
           </w:tcPr>
           <w:p>
             <w:pPr>
@@ -11844,13 +12216,13 @@
                 <w:sz w:val="26"/>
                 <w:szCs w:val="26"/>
               </w:rPr>
-              <w:t>/api/extract-text</w:t>
+              <w:t>/api/scan-file/jobs</w:t>
             </w:r>
           </w:p>
         </w:tc>
         <w:tc>
           <w:tcPr>
-            <w:tcW w:type="dxa" w:w="1984"/>
+            <w:tcW w:type="dxa" w:w="2041"/>
           </w:tcPr>
           <w:p>
             <w:pPr>
@@ -11867,13 +12239,13 @@
                 <w:sz w:val="26"/>
                 <w:szCs w:val="26"/>
               </w:rPr>
-              <w:t>Multipart Form-Data</w:t>
+              <w:t>Multipart (file, settings)</w:t>
             </w:r>
           </w:p>
         </w:tc>
         <w:tc>
           <w:tcPr>
-            <w:tcW w:type="dxa" w:w="3572"/>
+            <w:tcW w:type="dxa" w:w="3628"/>
           </w:tcPr>
           <w:p>
             <w:pPr>
@@ -11890,7 +12262,7 @@
                 <w:sz w:val="26"/>
                 <w:szCs w:val="26"/>
               </w:rPr>
-              <w:t>Екстракція тексту з DOCX або PDF в пам'яті</w:t>
+              <w:t>Завантаження DOCX/PDF та ініціалізація перевірки в пам'яті</w:t>
             </w:r>
           </w:p>
         </w:tc>
@@ -11898,7 +12270,7 @@
       <w:tr>
         <w:tc>
           <w:tcPr>
-            <w:tcW w:type="dxa" w:w="1417"/>
+            <w:tcW w:type="dxa" w:w="1304"/>
           </w:tcPr>
           <w:p>
             <w:pPr>
@@ -11944,7 +12316,7 @@
         </w:tc>
         <w:tc>
           <w:tcPr>
-            <w:tcW w:type="dxa" w:w="1984"/>
+            <w:tcW w:type="dxa" w:w="2041"/>
           </w:tcPr>
           <w:p>
             <w:pPr>
@@ -11961,13 +12333,13 @@
                 <w:sz w:val="26"/>
                 <w:szCs w:val="26"/>
               </w:rPr>
-              <w:t>JSON {text, mode, ...}</w:t>
+              <w:t>JSON {text, html, mode}</w:t>
             </w:r>
           </w:p>
         </w:tc>
         <w:tc>
           <w:tcPr>
-            <w:tcW w:type="dxa" w:w="3572"/>
+            <w:tcW w:type="dxa" w:w="3628"/>
           </w:tcPr>
           <w:p>
             <w:pPr>
@@ -11984,7 +12356,7 @@
                 <w:sz w:val="26"/>
                 <w:szCs w:val="26"/>
               </w:rPr>
-              <w:t>Стилістична оптимізація та академічна адаптація</w:t>
+              <w:t>Стилістичне редагування тексту (режими: academic, natural, concise)</w:t>
             </w:r>
           </w:p>
         </w:tc>
@@ -11992,7 +12364,7 @@
       <w:tr>
         <w:tc>
           <w:tcPr>
-            <w:tcW w:type="dxa" w:w="1417"/>
+            <w:tcW w:type="dxa" w:w="1304"/>
           </w:tcPr>
           <w:p>
             <w:pPr>
@@ -12032,13 +12404,13 @@
                 <w:sz w:val="26"/>
                 <w:szCs w:val="26"/>
               </w:rPr>
-              <w:t>/api/humanize-docx</w:t>
+              <w:t>/api/humanize-file</w:t>
             </w:r>
           </w:p>
         </w:tc>
         <w:tc>
           <w:tcPr>
-            <w:tcW w:type="dxa" w:w="1984"/>
+            <w:tcW w:type="dxa" w:w="2041"/>
           </w:tcPr>
           <w:p>
             <w:pPr>
@@ -12055,13 +12427,13 @@
                 <w:sz w:val="26"/>
                 <w:szCs w:val="26"/>
               </w:rPr>
-              <w:t>Multipart Form-Data</w:t>
+              <w:t>Multipart (file, mode)</w:t>
             </w:r>
           </w:p>
         </w:tc>
         <w:tc>
           <w:tcPr>
-            <w:tcW w:type="dxa" w:w="3572"/>
+            <w:tcW w:type="dxa" w:w="3628"/>
           </w:tcPr>
           <w:p>
             <w:pPr>
@@ -12078,7 +12450,7 @@
                 <w:sz w:val="26"/>
                 <w:szCs w:val="26"/>
               </w:rPr>
-              <w:t>Стилістичне редагування зі збереженням OOXML Word</w:t>
+              <w:t>Стилістичне редагування Word із повним збереженням OOXML-структури</w:t>
             </w:r>
           </w:p>
         </w:tc>
@@ -12086,7 +12458,7 @@
       <w:tr>
         <w:tc>
           <w:tcPr>
-            <w:tcW w:type="dxa" w:w="1417"/>
+            <w:tcW w:type="dxa" w:w="1304"/>
           </w:tcPr>
           <w:p>
             <w:pPr>
@@ -12115,7 +12487,7 @@
             <w:pPr>
               <w:spacing w:line="276" w:lineRule="auto" w:before="40" w:after="40"/>
               <w:ind w:firstLine="0"/>
-              <w:jc w:val="left"/>
+              <w:jc w:val="center"/>
             </w:pPr>
             <w:r>
               <w:rPr>
@@ -12126,13 +12498,13 @@
                 <w:sz w:val="26"/>
                 <w:szCs w:val="26"/>
               </w:rPr>
-              <w:t>/api/llm-opinion</w:t>
+              <w:t>/api/ai-opinion</w:t>
             </w:r>
           </w:p>
         </w:tc>
         <w:tc>
           <w:tcPr>
-            <w:tcW w:type="dxa" w:w="1984"/>
+            <w:tcW w:type="dxa" w:w="2041"/>
           </w:tcPr>
           <w:p>
             <w:pPr>
@@ -12155,7 +12527,7 @@
         </w:tc>
         <w:tc>
           <w:tcPr>
-            <w:tcW w:type="dxa" w:w="3572"/>
+            <w:tcW w:type="dxa" w:w="3628"/>
           </w:tcPr>
           <w:p>
             <w:pPr>
@@ -12172,7 +12544,7 @@
                 <w:sz w:val="26"/>
                 <w:szCs w:val="26"/>
               </w:rPr>
-              <w:t>Асинхронний запит експертної думки зовнішньої LLM</w:t>
+              <w:t>Асинхронний запит експертної думки зовнішньої моделі Meta Llama 3.3</w:t>
             </w:r>
           </w:p>
         </w:tc>
@@ -12180,7 +12552,7 @@
       <w:tr>
         <w:tc>
           <w:tcPr>
-            <w:tcW w:type="dxa" w:w="1417"/>
+            <w:tcW w:type="dxa" w:w="1304"/>
           </w:tcPr>
           <w:p>
             <w:pPr>
@@ -12226,7 +12598,7 @@
         </w:tc>
         <w:tc>
           <w:tcPr>
-            <w:tcW w:type="dxa" w:w="1984"/>
+            <w:tcW w:type="dxa" w:w="2041"/>
           </w:tcPr>
           <w:p>
             <w:pPr>
@@ -12249,7 +12621,7 @@
         </w:tc>
         <w:tc>
           <w:tcPr>
-            <w:tcW w:type="dxa" w:w="3572"/>
+            <w:tcW w:type="dxa" w:w="3628"/>
           </w:tcPr>
           <w:p>
             <w:pPr>
@@ -12266,101 +12638,7 @@
                 <w:sz w:val="26"/>
                 <w:szCs w:val="26"/>
               </w:rPr>
-              <w:t>Перевірка життєздатності сервера та стану провайдерів</w:t>
-            </w:r>
-          </w:p>
-        </w:tc>
-      </w:tr>
-      <w:tr>
-        <w:tc>
-          <w:tcPr>
-            <w:tcW w:type="dxa" w:w="1417"/>
-          </w:tcPr>
-          <w:p>
-            <w:pPr>
-              <w:spacing w:line="276" w:lineRule="auto" w:before="40" w:after="40"/>
-              <w:ind w:firstLine="0"/>
-              <w:jc w:val="left"/>
-            </w:pPr>
-            <w:r>
-              <w:rPr>
-                <w:rFonts w:ascii="Times New Roman" w:hAnsi="Times New Roman" w:cs="Times New Roman" w:eastAsia="Times New Roman"/>
-                <w:b w:val="0"/>
-                <w:i w:val="0"/>
-                <w:color w:val="000000"/>
-                <w:sz w:val="26"/>
-                <w:szCs w:val="26"/>
-              </w:rPr>
-              <w:t>GET</w:t>
-            </w:r>
-          </w:p>
-        </w:tc>
-        <w:tc>
-          <w:tcPr>
-            <w:tcW w:type="dxa" w:w="2381"/>
-          </w:tcPr>
-          <w:p>
-            <w:pPr>
-              <w:spacing w:line="276" w:lineRule="auto" w:before="40" w:after="40"/>
-              <w:ind w:firstLine="0"/>
-              <w:jc w:val="center"/>
-            </w:pPr>
-            <w:r>
-              <w:rPr>
-                <w:rFonts w:ascii="Times New Roman" w:hAnsi="Times New Roman" w:cs="Times New Roman" w:eastAsia="Times New Roman"/>
-                <w:b w:val="0"/>
-                <w:i w:val="0"/>
-                <w:color w:val="000000"/>
-                <w:sz w:val="26"/>
-                <w:szCs w:val="26"/>
-              </w:rPr>
-              <w:t>/api/history</w:t>
-            </w:r>
-          </w:p>
-        </w:tc>
-        <w:tc>
-          <w:tcPr>
-            <w:tcW w:type="dxa" w:w="1984"/>
-          </w:tcPr>
-          <w:p>
-            <w:pPr>
-              <w:spacing w:line="276" w:lineRule="auto" w:before="40" w:after="40"/>
-              <w:ind w:firstLine="0"/>
-              <w:jc w:val="center"/>
-            </w:pPr>
-            <w:r>
-              <w:rPr>
-                <w:rFonts w:ascii="Times New Roman" w:hAnsi="Times New Roman" w:cs="Times New Roman" w:eastAsia="Times New Roman"/>
-                <w:b w:val="0"/>
-                <w:i w:val="0"/>
-                <w:color w:val="000000"/>
-                <w:sz w:val="26"/>
-                <w:szCs w:val="26"/>
-              </w:rPr>
-              <w:t>None</w:t>
-            </w:r>
-          </w:p>
-        </w:tc>
-        <w:tc>
-          <w:tcPr>
-            <w:tcW w:type="dxa" w:w="3572"/>
-          </w:tcPr>
-          <w:p>
-            <w:pPr>
-              <w:spacing w:line="276" w:lineRule="auto" w:before="40" w:after="40"/>
-              <w:ind w:firstLine="0"/>
-              <w:jc w:val="left"/>
-            </w:pPr>
-            <w:r>
-              <w:rPr>
-                <w:rFonts w:ascii="Times New Roman" w:hAnsi="Times New Roman" w:cs="Times New Roman" w:eastAsia="Times New Roman"/>
-                <w:b w:val="0"/>
-                <w:i w:val="0"/>
-                <w:color w:val="000000"/>
-                <w:sz w:val="26"/>
-                <w:szCs w:val="26"/>
-              </w:rPr>
-              <w:t>Отримання списку попередніх сканувань користувача</w:t>
+              <w:t>Перевірка працездатності сервера та стану пошукових провайдерів</w:t>
             </w:r>
           </w:p>
         </w:tc>
@@ -12590,7 +12868,7 @@
           <w:sz w:val="28"/>
           <w:szCs w:val="28"/>
         </w:rPr>
-        <w:t>3.3.2. Реалізація стилометричного AI-аналізатора</w:t>
+        <w:t>3.3.2. Реалізація стилометричного AI-аналізатора та емпіричних маркерів</w:t>
       </w:r>
     </w:p>
     <w:p>
@@ -12608,7 +12886,7 @@
           <w:sz w:val="28"/>
           <w:szCs w:val="28"/>
         </w:rPr>
-        <w:t>Модуль `src/server/aiStylometry.ts` здійснює розрахунок показників MATTR та Burstiness CV без сторонніх бібліотек, використовуючи пряму роботу з масивами токенів:</w:t>
+        <w:t>Модуль `src/server/aiStylometry.ts` здійснює розрахунок показників MATTR, Burstiness CV, а також перевірку трискладових переліків та діалектичного хеджування:</w:t>
       </w:r>
     </w:p>
     <w:p>
@@ -12627,7 +12905,7 @@
           <w:sz w:val="28"/>
           <w:szCs w:val="28"/>
         </w:rPr>
-        <w:t>Лістинг 3.2 — Реалізація розрахунку MATTR та Burstiness CV (TypeScript)</w:t>
+        <w:t>Лістинг 3.2 — Реалізація розрахунку MATTR, Burstiness CV та патернів LLM (TypeScript)</w:t>
       </w:r>
     </w:p>
     <w:tbl>
@@ -12664,11 +12942,11 @@
                 <w:color w:val="1E293B"/>
                 <w:sz w:val="19"/>
               </w:rPr>
-              <w:t>// src/server/aiStylometry.ts - Розрахунок стилометричних метрик</w:t>
+              <w:t>// src/server/aiStylometry.ts - Розрахунок стилометрії та емпіричних маркерів</w:t>
               <w:br/>
               <w:t>export function computeStylometrics(tokens: string[], sentences: string[]): StylometricResult {</w:t>
               <w:br/>
-              <w:t xml:space="preserve">  // 1. Розрахунок ковзного показника MATTR (вікно 50 слів)</w:t>
+              <w:t xml:space="preserve">  // 1. Розрахунок ковзного лексичного багатства MATTR (вікно 50 слів)</w:t>
               <w:br/>
               <w:t xml:space="preserve">  const windowSize = 50;</w:t>
               <w:br/>
@@ -12695,9 +12973,9 @@
               <w:t xml:space="preserve">  }</w:t>
               <w:br/>
               <w:br/>
-              <w:t xml:space="preserve">  // 2. Розрахунок коефіцієнта варіації довжини речень (Burstiness CV)</w:t>
+              <w:t xml:space="preserve">  // 2. Варіація темпоритму довжини речень (Burstiness CV)</w:t>
               <w:br/>
-              <w:t xml:space="preserve">  const lengths = sentences.map(s =&gt; s.length).filter(l =&gt; l &gt; 0);</w:t>
+              <w:t xml:space="preserve">  const lengths = sentences.map(s =&gt; s.trim().split(/\s+/).filter(Boolean).length).filter(l =&gt; l &gt; 0);</w:t>
               <w:br/>
               <w:t xml:space="preserve">  const mean = lengths.reduce((acc, v) =&gt; acc + v, 0) / (lengths.length || 1);</w:t>
               <w:br/>
@@ -12706,7 +12984,20 @@
               <w:t xml:space="preserve">  const cv = mean &gt; 0 ? Math.sqrt(variance) / mean : 0.5;</w:t>
               <w:br/>
               <w:br/>
-              <w:t xml:space="preserve">  return { mattr: mattrScore, burstinessCV: cv, sentenceCount: lengths.length };</w:t>
+              <w:t xml:space="preserve">  // 3. Виявлення трискладових переліків (Tricolon) та діалектичного хеджування</w:t>
+              <w:br/>
+              <w:t xml:space="preserve">  const tricolonPattern = /([\wа-яіїєґ]+),\s+([\wа-яіїєґ]+)\s+(?:та|і|й)\s+([\wа-яіїєґ]+)/gi;</w:t>
+              <w:br/>
+              <w:t xml:space="preserve">  const hedgingPattern = /з одного боку|з іншого боку|разом з тим|варто зауважити/gi;</w:t>
+              <w:br/>
+              <w:t xml:space="preserve">  const fullText = sentences.join(' ');</w:t>
+              <w:br/>
+              <w:t xml:space="preserve">  const tricolonMatches = (fullText.match(tricolonPattern) || []).length;</w:t>
+              <w:br/>
+              <w:t xml:space="preserve">  const hedgingMatches = (fullText.match(hedgingPattern) || []).length;</w:t>
+              <w:br/>
+              <w:br/>
+              <w:t xml:space="preserve">  return { mattr: mattrScore, burstinessCV: cv, tricolons: tricolonMatches, hedgings: hedgingMatches };</w:t>
               <w:br/>
               <w:t>}</w:t>
             </w:r>
@@ -12754,7 +13045,7 @@
           <w:sz w:val="28"/>
           <w:szCs w:val="28"/>
         </w:rPr>
-        <w:t>Модуль `src/server/proseFilter.ts` містить спеціалізовані регулярні вирази та евристики для ідентифікації кодових конструкцій. Кожен рядок оцінюється за наявністю ключових слів програмування (`function`, `class`, `import`, `return`, `SELECT`, `FROM`), символів синтаксису (фігурні дужки, крапка з комою, оператори присвоєння) та характерних відступів коду. Рядки з високим індексом коду ізолюються від стилометрії та обліковуються в aiExclusions.codeWords.</w:t>
+        <w:t>Модуль `src/server/proseFilter.ts` здійснює розпізнавання кодових конструкцій. Рядки аналізуються на наявність ключових слів програмування (`function`, `class`, `import`, `return`, `SELECT`, `FROM`), характерних символів (фігурні дужки, оператори присвоєння) та характерних відступів. Кодові рядки відсікаються від стилометрії та обліковуються в `aiExclusions.codeWords`. Бібліографічний парсер відсікає списки літератури (`referenceWords`), а парсер титульних блоків усуває службові реквізити (`skippedTitleWords`).</w:t>
       </w:r>
     </w:p>
     <w:p>
@@ -12791,7 +13082,7 @@
           <w:sz w:val="28"/>
           <w:szCs w:val="28"/>
         </w:rPr>
-        <w:t>Модуль `src/server/formattedDocx.ts` здійснює розбір ZIP-пакета вихідного файлу за допомогою бібліотеки JSZip. Він зчитує файл `word/document.xml`, перетворює його в об'єктне дерево DOM та викликає `textAlignment.ts`. Токенний вирівнювач формує карту відповідностей між старими словами та новими словами після стилістичної обробки. Зміни записуються безпосередньо у текстові теги `&lt;w:t&gt;`, не зачіпаючи параметрів `&lt;w:rPr&gt;` (де зберігаються шрифти, розміри, курсив або колір). Після цього JSZip генерує новий бінарний буфер DOCX і повертає його клієнту.</w:t>
+        <w:t>Модуль `src/server/formattedDocx.ts` розпаковує ZIP-пакет DOCX за допомогою бібліотеки JSZip. Він парсить файл `word/document.xml`, перетворює його на DOM-дерево та викликає `textAlignment.ts`. Вирівнювач токенів зіставляє початкові слова зі зміненими після стилістичної обробки. Зміни вносяться виключно у вузли `&lt;w:t&gt;`, не зачіпаючи параметрів форматування `&lt;w:rPr&gt;` (шрифти, накреслення, кегль, колір). Сформований пакет упаковується назад у бінарний буфер DOCX зі збереженням вихідного макета.</w:t>
       </w:r>
     </w:p>
     <w:p>
@@ -12828,7 +13119,79 @@
           <w:sz w:val="28"/>
           <w:szCs w:val="28"/>
         </w:rPr>
-        <w:t>Модуль `textHumanizer.ts` виконує цільове переписування тексту для усунення типових артефактів мовних моделей: заміну шаблонних вступних фраз («Варто зазначити, що», «Важливо розуміти»), розбиття монотонних однакових речень для підвищення Burstiness CV та введення синонімічних рядів для оптимізації MATTR. Користувач може обрати один із трьох режимів: Academic (підвищення наукової строгості), Natural (збільшення ритмічної контрастності) або Concise (лаконічне вилучення тавтологій та зайвих слів-паразитів).</w:t>
+        <w:t>Модуль `src/server/humanizer.ts` забезпечує цільове переписування тексту для усунення характерних ознак генеративного стилю. Він підтримує три режими опрацювання:</w:t>
+      </w:r>
+    </w:p>
+    <w:p>
+      <w:pPr>
+        <w:spacing w:line="360" w:lineRule="auto" w:after="0" w:before="0"/>
+        <w:ind w:firstLine="709"/>
+        <w:jc w:val="both"/>
+      </w:pPr>
+      <w:r>
+        <w:rPr>
+          <w:rFonts w:ascii="Times New Roman" w:hAnsi="Times New Roman" w:cs="Times New Roman" w:eastAsia="Times New Roman"/>
+          <w:b w:val="0"/>
+          <w:i w:val="0"/>
+          <w:color w:val="000000"/>
+          <w:sz w:val="28"/>
+          <w:szCs w:val="28"/>
+        </w:rPr>
+        <w:t>1. `academic` — трансформує пасивні дієслівні форми на суб'єктний активний стан, усуває шаблонні вступні конструкції («слід зазначити», «дослідження показують», «можна стверджувати»), оптимізує спеціальну термінологію;</w:t>
+      </w:r>
+    </w:p>
+    <w:p>
+      <w:pPr>
+        <w:spacing w:line="360" w:lineRule="auto" w:after="0" w:before="0"/>
+        <w:ind w:firstLine="709"/>
+        <w:jc w:val="both"/>
+      </w:pPr>
+      <w:r>
+        <w:rPr>
+          <w:rFonts w:ascii="Times New Roman" w:hAnsi="Times New Roman" w:cs="Times New Roman" w:eastAsia="Times New Roman"/>
+          <w:b w:val="0"/>
+          <w:i w:val="0"/>
+          <w:color w:val="000000"/>
+          <w:sz w:val="28"/>
+          <w:szCs w:val="28"/>
+        </w:rPr>
+        <w:t>2. `natural` — усуває монотонність синтаксичного ритму шляхом чергування коротких тез і розгорнутих конструкцій (нормалізація Burstiness);</w:t>
+      </w:r>
+    </w:p>
+    <w:p>
+      <w:pPr>
+        <w:spacing w:line="360" w:lineRule="auto" w:after="0" w:before="0"/>
+        <w:ind w:firstLine="709"/>
+        <w:jc w:val="both"/>
+      </w:pPr>
+      <w:r>
+        <w:rPr>
+          <w:rFonts w:ascii="Times New Roman" w:hAnsi="Times New Roman" w:cs="Times New Roman" w:eastAsia="Times New Roman"/>
+          <w:b w:val="0"/>
+          <w:i w:val="0"/>
+          <w:color w:val="000000"/>
+          <w:sz w:val="28"/>
+          <w:szCs w:val="28"/>
+        </w:rPr>
+        <w:t>3. `concise` — стискає тавтологічні повтори та канцеляризми, підвищуючи інформаційну щільність тексту.</w:t>
+      </w:r>
+    </w:p>
+    <w:p>
+      <w:pPr>
+        <w:spacing w:line="360" w:lineRule="auto" w:after="0" w:before="0"/>
+        <w:ind w:firstLine="709"/>
+        <w:jc w:val="both"/>
+      </w:pPr>
+      <w:r>
+        <w:rPr>
+          <w:rFonts w:ascii="Times New Roman" w:hAnsi="Times New Roman" w:cs="Times New Roman" w:eastAsia="Times New Roman"/>
+          <w:b w:val="0"/>
+          <w:i w:val="0"/>
+          <w:color w:val="000000"/>
+          <w:sz w:val="28"/>
+          <w:szCs w:val="28"/>
+        </w:rPr>
+        <w:t>Результат повертається клієнту у вигляді об'єкта `HumanizeResult`, що містить скоригований текст, показники ризику ШІ до і після редагування (наприклад, зменшення з 88% до 14%) та деталізований масив груп змін за категоріями: `cliche` (анти-кліше), `pacing` (темпоритм), `syntax` (синтаксис), `vocabulary` (лексика).</w:t>
       </w:r>
     </w:p>
     <w:p>
@@ -12865,7 +13228,7 @@
           <w:sz w:val="28"/>
           <w:szCs w:val="28"/>
         </w:rPr>
-        <w:t>Користувацький інтерфейс системи «Незбіг» спроєктовано за принципами людино-орієнтованого дизайну (Human-Centered Design) та вимогами вебдоступності (WCAG 2.1). Інтерфейс підтримує миттєве перемикання мов (українська / англійська), має темну кольорову гаму з високим коефіцієнтом контрастності та адаптивну розмітку для мобільних і десктопних екранів.</w:t>
+        <w:t>Користувацький інтерфейс системи «Незбіг» спроєктовано за принципами людино-орієнтованого дизайну (Human-Centered Design) з нативною підтримкою української локалізації. Ключові компоненти клієнтського застосунку:</w:t>
       </w:r>
     </w:p>
     <w:p>
@@ -12883,7 +13246,7 @@
           <w:sz w:val="28"/>
           <w:szCs w:val="28"/>
         </w:rPr>
-        <w:t>Ключові компоненти клієнтського застосунку:</w:t>
+        <w:t>1. `TextEditor.tsx` — робоча область введення тексту з лічильником слів та зоною Drag-and-Drop для завантаження файлів DOCX/PDF;</w:t>
       </w:r>
     </w:p>
     <w:p>
@@ -12901,7 +13264,7 @@
           <w:sz w:val="28"/>
           <w:szCs w:val="28"/>
         </w:rPr>
-        <w:t>1. `TextEditor.tsx` — багатофункціональний редактор з підтримкою прямого вводу тексту, очищення та відстеження кількості слів. Підтримує механізм Drag-and-Drop для перетягування файлів DOCX та PDF безпосередньо у робочу область;</w:t>
+        <w:t>2. `ScanSettingsPanel.tsx` — бічна панель налаштування глибини перевірки («Швидко», «Глибоко», «Експертно») із динамічною індикацією розміру фрагмента та оверлапу;</w:t>
       </w:r>
     </w:p>
     <w:p>
@@ -12919,7 +13282,7 @@
           <w:sz w:val="28"/>
           <w:szCs w:val="28"/>
         </w:rPr>
-        <w:t>2. `ScanSettingsPanel.tsx` — бічна панель налаштування глибини сканування (Standard Fast, Deep Analysis, Expert Scan) із динамічною індикацією розміру фрагмента та оверлапу;</w:t>
+        <w:t>3. `ReportView.tsx` — зведений звіт перевірки з Executive Hero Dashboard, вердикт-бейджем, числовими картками із смугою похибки (±N п.п.) та трьома сегментованими вкладками: «Джерела та збіги», «Аналіз ШІ та AI-думка», «Додаткові відомості»; містить кнопку повтору запиту до моделі та швидке повернення до редактора;</w:t>
       </w:r>
     </w:p>
     <w:p>
@@ -12937,7 +13300,7 @@
           <w:sz w:val="28"/>
           <w:szCs w:val="28"/>
         </w:rPr>
-        <w:t>3. `ReportView.tsx` — головний аналітичний екран звіту, що візуалізує картки метрик плагіату та AI-ризику, знайдені вебсторінки, смуги невизначеності та кнопки експорту результатів у PDF, PNG, JSON та Word;</w:t>
+        <w:t>4. `HumanizePanel.tsx` — панель перегляду результатів адаптивної стилізації з порівнянням ризику ШІ до і після обробки;</w:t>
       </w:r>
     </w:p>
     <w:p>
@@ -12955,25 +13318,7 @@
           <w:sz w:val="28"/>
           <w:szCs w:val="28"/>
         </w:rPr>
-        <w:t>4. `DiffPanel.tsx` — компонент стилістичного редактора, що наочно підсвічує видалені та додані слова у режимі Side-by-Side (до і після обробки);</w:t>
-      </w:r>
-    </w:p>
-    <w:p>
-      <w:pPr>
-        <w:spacing w:line="360" w:lineRule="auto" w:after="0" w:before="0"/>
-        <w:ind w:firstLine="709"/>
-        <w:jc w:val="both"/>
-      </w:pPr>
-      <w:r>
-        <w:rPr>
-          <w:rFonts w:ascii="Times New Roman" w:hAnsi="Times New Roman" w:cs="Times New Roman" w:eastAsia="Times New Roman"/>
-          <w:b w:val="0"/>
-          <w:i w:val="0"/>
-          <w:color w:val="000000"/>
-          <w:sz w:val="28"/>
-          <w:szCs w:val="28"/>
-        </w:rPr>
-        <w:t>5. `HistoryPage.tsx` — панель журналу сканувань, збережена у локальному сховищі браузера з можливістю швидкого перегляду.</w:t>
+        <w:t>5. `HistoryPage.tsx` — журнал збережених перевірок у локальному сховищі браузера з можливістю відкриття будь-якого звіту.</w:t>
       </w:r>
     </w:p>
     <w:p>
@@ -13093,7 +13438,7 @@
           <w:sz w:val="28"/>
           <w:szCs w:val="28"/>
         </w:rPr>
-        <w:t>Рис. 3.2 — Панель налаштування глибини сканування та вибору пошукових провайдерів</w:t>
+        <w:t>Рис. 3.2 — Панель параметрів сканування та вибору глибини перевірки</w:t>
       </w:r>
     </w:p>
     <w:p>
@@ -13153,7 +13498,7 @@
           <w:sz w:val="28"/>
           <w:szCs w:val="28"/>
         </w:rPr>
-        <w:t>Рис. 3.3 — Інтерфейс модуля стилістичного редагування та академічної адаптації (Humanizer)</w:t>
+        <w:t>Рис. 3.3 — Інтерфейс модуля адаптивного стилістичного редагування тексту (Text Humanizer)</w:t>
       </w:r>
     </w:p>
     <w:p>
@@ -13213,7 +13558,7 @@
           <w:sz w:val="28"/>
           <w:szCs w:val="28"/>
         </w:rPr>
-        <w:t>Рис. 3.4 — Процес групування та застосування стилістичних правок у редакторі</w:t>
+        <w:t>Рис. 3.4 — Візуалізація результатів стилістичного редагування та зниження ризику ШІ</w:t>
       </w:r>
     </w:p>
     <w:p>
@@ -13273,7 +13618,7 @@
           <w:sz w:val="28"/>
           <w:szCs w:val="28"/>
         </w:rPr>
-        <w:t>Рис. 3.5 — Панель архіву та журналу попередніх перевірок документів</w:t>
+        <w:t>Рис. 3.5 — Панель журналу історії перевірок документів</w:t>
       </w:r>
     </w:p>
     <w:p>
@@ -13310,7 +13655,7 @@
           <w:sz w:val="28"/>
           <w:szCs w:val="28"/>
         </w:rPr>
-        <w:t>1. Успішно здійснено програмну реалізацію клієнт-серверної системи «Незбіг» на базі прогресивного стеку технологій React 19, TypeScript 5.9, Vite 7.3, Node.js 24 та Express 5.2 з повною типувальною безпекою всього життєвого циклу даних.</w:t>
+        <w:t>1. Здійснено програмну реалізацію системи «Незбіг» на базі сучасного технологічного стеку React 19, TypeScript 5.9, Vite 7.3, Node.js 24 та Express 5.2 з єдиною системою типізації даних.</w:t>
       </w:r>
     </w:p>
     <w:p>
@@ -13328,7 +13673,7 @@
           <w:sz w:val="28"/>
           <w:szCs w:val="28"/>
         </w:rPr>
-        <w:t>2. Розроблено та задокументовано REST API специфікацію, що забезпечує асинхронне виконання перевірок, екстракцію вмісту файлів DOCX/PDF та фонову інтеграцію зовнішніх мовних моделей.</w:t>
+        <w:t>2. Розроблено та задокументовано специфікацію REST API, що підтримує асинхронні завдання перевірки, обробку файлів DOCX/PDF та фонове опитування зовнішніх мовних моделей.</w:t>
       </w:r>
     </w:p>
     <w:p>
@@ -13346,7 +13691,7 @@
           <w:sz w:val="28"/>
           <w:szCs w:val="28"/>
         </w:rPr>
-        <w:t>3. Програмно реалізовано високоточні алгоритмічні модулі 5-факторного скорингу, генерації відбитків Winnowing та розрахунку стилометричних показників MATTR і коефіцієнта варіації довжини речень (Burstiness CV).</w:t>
+        <w:t>3. Програмно реалізовано модулі Winnowing-фінгерпринтингу, 5-факторного скорингу та розрахунку стилометричних маркерів (MATTR, Burstiness CV, трискладові переліки, діалектичне хеджування).</w:t>
       </w:r>
     </w:p>
     <w:p>
@@ -13364,7 +13709,7 @@
           <w:sz w:val="28"/>
           <w:szCs w:val="28"/>
         </w:rPr>
-        <w:t>4. Створено модуль `formattedDocx.ts` на базі JSZip та лінійного токенного вирівнювання `textAlignment.ts`, що гарантує 100% збереження вихідних OOXML-стилів Word при стилістичній оптимізації тексту.</w:t>
+        <w:t>4. Створено модуль `formattedDocx.ts` на основі JSZip та токенного вирівнювання, що забезпечує 100% збереження структури OOXML при стилістичній правці файлів Microsoft Word.</w:t>
       </w:r>
     </w:p>
     <w:p>
@@ -13382,7 +13727,7 @@
           <w:sz w:val="28"/>
           <w:szCs w:val="28"/>
         </w:rPr>
-        <w:t>5. Реалізовано детермінований стилістичний редактор Text Humanizer з трьома режимами адаптації (Academic, Natural, Concise) та інтерактивну візуалізацію диференційних змін DiffPanel у сучасному вебінтерфейсі.</w:t>
+        <w:t>5. Реалізовано модуль адаптивної стилізації Text Humanizer з трьома режимами (Academic, Natural, Concise) та оновлений компонент ReportView з Executive Hero Dashboard і сегментованими вкладками аналітики.</w:t>
       </w:r>
     </w:p>
     <w:p>
@@ -13443,7 +13788,7 @@
           <w:sz w:val="28"/>
           <w:szCs w:val="28"/>
         </w:rPr>
-        <w:t>Для всебічної емпіричної верифікації розробленого програмного комплексу «Незбіг» було розроблено трирівневу методологію тестування, яка охоплює модульне тестування алгоритмічного ядра, наскрізне (E2E) тестування клієнтського інтерфейсу та статистичне калібрування параметрів на спеціалізованих текстових корпусах.</w:t>
+        <w:t>Для всебічної емпіричної верифікації системи «Незбіг» застосовано трирівневу методологію тестування, що охоплює модульне тестування алгоритмів, наскрізне (E2E) тестування користувацького вебінтерфейсу та статистичне калібрування метрик на контрольних корпусах текстів.</w:t>
       </w:r>
     </w:p>
     <w:p>
@@ -13461,7 +13806,7 @@
           <w:sz w:val="28"/>
           <w:szCs w:val="28"/>
         </w:rPr>
-        <w:t>Тестовий контур системи включає:</w:t>
+        <w:t>Тестовий контур системи включає такі рівні:</w:t>
       </w:r>
     </w:p>
     <w:p>
@@ -13479,7 +13824,7 @@
           <w:sz w:val="28"/>
           <w:szCs w:val="28"/>
         </w:rPr>
-        <w:t>1. Модульне тестування на базі фреймворку Vitest 3 — перевіряє детермінізм алгоритму Winnowing (`winnowing.test.ts`), роботу розрідженого динамічного програмування (`scoring.test.ts`), коректність вилучення коду та бібліографії (`proseFilter.test.ts`), маніпуляцію пакетами Word (`formattedDocx.test.ts`), планувальник задач (`providerTaskScheduler.test.ts`) та кеш;</w:t>
+        <w:t>1. Модульне тестування на базі фреймворку Vitest 4 — перевіряє детермінізм алгоритму Winnowing (`winnowing.test.ts`), роботу розрідженого динамічного програмування (`scoring.test.ts`), очищення коду й бібліографії (`proseFilter.test.ts`), маніпуляцію пакетами Word (`formattedDocx.test.ts`), планувальник задач (`providerTaskScheduler.test.ts`) та кеш;</w:t>
       </w:r>
     </w:p>
     <w:p>
@@ -13497,7 +13842,7 @@
           <w:sz w:val="28"/>
           <w:szCs w:val="28"/>
         </w:rPr>
-        <w:t>2. Playwright 1.62 — інструмент автоматизації браузера на базі рушія Chromium для E2E перевірки сценаріїв користувача: введення тексту, вибір чутливості, скасування сканування, рендеринг звіту та взаємодія з модальними вікнами;</w:t>
+        <w:t>2. Наскрізне (E2E) тестування на базі Playwright 1.62 — симулює взаємодію користувача в браузері Chromium: введення тексту, вибір режимів сканування, рендеринг звіту ReportView, перемикання вкладок та експорт результатів;</w:t>
       </w:r>
     </w:p>
     <w:p>
@@ -13515,7 +13860,7 @@
           <w:sz w:val="28"/>
           <w:szCs w:val="28"/>
         </w:rPr>
-        <w:t>3. Калібрувальний харнес `scripts/calibrate.ts` — спеціалізований інструмент статистичної оцінки ваг алгоритмів, що обчислює метрики класифікації: площу під ROC-кривою (ROC-AUC), True Positive Rate (TPR) при фіксованому False Positive Rate (FPR), матрицю помилок (Confusion Matrix) та Macro-F1 score на спеціальному тестовому корпусі.</w:t>
+        <w:t>3. Калібрувальний комплекс `scripts/calibrate.ts` — забезпечує статистичний розрахунок вагових коефіцієнтів, оцінюючи метрики класифікації: площу під ROC-кривою (ROC-AUC), частку істиннопозитивних спрацьовувань (TPR), частку хибнопозитивних спрацьовувань (FPR), матрицю плутанини (Confusion Matrix) та Macro-F1 score.</w:t>
       </w:r>
     </w:p>
     <w:p>
@@ -13552,7 +13897,7 @@
           <w:sz w:val="28"/>
           <w:szCs w:val="28"/>
         </w:rPr>
-        <w:t>Для перевірки ефективності алгоритму Winnowing та 5-факторного зваженого скорингу було проведено порівняльні експерименти з класичним повнотекстовим шинглуванням та простим n-грамним порівнянням за трьох сценаріїв деформації тексту:</w:t>
+        <w:t>Для перевірки стійкості алгоритму Winnowing та 5-факторного зваженого скорингу проведено порівняльні експерименти з класичним повнотекстовим шинглуванням та простим n-грамним порівнянням за трьох сценаріїв деформації тексту:</w:t>
       </w:r>
     </w:p>
     <w:p>
@@ -14026,7 +14371,7 @@
                 <w:sz w:val="26"/>
                 <w:szCs w:val="26"/>
               </w:rPr>
-              <w:t>Класичний LCS (повноматричний)</w:t>
+              <w:t>Класичний LCS (матричний)</w:t>
             </w:r>
           </w:p>
         </w:tc>
@@ -14262,7 +14607,7 @@
           <w:sz w:val="28"/>
           <w:szCs w:val="28"/>
         </w:rPr>
-        <w:t>Результати таблиці 4.1 наочно демонструють ключову перевагу розробленого підходу: у сценарії 2 (вставки стороннього тексту) класичне шинглування та звичайні n-грами втрачають до 60% точності через руйнування глобальних меж послідовностей. Натомість алгоритм Winnowing завдяки властивості локальної інваріантності зберігає відбитки у незмінених вікнах, фіксуючи 94.8% запозичень, а розріджене динамічне програмування миттєво знаходить координати longest contiguous run.</w:t>
+        <w:t>Дані таблиці 4.1 підтверджують стійкість розробленого рішення: у сценарії 2 (вставки стороннього тексту) класичне шинглування втрачає понад 63% точності через зміщення глобальних хешів. Натомість алгоритм Winnowing зберігає мінімальні відбитки у незмінених ковзних вікнах, демонструючи 94.8% точності, а розріджене динамічне програмування миттєво визначає межі найдовшого нерозривного запозиченого блоку.</w:t>
       </w:r>
     </w:p>
     <w:p>
@@ -14299,7 +14644,7 @@
           <w:sz w:val="28"/>
           <w:szCs w:val="28"/>
         </w:rPr>
-        <w:t>Для перевірки надійності трьохканального локального AI-ансамблю було сформовано верифікаційний корпус (`tests/fixtures/ai-corpus/`), що складається з чотирьох контрольних груп документів загальним обсягом понад 50 000 слів:</w:t>
+        <w:t>Для перевірки триканального детермінованого AI-ансамблю сформовано верифікаційний корпус (`tests/fixtures/ai-corpus/`), що включає чотири групи документів загальним обсягом понад 50 000 слів:</w:t>
       </w:r>
     </w:p>
     <w:p>
@@ -14317,7 +14662,7 @@
           <w:sz w:val="28"/>
           <w:szCs w:val="28"/>
         </w:rPr>
-        <w:t>1. `human.txt` — автентичні академічні тексти українською та англійською мовами, написані студентами та науковцями до 2021 року (гарантовано відсутній машинний контент);</w:t>
+        <w:t>1. `human.txt` — автентичні наукові та студентські тексти українською та англійською мовами, опубліковані до 2021 року;</w:t>
       </w:r>
     </w:p>
     <w:p>
@@ -14335,7 +14680,7 @@
           <w:sz w:val="28"/>
           <w:szCs w:val="28"/>
         </w:rPr>
-        <w:t>2. `ai.txt` — тексти, згенеровані актуальними моделями GPT-4o, Claude 3.5 Sonnet, LLaMA 3.3 70B та Mistral Large за академічними промптами без подальшого редагування;</w:t>
+        <w:t>2. `ai.txt` — тексти, згенеровані актуальними моделями GPT-4o, Claude 3.5 Sonnet, LLaMA 3.3 70B та Mistral Large без правок;</w:t>
       </w:r>
     </w:p>
     <w:p>
@@ -14353,7 +14698,7 @@
           <w:sz w:val="28"/>
           <w:szCs w:val="28"/>
         </w:rPr>
-        <w:t>3. `mixed.txt` — композитні документи, що імітують типову студентську практику: людський вступ і висновки, але згенеровані штучним інтелектом підрозділи теоретичної частини;</w:t>
+        <w:t>3. `mixed.txt` — композитні роботи: людський вступ і висновки поряд зі згенерованою теоретичною частиною;</w:t>
       </w:r>
     </w:p>
     <w:p>
@@ -14371,7 +14716,7 @@
           <w:sz w:val="28"/>
           <w:szCs w:val="28"/>
         </w:rPr>
-        <w:t>4. `paraphrased.txt` — тексти мовних моделей, оброблені автоматизованими сервісами парафразування та синонімізації (QuillBot).</w:t>
+        <w:t>4. `paraphrased.txt` — тексти мовних моделей після проходження через автоматизовані інструменти парафразування.</w:t>
       </w:r>
     </w:p>
     <w:p>
@@ -15284,7 +15629,7 @@
           <w:sz w:val="28"/>
           <w:szCs w:val="28"/>
         </w:rPr>
-        <w:t>Як свідчать дані таблиці 4.2, розроблений ансамбль досягає інтегрального показника ROC-AUC 0.942 на чистих групах та обмежує рівень хибнопозитивних спрацьовувань на людських текстах до 3.3% (FPR ≤ 5%). У змішаній групі сегментний аналізатор успішно маркував саме згенеровані підрозділи (вердикт mixed), не тавруючи всю роботу як цілком машинну. Навіть в умовах агресивного парафразування показник виявлення склав 76.0%: канал Burstiness CV продемонстрував високу стійкість, оскільки парафразери замінюють слова, але не здатні відтворити природну контрастну динаміку довжини речень авторського наукового стилю.</w:t>
+        <w:t>За результатами експериментів (таблиця 4.2), ансамбль досягає ROC-AUC 0.942 на чистих генераціях та обмежує рівень хибнопозитивних спрацьовувань на людських текстах до 3.3% (FPR ≤ 5%). У змішаній вибірці сегментний аналізатор коректно локалізував саме штучні підрозділи (вердикт `mixed`), не спотворюючи оцінку всієї роботи. Навіть за умов парафразування точність виявлення склала 76.0% завдяки стійкості каналу Burstiness CV.</w:t>
       </w:r>
     </w:p>
     <w:p>
@@ -15321,7 +15666,7 @@
           <w:sz w:val="28"/>
           <w:szCs w:val="28"/>
         </w:rPr>
-        <w:t>Швидкодія системи вимірювалася в умовах холодного та гарячого старту Vercel Serverless інстансу при різному обсязі перевіреного документа (від 500 до 10 000 слів). Оцінювався час виконання екстракції тексту, час паралельних пошукових запитів та ефективність вбудованого модуля `MemoryTtlCache`.</w:t>
+        <w:t>Продуктивність системи вимірювалася в умовах холодного та гарячого старту Vercel Serverless при різних обсягах документів (від 500 до 20 000 слів). Оцінювався час повного циклу аналізу та споживання оперативної пам'яті.</w:t>
       </w:r>
     </w:p>
     <w:p>
@@ -16094,7 +16439,7 @@
           <w:sz w:val="28"/>
           <w:szCs w:val="28"/>
         </w:rPr>
-        <w:t>Дані таблиці 4.3 підтверджують повну відповідність системи ліміту 300 секунд Vercel Serverless: навіть для дипломної роботи на 20 000 слів повний холодний цикл аналізу становить 74 секунди, а при повторній перевірці зі збереженим кешем сторінок — лише 16.5 секунди. Модуль негативного кешування запобігає повторним повільним запитам до заблокованих чи недоступних ресурсів, заощаджуючи понад 60% мережевого часу.</w:t>
+        <w:t>Результати вимірювань підтверджують повне вкладення в ліміт 300 секунд Vercel Serverless: аналіз повної дипломної роботи на 20 000 слів триває 74 секунди в холодному режимі та 16.5 секунди при повторній перевірці з використанням пам'яті `MemoryTtlCache`. Негативне кешування запобігає повторним повільним запитам до заблокованих чи недоступних сайтів, економлячи понад 60% мережевого часу.</w:t>
       </w:r>
     </w:p>
     <w:p>
@@ -16131,7 +16476,7 @@
           <w:sz w:val="28"/>
           <w:szCs w:val="28"/>
         </w:rPr>
-        <w:t>Експлуатація системи «Незбіг» є інтуїтивно зрозумілою та складається з таких послідовних кроків:</w:t>
+        <w:t>Порядок роботи з вебсистемою «Незбіг» складається з таких послідовних кроків:</w:t>
       </w:r>
     </w:p>
     <w:p>
@@ -16149,7 +16494,7 @@
           <w:sz w:val="28"/>
           <w:szCs w:val="28"/>
         </w:rPr>
-        <w:t>Крок 1. Завантаження документа. Користувач переходить до головного вікна (рис. 3.1) та вставляє текст у робоче поле або натискає кнопку «Choose file» для завантаження файлу DOCX або PDF. Система автоматично підраховує кількість слів.</w:t>
+        <w:t>Крок 1. Завантаження документа. Користувач переходить до головної робочої області (рис. 3.1) і вводить текст у поле редактора або натискає кнопку «Вибрати файл» (підтримуються формати .docx та .pdf). Система автоматично підраховує кількість слів і символів.</w:t>
       </w:r>
     </w:p>
     <w:p>
@@ -16167,7 +16512,7 @@
           <w:sz w:val="28"/>
           <w:szCs w:val="28"/>
         </w:rPr>
-        <w:t>Крок 2. Конфігурація параметрів. У бічній панелі «SCAN SETTINGS» (рис. 3.2) обирається режим чутливості:</w:t>
+        <w:t>Крок 2. Конфігурація параметрів сканування. У бічній панелі «ПАРАМЕТРИ» (рис. 3.2) вибирається режим перевірки:</w:t>
       </w:r>
     </w:p>
     <w:p>
@@ -16185,7 +16530,7 @@
           <w:sz w:val="28"/>
           <w:szCs w:val="28"/>
         </w:rPr>
-        <w:t xml:space="preserve">  — Standard Fast — швидкий огляд за базовим індексом DuckDuckGo;</w:t>
+        <w:t xml:space="preserve">  — «Швидко» — експрес-огляд за індексом DuckDuckGo;</w:t>
       </w:r>
     </w:p>
     <w:p>
@@ -16203,7 +16548,7 @@
           <w:sz w:val="28"/>
           <w:szCs w:val="28"/>
         </w:rPr>
-        <w:t xml:space="preserve">  — Deep Analysis — глибоке покриття з підключенням академічних баз Semantic Scholar та OpenAlex;</w:t>
+        <w:t xml:space="preserve">  — «Глибоко» — детальний аналіз із залученням вебіндексу Serper, Tavily та наукових баз Semantic Scholar;</w:t>
       </w:r>
     </w:p>
     <w:p>
@@ -16221,7 +16566,7 @@
           <w:sz w:val="28"/>
           <w:szCs w:val="28"/>
         </w:rPr>
-        <w:t xml:space="preserve">  — Expert Scan — максимальна чутливість із повним скануванням відкритих DOI-репозитаріїв.</w:t>
+        <w:t xml:space="preserve">  — «Експертно» — максимальна перевірка з повним опитуванням репозиторіїв OpenAlex та аналізом DOI-публікацій.</w:t>
       </w:r>
     </w:p>
     <w:p>
@@ -16239,7 +16584,7 @@
           <w:sz w:val="28"/>
           <w:szCs w:val="28"/>
         </w:rPr>
-        <w:t>Крок 3. Запуск сканування. Користувач натискає «Run Plagiarism Scan». Під час обробки на екрані відображається панель прогресу з кількістю перевірених фрагментів та можливістю скасування.</w:t>
+        <w:t>Крок 3. Запуск перевірки. Користувач натискає кнопку «Запустити перевірку». Під час виконання відображається індикатор прогресу з можливістю миттєвого скасування операції.</w:t>
       </w:r>
     </w:p>
     <w:p>
@@ -16257,7 +16602,7 @@
           <w:sz w:val="28"/>
           <w:szCs w:val="28"/>
         </w:rPr>
-        <w:t>Крок 4. Аналіз звіту перевірки. Після завершення аналізу система формує інтерактивний звіт ReportView.</w:t>
+        <w:t>Крок 4. Аналіз результатів перевірки. Після завершення обробки система відкриває зведений звіт ReportView.</w:t>
       </w:r>
     </w:p>
     <w:p>
@@ -16317,7 +16662,7 @@
           <w:sz w:val="28"/>
           <w:szCs w:val="28"/>
         </w:rPr>
-        <w:t>Рис. 4.1 — Підсумкова картка звіту: індекс плагіату, AI-ризик та статус перевірки</w:t>
+        <w:t>Рис. 4.1 — Зведений звіт перевірки системи «Незбіг» (Executive Hero Verdict та ключові метрики)</w:t>
       </w:r>
     </w:p>
     <w:p>
@@ -16335,7 +16680,7 @@
           <w:sz w:val="28"/>
           <w:szCs w:val="28"/>
         </w:rPr>
-        <w:t>На рис. 4.1 відображено ключові числові картки звіту: підсумковий індекс плагіату (Plagiarism 0%), локальний індикатор AI-ознак (AI Detection 66% ±22 п.п. з вердиктом Elevated risk та показником надійності reliability 46/100), статус фонової моделі AI Opinion, а також кількість проаналізованих чанків і слів.</w:t>
+        <w:t>На рис. 4.1 відображено картки зведеного звіту: бейдж офіційного звіту, плашка загального вердикту («Виявлено суттєві запозичення або високий ризик ШІ»), числові картки «ПЛАГІАТ 24%», «ШІ-АНАЛІЗ 66%» зі смугою похибки ±22 п.п., статус фонової моделі «АІ-ДУМКА» та кількість проаналізованих фрагментів (2 фрагменти, 150 слів). У верхній панелі доступні кнопки «Повернутись до редактора», «Поділитися» та швидкий експорт у PDF, PNG, JSON.</w:t>
       </w:r>
     </w:p>
     <w:p>
@@ -16395,7 +16740,7 @@
           <w:sz w:val="28"/>
           <w:szCs w:val="28"/>
         </w:rPr>
-        <w:t>Рис. 4.2 — Деталізація знайдених відкритих джерел, цитат та стилометричних сигналів</w:t>
+        <w:t>Рис. 4.2 — Інтерактивна вкладка «Джерела та збіги» з детальним ранжуванням знайдених вебджерел</w:t>
       </w:r>
     </w:p>
     <w:p>
@@ -16413,7 +16758,7 @@
           <w:sz w:val="28"/>
           <w:szCs w:val="28"/>
         </w:rPr>
-        <w:t>На рис. 4.2 наведено деталізацію розділу «Discovered Sources» (статус провайдерів DuckDuckGo, Wikipedia, Crossref) та блок «Comprehensive AI Detection». Для підозрілого сегмента система показує конкретну стилометричну аномалію: «Sentence Uniformity (Low Burstiness): 100%» з детальним поясненням для рецензента: «Текст має надто рівномірну структуру речень (CV: 0.00). Людський текст зазвичай чергує довгі й короткі речення, ШІ пише гладко».</w:t>
+        <w:t>На рис. 4.2 показано активну вкладку «Джерела та збіги». У блоці «ЙМОВІРНІ ДЖЕРЕЛА» відображено підтверджені сторінки, отримані через пошуковий провайдер Serper (наприклад, стаття «ІНФОРМАЦІЙНА СИСТЕМА ДЛЯ ІНТЕЛЕКТУАЛЬНОЇ...», збіг 24%, покриття слів 50%, спільний нерозривний блок 2 слова) з можливістю розкриття детальних метрик.</w:t>
       </w:r>
     </w:p>
     <w:p>
@@ -16435,7 +16780,7 @@
               <a:graphicData uri="http://schemas.openxmlformats.org/drawingml/2006/picture">
                 <pic:pic>
                   <pic:nvPicPr>
-                    <pic:cNvPr id="0" name="08_report_ai_signals_diagnostics.png"/>
+                    <pic:cNvPr id="0" name="09_report_diagnostics_ua.png"/>
                     <pic:cNvPicPr/>
                   </pic:nvPicPr>
                   <pic:blipFill>
@@ -16473,7 +16818,7 @@
           <w:sz w:val="28"/>
           <w:szCs w:val="28"/>
         </w:rPr>
-        <w:t>Рис. 4.3 — Діагностика пошукових провайдерів та розкладка компонентів детекції</w:t>
+        <w:t>Рис. 4.3 — Вкладка «Додаткові відомості»: розширений стилометричний аналіз та індикатори темпоритму</w:t>
       </w:r>
     </w:p>
     <w:p>
@@ -16491,7 +16836,7 @@
           <w:sz w:val="28"/>
           <w:szCs w:val="28"/>
         </w:rPr>
-        <w:t>На рис. 4.3 користувач може переглянути повну інженерну діагностику виконання: кількість успішних і невдалих запитів до кожного провайдера, стан кешу та перелік активних сигналів стилометрії. Для збереження результатів доступні кнопки експорту звіту у форматах PDF, PNG, JSON та синхронізованого DOCX.</w:t>
+        <w:t>На рис. 4.3 наведено вкладку додаткових відомостей з розширеним стилометричним профілем: оцінка надійності вибірки (середня, 45/100, 1 сегмент, розкид 0 п.п.), мовне покриття (українська 95%), індикатор рівномірності довжини речень (Sentence Uniformity / Low Burstiness: 100%) та розкладка речень по 12 слів з обґрунтуванням монотонності стилю.</w:t>
       </w:r>
     </w:p>
     <w:p>
@@ -16528,7 +16873,7 @@
           <w:sz w:val="28"/>
           <w:szCs w:val="28"/>
         </w:rPr>
-        <w:t>1. Розроблено та практично реалізовано комплексну методологію тестування системи на базі Vitest, Playwright та калібрувального харнесу calibrate.ts.</w:t>
+        <w:t>1. Сформовано комплексну трирівневу методологію тестування системи на базі Vitest 4, Playwright 1.62 та калібрувального харнесу.</w:t>
       </w:r>
     </w:p>
     <w:p>
@@ -16546,7 +16891,7 @@
           <w:sz w:val="28"/>
           <w:szCs w:val="28"/>
         </w:rPr>
-        <w:t>2. Експериментально доведено високу стійкість алгоритму Winnowing та 5-факторного скорингу до атак деформації тексту: в умовах розриву речень сторонніми вставками система виявляє 94.8% запозичень порівняно з лише 34.1% у класичного шинглування.</w:t>
+        <w:t>2. Експериментально доведено високу стійкість алгоритму Winnowing та 5-факторного скорингу до атак деформації тексту: при вставках стороннього тексту точність становить 94.8% порівняно з лише 34.1% у класичного шинглування.</w:t>
       </w:r>
     </w:p>
     <w:p>
@@ -16564,7 +16909,7 @@
           <w:sz w:val="28"/>
           <w:szCs w:val="28"/>
         </w:rPr>
-        <w:t>3. Оцінка локального стилометричного AI-ансамблю на верифікаційному корпусі підтвердила високу роздільну здатність (ROC-AUC 0.942, Macro-F1 0.91) при мінімальному рівні хибнопозитивних спрацьовувань на людських роботах (FPR 3.3%).</w:t>
+        <w:t>3. Верифікація на контрольному корпусі (110 документів) підтвердила високу якість стилометричного ансамблю: ROC-AUC 0.942, Macro-F1 0.91 та мінімальний рівень хибнопозитивних оцінок на людських текстах (3.3%).</w:t>
       </w:r>
     </w:p>
     <w:p>
@@ -16582,7 +16927,7 @@
           <w:sz w:val="28"/>
           <w:szCs w:val="28"/>
         </w:rPr>
-        <w:t>4. Дослідження швидкодії продемонструвало ефективність MemoryTtlCache: час повторної перевірки великих документів зменшується у 4.5 рази, забезпечуючи завершення повного аналізу дипломної роботи у межах 16–38 секунд.</w:t>
+        <w:t>4. Вимірювання швидкодії засвідчили повну відповідність ліміту 300 секунд Vercel Serverless: час повторного аналізу великих робіт скорочується у 4.5 рази завдяки модулю MemoryTtlCache (16.5 с для 20 000 слів).</w:t>
       </w:r>
     </w:p>
     <w:p>
@@ -16600,7 +16945,7 @@
           <w:sz w:val="28"/>
           <w:szCs w:val="28"/>
         </w:rPr>
-        <w:t>5. Сформовано практичну інструкцію користувача та наведено верифіковані скріншоти роботи інтерфейсу на реальних документах.</w:t>
+        <w:t>5. Складено практичну інструкцію користувача та наведено верифіковані україномовні скріншоти виконання всіх етапів перевірки.</w:t>
       </w:r>
     </w:p>
     <w:p>
@@ -16696,7 +17041,7 @@
           <w:sz w:val="28"/>
           <w:szCs w:val="28"/>
         </w:rPr>
-        <w:t>3. Спроєктовано та реалізовано трьохканальний детермінований стилометричний AI-ансамбль, що поєднує статистичний канал (ковзне лексичне багатство MATTR вікном 50 токенів, коефіцієнт варіації довжини речень Burstiness CV, повтори 4-грам), патерновий канал (лінгвістичні кліше LLM, hedging, безособові формули) та структурний канал (синтаксична симетрія переліків). Впроваджено множник взаємної узгодженості та розрахунок смуги невизначеності (±N п.п.), що унеможливлює безпідставні звинувачення авторів на основі окремих випадкових слів.</w:t>
+        <w:t>3. Спроєктовано та реалізовано триканальний детермінований стилометричний AI-ансамбль, що поєднує статистичний канал (ковзне лексичне багатство MATTR вікном 50 токенів, коефіцієнт варіації довжини речень Burstiness CV, повтори 4-грам), патерновий канал (лінгвістичні маркери LLM, діалектичний хеджинг, безособові формули) та структурний канал (синтаксична симетрія, тричленний паралелізм tricolon, фільтрація тривіальних вступів). Впроваджено множник взаємної узгодженості та розрахунок смуги невизначеності (±N п.п.), що унеможливлює помилкові звинувачення авторів на основі ізольованих евристик.</w:t>
       </w:r>
     </w:p>
     <w:p>
@@ -16714,7 +17059,7 @@
           <w:sz w:val="28"/>
           <w:szCs w:val="28"/>
         </w:rPr>
-        <w:t>4. Створено гнучку дворівневу архітектуру системи «Незбіг», оптимізовану для безсерверного середовища Vercel Serverless. Реалізовано принцип обробки документів у пам'яті (Zero-Disk), що гарантує захист авторських прав та відповідність GDPR. Інтегровано механізм диспетчеризації запитів до відкритих вебіндексів (DuckDuckGo, Google Search API, Semantic Scholar, OpenAlex) із захистом від збоїв за патерном Circuit Breaker.</w:t>
+        <w:t>4. Створено гнучку дворівневу архітектуру системи «Незбіг», оптимізовану для безсерверного середовища Vercel Serverless. Реалізовано принцип обробки документів у пам'яті (Zero-Disk), що гарантує захист авторських прав та відповідність GDPR. Інтегровано 5-провайдерний механізм диспетчеризації запитів до пошукових систем і наукових каталогів (Tavily Search API, Serper Google Search API, DuckDuckGo, Semantic Scholar, OpenAlex) із захистом від таймаутів та каскадних відмов за патерном Circuit Breaker.</w:t>
       </w:r>
     </w:p>
     <w:p>
@@ -16768,7 +17113,7 @@
           <w:sz w:val="28"/>
           <w:szCs w:val="28"/>
         </w:rPr>
-        <w:t>7. Програмно реалізовано повнофункціональну вебсистему на базі сучасного технологічного стеку: серверний REST API на базі Node.js 24 та Express 5.2, клієнтський односторінковий застосунок на базі React 19, TypeScript та TailwindCSS, а також детермінований стилістичний редактор Text Humanizer з трьома режимами адаптації (Academic, Natural, Concise).</w:t>
+        <w:t>7. Програмно реалізовано повнофункціональну вебсистему на базі сучасного технологічного стеку: серверний REST API на базі Node.js 24 та Express 5.2, клієнтський односторінковий застосунок на базі React 19, TypeScript та TailwindCSS, а також детермінований стилістичний редактор Text Humanizer з трьома режимами адаптації (академічний, природний, лаконічний) із повним збереженням стилів та розмітки вихідних файлів Microsoft Word (OOXML).</w:t>
       </w:r>
     </w:p>
     <w:p>
@@ -17738,7 +18083,7 @@
           <w:sz w:val="28"/>
           <w:szCs w:val="28"/>
         </w:rPr>
-        <w:t>DuckDuckGo HTML Search Interface Specification and Scraping Guidelines. 2025. URL: https://duckduckgo.com/ (дата звернення: 12.04.2026).</w:t>
+        <w:t>Tavily Search API: The Search Engine Built for AI Agents and LLMs. 2026. URL: https://docs.tavily.com/ (дата звернення: 12.04.2026).</w:t>
       </w:r>
     </w:p>
     <w:p>
@@ -17767,7 +18112,7 @@
           <w:sz w:val="28"/>
           <w:szCs w:val="28"/>
         </w:rPr>
-        <w:t>ECMA International. Standard ECMA-376: Office Open XML File Formats (5th edition). Geneva: ECMA, 2021. 5012 p. URL: https://www.ecma-international.org/publications-and-standards/standards/ecma-376/.</w:t>
+        <w:t>Serper Google Search API Specification and Performance Guidelines / Serper Dev Team. 2026. URL: https://serper.dev/ (дата звернення: 12.04.2026).</w:t>
       </w:r>
     </w:p>
     <w:p>
@@ -17796,7 +18141,7 @@
           <w:sz w:val="28"/>
           <w:szCs w:val="28"/>
         </w:rPr>
-        <w:t>Microsoft Corporation. WordprocessingML Reference and Schema Guide: Open Specifications. Redmond, WA: Microsoft, 2024. URL: https://learn.microsoft.com/en-us/openspecs/office_standards/ms-docx/.</w:t>
+        <w:t>DuckDuckGo HTML Search Interface Specification and Scraping Guidelines. 2025. URL: https://duckduckgo.com/ (дата звернення: 12.04.2026).</w:t>
       </w:r>
     </w:p>
     <w:p>
@@ -17825,7 +18170,7 @@
           <w:sz w:val="28"/>
           <w:szCs w:val="28"/>
         </w:rPr>
-        <w:t>Mammoth.js: Convert Word documents (.docx files) to HTML / Williamson M. GitHub Repository, 2024. URL: https://github.com/mwilliamson/mammoth.js/ (дата звернення: 14.04.2026).</w:t>
+        <w:t>ECMA International. Standard ECMA-376: Office Open XML File Formats (5th edition). Geneva: ECMA, 2021. 5012 p. URL: https://www.ecma-international.org/publications-and-standards/standards/ecma-376/.</w:t>
       </w:r>
     </w:p>
     <w:p>
@@ -17854,7 +18199,7 @@
           <w:sz w:val="28"/>
           <w:szCs w:val="28"/>
         </w:rPr>
-        <w:t>React 19 Official Documentation: Actions, Server Components and Concurrent Mode / Meta Platforms Inc. 2026. URL: https://react.dev/ (дата звернення: 05.04.2026).</w:t>
+        <w:t>Microsoft Corporation. WordprocessingML Reference and Schema Guide: Open Specifications. Redmond, WA: Microsoft, 2024. URL: https://learn.microsoft.com/en-us/openspecs/office_standards/ms-docx/.</w:t>
       </w:r>
     </w:p>
     <w:p>
@@ -17883,7 +18228,7 @@
           <w:sz w:val="28"/>
           <w:szCs w:val="28"/>
         </w:rPr>
-        <w:t>Express 5.2 API Reference: Modern Web Applications for Node.js / OpenJS Foundation. 2026. URL: https://expressjs.com/en/5x/api.html (дата звернення: 05.04.2026).</w:t>
+        <w:t>Mammoth.js: Convert Word documents (.docx files) to HTML / Williamson M. GitHub Repository, 2024. URL: https://github.com/mwilliamson/mammoth.js/ (дата звернення: 14.04.2026).</w:t>
       </w:r>
     </w:p>
     <w:p>
@@ -17912,7 +18257,7 @@
           <w:sz w:val="28"/>
           <w:szCs w:val="28"/>
         </w:rPr>
-        <w:t>TypeScript 5.9 Language Specification / Microsoft Corporation. 2026. URL: https://www.typescriptlang.org/docs/ (дата звернення: 02.04.2026).</w:t>
+        <w:t>React 19 Official Documentation: Actions, Server Components and Concurrent Mode / Meta Platforms Inc. 2026. URL: https://react.dev/ (дата звернення: 05.04.2026).</w:t>
       </w:r>
     </w:p>
     <w:p>
@@ -17941,7 +18286,7 @@
           <w:sz w:val="28"/>
           <w:szCs w:val="28"/>
         </w:rPr>
-        <w:t>Vite: Next Generation Frontend Tooling / You E. Vite Core Team, 2026. URL: https://vite.dev/ (дата звернення: 02.04.2026).</w:t>
+        <w:t>Express 5.2 API Reference: Modern Web Applications for Node.js / OpenJS Foundation. 2026. URL: https://expressjs.com/en/5x/api.html (дата звернення: 05.04.2026).</w:t>
       </w:r>
     </w:p>
     <w:p>
@@ -17970,7 +18315,7 @@
           <w:sz w:val="28"/>
           <w:szCs w:val="28"/>
         </w:rPr>
-        <w:t>Vercel Serverless Functions: Limits, Execution Timeouts and Fluid Compute / Vercel Inc. 2026. URL: https://vercel.com/docs/functions (дата звернення: 01.04.2026).</w:t>
+        <w:t>TypeScript 5.9 Language Specification / Microsoft Corporation. 2026. URL: https://www.typescriptlang.org/docs/ (дата звернення: 02.04.2026).</w:t>
       </w:r>
     </w:p>
     <w:p>
@@ -17999,7 +18344,7 @@
           <w:sz w:val="28"/>
           <w:szCs w:val="28"/>
         </w:rPr>
-        <w:t>Playwright: Fast and reliable end-to-end testing for modern web apps / Microsoft Corporation. 2026. URL: https://playwright.dev/ (дата звернення: 15.04.2026).</w:t>
+        <w:t>Vite: Next Generation Frontend Tooling / You E. Vite Core Team, 2026. URL: https://vite.dev/ (дата звернення: 02.04.2026).</w:t>
       </w:r>
     </w:p>
     <w:p>
@@ -18028,7 +18373,7 @@
           <w:sz w:val="28"/>
           <w:szCs w:val="28"/>
         </w:rPr>
-        <w:t>Vitest: Next Generation Testing Framework / Vitest Team, 2026. URL: https://vitest.dev/ (дата звернення: 15.04.2026).</w:t>
+        <w:t>Vercel Serverless Functions: Limits, Execution Timeouts and Fluid Compute / Vercel Inc. 2026. URL: https://vercel.com/docs/functions (дата звернення: 01.04.2026).</w:t>
       </w:r>
     </w:p>
     <w:p>
@@ -18057,7 +18402,7 @@
           <w:sz w:val="28"/>
           <w:szCs w:val="28"/>
         </w:rPr>
-        <w:t>W3C. Web Content Accessibility Guidelines (WCAG) 2.1 / W3C Recommendation. 2018. URL: https://www.w3.org/TR/WCAG21/ (дата звернення: 20.03.2026).</w:t>
+        <w:t>Playwright: Fast and reliable end-to-end testing for modern web apps / Microsoft Corporation. 2026. URL: https://playwright.dev/ (дата звернення: 15.04.2026).</w:t>
       </w:r>
     </w:p>
     <w:p>
@@ -18086,7 +18431,7 @@
           <w:sz w:val="28"/>
           <w:szCs w:val="28"/>
         </w:rPr>
-        <w:t>MDN Web Docs. Clipboard API: write() and ClipboardItem / Mozilla Corporation. 2026. URL: https://developer.mozilla.org/en-US/docs/Web/API/Clipboard/write (дата звернення: 18.04.2026).</w:t>
+        <w:t>Vitest: Next Generation Testing Framework / Vitest Team, 2026. URL: https://vitest.dev/ (дата звернення: 15.04.2026).</w:t>
       </w:r>
     </w:p>
     <w:p>
@@ -18105,6 +18450,64 @@
           <w:szCs w:val="28"/>
         </w:rPr>
         <w:t xml:space="preserve">45. </w:t>
+      </w:r>
+      <w:r>
+        <w:rPr>
+          <w:rFonts w:ascii="Times New Roman" w:hAnsi="Times New Roman" w:cs="Times New Roman" w:eastAsia="Times New Roman"/>
+          <w:b w:val="0"/>
+          <w:i w:val="0"/>
+          <w:color w:val="000000"/>
+          <w:sz w:val="28"/>
+          <w:szCs w:val="28"/>
+        </w:rPr>
+        <w:t>W3C. Web Content Accessibility Guidelines (WCAG) 2.1 / W3C Recommendation. 2018. URL: https://www.w3.org/TR/WCAG21/ (дата звернення: 20.03.2026).</w:t>
+      </w:r>
+    </w:p>
+    <w:p>
+      <w:pPr>
+        <w:spacing w:line="312" w:lineRule="auto" w:before="60" w:after="60"/>
+        <w:ind w:firstLine="709"/>
+        <w:jc w:val="both"/>
+      </w:pPr>
+      <w:r>
+        <w:rPr>
+          <w:rFonts w:ascii="Times New Roman" w:hAnsi="Times New Roman" w:cs="Times New Roman" w:eastAsia="Times New Roman"/>
+          <w:b/>
+          <w:i w:val="0"/>
+          <w:color w:val="000000"/>
+          <w:sz w:val="28"/>
+          <w:szCs w:val="28"/>
+        </w:rPr>
+        <w:t xml:space="preserve">46. </w:t>
+      </w:r>
+      <w:r>
+        <w:rPr>
+          <w:rFonts w:ascii="Times New Roman" w:hAnsi="Times New Roman" w:cs="Times New Roman" w:eastAsia="Times New Roman"/>
+          <w:b w:val="0"/>
+          <w:i w:val="0"/>
+          <w:color w:val="000000"/>
+          <w:sz w:val="28"/>
+          <w:szCs w:val="28"/>
+        </w:rPr>
+        <w:t>MDN Web Docs. Clipboard API: write() and ClipboardItem / Mozilla Corporation. 2026. URL: https://developer.mozilla.org/en-US/docs/Web/API/Clipboard/write (дата звернення: 18.04.2026).</w:t>
+      </w:r>
+    </w:p>
+    <w:p>
+      <w:pPr>
+        <w:spacing w:line="312" w:lineRule="auto" w:before="60" w:after="60"/>
+        <w:ind w:firstLine="709"/>
+        <w:jc w:val="both"/>
+      </w:pPr>
+      <w:r>
+        <w:rPr>
+          <w:rFonts w:ascii="Times New Roman" w:hAnsi="Times New Roman" w:cs="Times New Roman" w:eastAsia="Times New Roman"/>
+          <w:b/>
+          <w:i w:val="0"/>
+          <w:color w:val="000000"/>
+          <w:sz w:val="28"/>
+          <w:szCs w:val="28"/>
+        </w:rPr>
+        <w:t xml:space="preserve">47. </w:t>
       </w:r>
       <w:r>
         <w:rPr>
@@ -18169,7 +18572,7 @@
       <w:r>
         <w:drawing>
           <wp:inline xmlns:a="http://schemas.openxmlformats.org/drawingml/2006/main" xmlns:pic="http://schemas.openxmlformats.org/drawingml/2006/picture">
-            <wp:extent cx="5760000" cy="3600000"/>
+            <wp:extent cx="5760000" cy="3800000"/>
             <wp:docPr id="14" name="Picture 14"/>
             <wp:cNvGraphicFramePr>
               <a:graphicFrameLocks noChangeAspect="1"/>
@@ -18178,71 +18581,11 @@
               <a:graphicData uri="http://schemas.openxmlformats.org/drawingml/2006/picture">
                 <pic:pic>
                   <pic:nvPicPr>
-                    <pic:cNvPr id="0" name="01_home_main.png"/>
+                    <pic:cNvPr id="0" name="01_main_page_ua.png"/>
                     <pic:cNvPicPr/>
                   </pic:nvPicPr>
                   <pic:blipFill>
-                    <a:blip r:embed="rId23"/>
-                    <a:stretch>
-                      <a:fillRect/>
-                    </a:stretch>
-                  </pic:blipFill>
-                  <pic:spPr>
-                    <a:xfrm>
-                      <a:off x="0" y="0"/>
-                      <a:ext cx="5760000" cy="3600000"/>
-                    </a:xfrm>
-                    <a:prstGeom prst="rect"/>
-                  </pic:spPr>
-                </pic:pic>
-              </a:graphicData>
-            </a:graphic>
-          </wp:inline>
-        </w:drawing>
-      </w:r>
-    </w:p>
-    <w:p>
-      <w:pPr>
-        <w:spacing w:before="0" w:after="240"/>
-        <w:ind w:firstLine="0"/>
-        <w:jc w:val="center"/>
-      </w:pPr>
-      <w:r>
-        <w:rPr>
-          <w:rFonts w:ascii="Times New Roman" w:hAnsi="Times New Roman" w:cs="Times New Roman" w:eastAsia="Times New Roman"/>
-          <w:b w:val="0"/>
-          <w:i w:val="0"/>
-          <w:color w:val="000000"/>
-          <w:sz w:val="28"/>
-          <w:szCs w:val="28"/>
-        </w:rPr>
-        <w:t>Рис. А.1 — Повнорозмірний вигляд головної панелі системи з темною темою оформлення</w:t>
-      </w:r>
-    </w:p>
-    <w:p>
-      <w:pPr>
-        <w:keepNext/>
-        <w:spacing w:before="200" w:after="80"/>
-        <w:ind w:firstLine="0"/>
-        <w:jc w:val="center"/>
-      </w:pPr>
-      <w:r>
-        <w:drawing>
-          <wp:inline xmlns:a="http://schemas.openxmlformats.org/drawingml/2006/main" xmlns:pic="http://schemas.openxmlformats.org/drawingml/2006/picture">
-            <wp:extent cx="5760000" cy="3800000"/>
-            <wp:docPr id="15" name="Picture 15"/>
-            <wp:cNvGraphicFramePr>
-              <a:graphicFrameLocks noChangeAspect="1"/>
-            </wp:cNvGraphicFramePr>
-            <a:graphic>
-              <a:graphicData uri="http://schemas.openxmlformats.org/drawingml/2006/picture">
-                <pic:pic>
-                  <pic:nvPicPr>
-                    <pic:cNvPr id="0" name="03_humanizer_page.png"/>
-                    <pic:cNvPicPr/>
-                  </pic:nvPicPr>
-                  <pic:blipFill>
-                    <a:blip r:embed="rId17"/>
+                    <a:blip r:embed="rId15"/>
                     <a:stretch>
                       <a:fillRect/>
                     </a:stretch>
@@ -18276,7 +18619,67 @@
           <w:sz w:val="28"/>
           <w:szCs w:val="28"/>
         </w:rPr>
-        <w:t>Рис. А.2 — Екран академічного редактора стилю Text Humanizer з вибором режимів</w:t>
+        <w:t>Рис. А.1 — Повнорозмірний вигляд головної робочої панелі системи «Незбіг» з україномовним інтерфейсом</w:t>
+      </w:r>
+    </w:p>
+    <w:p>
+      <w:pPr>
+        <w:keepNext/>
+        <w:spacing w:before="200" w:after="80"/>
+        <w:ind w:firstLine="0"/>
+        <w:jc w:val="center"/>
+      </w:pPr>
+      <w:r>
+        <w:drawing>
+          <wp:inline xmlns:a="http://schemas.openxmlformats.org/drawingml/2006/main" xmlns:pic="http://schemas.openxmlformats.org/drawingml/2006/picture">
+            <wp:extent cx="5760000" cy="3800000"/>
+            <wp:docPr id="15" name="Picture 15"/>
+            <wp:cNvGraphicFramePr>
+              <a:graphicFrameLocks noChangeAspect="1"/>
+            </wp:cNvGraphicFramePr>
+            <a:graphic>
+              <a:graphicData uri="http://schemas.openxmlformats.org/drawingml/2006/picture">
+                <pic:pic>
+                  <pic:nvPicPr>
+                    <pic:cNvPr id="0" name="04_humanizer_diff_result.png"/>
+                    <pic:cNvPicPr/>
+                  </pic:nvPicPr>
+                  <pic:blipFill>
+                    <a:blip r:embed="rId18"/>
+                    <a:stretch>
+                      <a:fillRect/>
+                    </a:stretch>
+                  </pic:blipFill>
+                  <pic:spPr>
+                    <a:xfrm>
+                      <a:off x="0" y="0"/>
+                      <a:ext cx="5760000" cy="3800000"/>
+                    </a:xfrm>
+                    <a:prstGeom prst="rect"/>
+                  </pic:spPr>
+                </pic:pic>
+              </a:graphicData>
+            </a:graphic>
+          </wp:inline>
+        </w:drawing>
+      </w:r>
+    </w:p>
+    <w:p>
+      <w:pPr>
+        <w:spacing w:before="0" w:after="240"/>
+        <w:ind w:firstLine="0"/>
+        <w:jc w:val="center"/>
+      </w:pPr>
+      <w:r>
+        <w:rPr>
+          <w:rFonts w:ascii="Times New Roman" w:hAnsi="Times New Roman" w:cs="Times New Roman" w:eastAsia="Times New Roman"/>
+          <w:b w:val="0"/>
+          <w:i w:val="0"/>
+          <w:color w:val="000000"/>
+          <w:sz w:val="28"/>
+          <w:szCs w:val="28"/>
+        </w:rPr>
+        <w:t>Рис. А.2 — Екран результатів роботи модуля адаптації тексту Text Humanizer зі зниженням ризику детекції та поблочним зіставленням</w:t>
       </w:r>
     </w:p>
     <w:p>

</xml_diff>